<commit_message>
oprava a generovanie a export súboro
Zmeny
Uprava procedúry na generovanie faktúr – doplnenie na 400.
Úprava procedúry na geneovanie výpisov doplnenie čiastočných úhrad 2 splátky z 5 tich.  Pridanie tlačidla na generovanie csv súborov s úhradami do hlavného formulára, oprava logiky dotazu na párovanie splátkových plaltieb. Doplnenie faktúr, znovuvygenerovanie výpisov z banky, znovuexportovanie vybraných tabuliek a dotazov z databázy, uprava dokumentácie.
</commit_message>
<xml_diff>
--- a/user story 3 - dokumentácia k databáze.docx
+++ b/user story 3 - dokumentácia k databáze.docx
@@ -56,7 +56,7 @@
           <w:rFonts w:ascii="Google Sans" w:eastAsia="Google Sans" w:hAnsi="Google Sans" w:cs="Google Sans"/>
           <w:color w:val="1F1F1F"/>
         </w:rPr>
-        <w:t>Na začiatku nášho projektu sme mali navrhnutý naozaj obrovský a komplexný dátový model (od našej kolegyne Lucky), ktorý vyzeral ako pre celú veľkú firmu – obsahoval napríklad sklady, dodávateľov, či presné položky faktúr. Aj keď bol ten model super nakreslený, po zvážení v tíme sme si uvedomili, že pre naše potreby v Access databáze by bol skôr na škodu.</w:t>
+        <w:t>Na začiatku nášho projektu sme mali navrhnutý komplexný dátový model (od našej kolegyne Lucky), ktorý vyzeral ako pre celú veľkú firmu – obsahoval napríklad sklady, dodávateľov, či presné položky faktúr. Aj keď bol ten model super nakreslený, po zvážení v tíme sme si uvedomili, že pre naše potreby v Access databáze by bol skôr na škodu.</w:t>
       </w:r>
     </w:p>
     <w:p>
@@ -79,7 +79,7 @@
           <w:rFonts w:ascii="Google Sans" w:eastAsia="Google Sans" w:hAnsi="Google Sans" w:cs="Google Sans"/>
           <w:color w:val="1F1F1F"/>
         </w:rPr>
-        <w:t>Rozhodli sme sa ho preto výrazne zjednodušiť a vytvoriť len takzvaný funkčný prototyp (MVP – Minimum Viable Product). Najväčšou zmenou bolo to, ako sme sa postavili k našej hlavnej inovácii – umelej inteligencii a párovaniu.</w:t>
+        <w:t xml:space="preserve">Rozhodli sme sa ho preto výrazne zjednodušiť a vytvoriť len takzvaný funkčný prototyp. </w:t>
       </w:r>
     </w:p>
     <w:p>
@@ -142,8 +142,25 @@
           <w:rFonts w:ascii="Google Sans" w:eastAsia="Google Sans" w:hAnsi="Google Sans" w:cs="Google Sans"/>
           <w:color w:val="1F1F1F"/>
         </w:rPr>
-        <w:t xml:space="preserve">Náš startup e-smartbalance nemá byť hneď nový obrovský účtovný systém ako SAP. Našou hlavnou inováciou, na ktorej staviame, je proces </w:t>
-      </w:r>
+        <w:t>Náš startup e-</w:t>
+      </w:r>
+      <w:proofErr w:type="spellStart"/>
+      <w:r>
+        <w:rPr>
+          <w:rFonts w:ascii="Google Sans" w:eastAsia="Google Sans" w:hAnsi="Google Sans" w:cs="Google Sans"/>
+          <w:color w:val="1F1F1F"/>
+        </w:rPr>
+        <w:t>smartbalance</w:t>
+      </w:r>
+      <w:proofErr w:type="spellEnd"/>
+      <w:r>
+        <w:rPr>
+          <w:rFonts w:ascii="Google Sans" w:eastAsia="Google Sans" w:hAnsi="Google Sans" w:cs="Google Sans"/>
+          <w:color w:val="1F1F1F"/>
+        </w:rPr>
+        <w:t xml:space="preserve"> nemá byť hneď nový obrovský účtovný systém. Našou hlavnou inováciou, na ktorej staviame, je proces </w:t>
+      </w:r>
+      <w:proofErr w:type="spellStart"/>
       <w:r>
         <w:rPr>
           <w:rFonts w:ascii="Google Sans" w:eastAsia="Google Sans" w:hAnsi="Google Sans" w:cs="Google Sans"/>
@@ -153,6 +170,7 @@
         </w:rPr>
         <w:t>Smart-Pairing</w:t>
       </w:r>
+      <w:proofErr w:type="spellEnd"/>
       <w:r>
         <w:rPr>
           <w:rFonts w:ascii="Google Sans" w:eastAsia="Google Sans" w:hAnsi="Google Sans" w:cs="Google Sans"/>
@@ -256,6 +274,7 @@
         </w:rPr>
         <w:t xml:space="preserve">Toto bol pre nás asi najdôležitejší bod. Keď sme programovali ten automatický párovací algoritmus, samozrejme to nefungovalo hneď na prvýkrát. Museli sme postupovať systémom: </w:t>
       </w:r>
+      <w:proofErr w:type="spellStart"/>
       <w:r>
         <w:rPr>
           <w:rFonts w:ascii="Google Sans" w:eastAsia="Google Sans" w:hAnsi="Google Sans" w:cs="Google Sans"/>
@@ -263,15 +282,32 @@
           <w:iCs/>
           <w:color w:val="1F1F1F"/>
         </w:rPr>
+        <w:t>naimportovať</w:t>
+      </w:r>
+      <w:proofErr w:type="spellEnd"/>
+      <w:r>
+        <w:rPr>
+          <w:rFonts w:ascii="Google Sans" w:eastAsia="Google Sans" w:hAnsi="Google Sans" w:cs="Google Sans"/>
+          <w:i/>
+          <w:iCs/>
+          <w:color w:val="1F1F1F"/>
+        </w:rPr>
+        <w:t xml:space="preserve"> CSV -&gt; spustiť párovanie -&gt; zistiť, kde je chyba -&gt; všetko vymazať -&gt; opraviť kód a skúsiť to znova</w:t>
+      </w:r>
+      <w:r>
+        <w:rPr>
+          <w:rFonts w:ascii="Google Sans" w:eastAsia="Google Sans" w:hAnsi="Google Sans" w:cs="Google Sans"/>
+          <w:color w:val="1F1F1F"/>
+        </w:rPr>
+        <w:t xml:space="preserve">. V obrovskej prepojenej databáze by nám Access nedovolil len tak ľahko </w:t>
+      </w:r>
+      <w:r>
+        <w:rPr>
+          <w:rFonts w:ascii="Google Sans" w:eastAsia="Google Sans" w:hAnsi="Google Sans" w:cs="Google Sans"/>
+          <w:color w:val="1F1F1F"/>
+        </w:rPr>
         <w:lastRenderedPageBreak/>
-        <w:t>naimportovať CSV -&gt; spustiť párovanie -&gt; zistiť, kde je chyba -&gt; všetko vymazať -&gt; opraviť kód a skúsiť to znova</w:t>
-      </w:r>
-      <w:r>
-        <w:rPr>
-          <w:rFonts w:ascii="Google Sans" w:eastAsia="Google Sans" w:hAnsi="Google Sans" w:cs="Google Sans"/>
-          <w:color w:val="1F1F1F"/>
-        </w:rPr>
-        <w:t>. V obrovskej prepojenej databáze by nám Access nedovolil len tak ľahko mazať dáta. Vďaka nášmu malému, izolovanému modelu vieme kedykoľvek za pár sekúnd zmazať všetky platby a otestovať celý proces naostro znova.</w:t>
+        <w:t>mazať dáta. Vďaka nášmu malému, izolovanému modelu vieme kedykoľvek za pár sekúnd zmazať všetky platby a otestovať celý proces naostro znova.</w:t>
       </w:r>
     </w:p>
     <w:p>
@@ -311,7 +347,71 @@
           <w:rFonts w:ascii="Google Sans" w:eastAsia="Google Sans" w:hAnsi="Google Sans" w:cs="Google Sans"/>
           <w:color w:val="1F1F1F"/>
         </w:rPr>
-        <w:t>Pôvodne sme chceli priamo v databáze programovať komplexnú umelú inteligenciu (Active Learning / Fuzzy logiku), ktorá by sa sama učila z preklepov vo variabilných symboloch. Po konzultácii s vyučujúcou sme však dostali usmernenie, že programovanie autonómnej AI a zložitej fuzzy logiky presahuje rámec tohto predmetu a zbytočne by sme si to komplikovali.</w:t>
+        <w:t>Pôvodne sme chceli priamo v databáze programovať komplexnú umelú inteligenciu (</w:t>
+      </w:r>
+      <w:proofErr w:type="spellStart"/>
+      <w:r>
+        <w:rPr>
+          <w:rFonts w:ascii="Google Sans" w:eastAsia="Google Sans" w:hAnsi="Google Sans" w:cs="Google Sans"/>
+          <w:color w:val="1F1F1F"/>
+        </w:rPr>
+        <w:t>Active</w:t>
+      </w:r>
+      <w:proofErr w:type="spellEnd"/>
+      <w:r>
+        <w:rPr>
+          <w:rFonts w:ascii="Google Sans" w:eastAsia="Google Sans" w:hAnsi="Google Sans" w:cs="Google Sans"/>
+          <w:color w:val="1F1F1F"/>
+        </w:rPr>
+        <w:t xml:space="preserve"> </w:t>
+      </w:r>
+      <w:proofErr w:type="spellStart"/>
+      <w:r>
+        <w:rPr>
+          <w:rFonts w:ascii="Google Sans" w:eastAsia="Google Sans" w:hAnsi="Google Sans" w:cs="Google Sans"/>
+          <w:color w:val="1F1F1F"/>
+        </w:rPr>
+        <w:t>Learning</w:t>
+      </w:r>
+      <w:proofErr w:type="spellEnd"/>
+      <w:r>
+        <w:rPr>
+          <w:rFonts w:ascii="Google Sans" w:eastAsia="Google Sans" w:hAnsi="Google Sans" w:cs="Google Sans"/>
+          <w:color w:val="1F1F1F"/>
+        </w:rPr>
+        <w:t xml:space="preserve"> / </w:t>
+      </w:r>
+      <w:proofErr w:type="spellStart"/>
+      <w:r>
+        <w:rPr>
+          <w:rFonts w:ascii="Google Sans" w:eastAsia="Google Sans" w:hAnsi="Google Sans" w:cs="Google Sans"/>
+          <w:color w:val="1F1F1F"/>
+        </w:rPr>
+        <w:t>Fuzzy</w:t>
+      </w:r>
+      <w:proofErr w:type="spellEnd"/>
+      <w:r>
+        <w:rPr>
+          <w:rFonts w:ascii="Google Sans" w:eastAsia="Google Sans" w:hAnsi="Google Sans" w:cs="Google Sans"/>
+          <w:color w:val="1F1F1F"/>
+        </w:rPr>
+        <w:t xml:space="preserve"> logiku), ktorá by sa sama učila z preklepov vo variabilných symboloch. Po konzultácii s vyučujúcou sme však dostali usmernenie, že programovanie autonómnej AI a zložitej </w:t>
+      </w:r>
+      <w:proofErr w:type="spellStart"/>
+      <w:r>
+        <w:rPr>
+          <w:rFonts w:ascii="Google Sans" w:eastAsia="Google Sans" w:hAnsi="Google Sans" w:cs="Google Sans"/>
+          <w:color w:val="1F1F1F"/>
+        </w:rPr>
+        <w:t>fuzzy</w:t>
+      </w:r>
+      <w:proofErr w:type="spellEnd"/>
+      <w:r>
+        <w:rPr>
+          <w:rFonts w:ascii="Google Sans" w:eastAsia="Google Sans" w:hAnsi="Google Sans" w:cs="Google Sans"/>
+          <w:color w:val="1F1F1F"/>
+        </w:rPr>
+        <w:t xml:space="preserve"> logiky presahuje rámec tohto predmetu a zbytočne by sme si to komplikovali.</w:t>
       </w:r>
     </w:p>
     <w:p>
@@ -334,7 +434,23 @@
           <w:rFonts w:ascii="Google Sans" w:eastAsia="Google Sans" w:hAnsi="Google Sans" w:cs="Google Sans"/>
           <w:color w:val="1F1F1F"/>
         </w:rPr>
-        <w:t xml:space="preserve">Preto sme "buzzword" umelú inteligenciu v našom MS Access prototype nahradili oveľa elegantnejším a technicky bezpečnejším riešením: </w:t>
+        <w:t>Preto sme "</w:t>
+      </w:r>
+      <w:proofErr w:type="spellStart"/>
+      <w:r>
+        <w:rPr>
+          <w:rFonts w:ascii="Google Sans" w:eastAsia="Google Sans" w:hAnsi="Google Sans" w:cs="Google Sans"/>
+          <w:color w:val="1F1F1F"/>
+        </w:rPr>
+        <w:t>buzzword</w:t>
+      </w:r>
+      <w:proofErr w:type="spellEnd"/>
+      <w:r>
+        <w:rPr>
+          <w:rFonts w:ascii="Google Sans" w:eastAsia="Google Sans" w:hAnsi="Google Sans" w:cs="Google Sans"/>
+          <w:color w:val="1F1F1F"/>
+        </w:rPr>
+        <w:t xml:space="preserve">" umelú inteligenciu v našom MS Access prototype nahradili oveľa elegantnejším a technicky bezpečnejším riešením: </w:t>
       </w:r>
       <w:r>
         <w:rPr>
@@ -414,7 +530,23 @@
           <w:rFonts w:ascii="Google Sans" w:eastAsia="Google Sans" w:hAnsi="Google Sans" w:cs="Google Sans"/>
           <w:color w:val="1F1F1F"/>
         </w:rPr>
-        <w:t xml:space="preserve"> Do SQL logiky sme pridali podmienku suma &lt;= Suma_Faktury. Systém teda automaticky spáruje nielen presné úhrady, ale aj čiastočné splátky. Ak však klient pošle viac peňazí (preplatok), systém to zámerne preskočí, aby na to upozornil účtovníka.</w:t>
+        <w:t xml:space="preserve"> Do SQL logiky sme pridali podmienku suma &lt;= </w:t>
+      </w:r>
+      <w:proofErr w:type="spellStart"/>
+      <w:r>
+        <w:rPr>
+          <w:rFonts w:ascii="Google Sans" w:eastAsia="Google Sans" w:hAnsi="Google Sans" w:cs="Google Sans"/>
+          <w:color w:val="1F1F1F"/>
+        </w:rPr>
+        <w:t>Suma_Faktury</w:t>
+      </w:r>
+      <w:proofErr w:type="spellEnd"/>
+      <w:r>
+        <w:rPr>
+          <w:rFonts w:ascii="Google Sans" w:eastAsia="Google Sans" w:hAnsi="Google Sans" w:cs="Google Sans"/>
+          <w:color w:val="1F1F1F"/>
+        </w:rPr>
+        <w:t xml:space="preserve">. Systém teda automaticky spáruje nielen presné úhrady, ale aj čiastočné splátky. </w:t>
       </w:r>
     </w:p>
     <w:p>
@@ -439,14 +571,186 @@
           <w:bCs/>
           <w:color w:val="1F1F1F"/>
         </w:rPr>
-        <w:t>Ochrana pred duplicitami:</w:t>
-      </w:r>
-      <w:r>
-        <w:rPr>
-          <w:rFonts w:ascii="Google Sans" w:eastAsia="Google Sans" w:hAnsi="Google Sans" w:cs="Google Sans"/>
-          <w:color w:val="1F1F1F"/>
-        </w:rPr>
-        <w:t xml:space="preserve"> Pomocou SQL poddotazu (HAVING Count(*) = 1) sa systém chráni pred situáciou, kedy zákazník omylom uhradí faktúru dvakrát pod rovnakým variabilným symbolom v ten istý deň.</w:t>
+        <w:t xml:space="preserve">Pre automatické párovanie sme použili dva dotazy. </w:t>
+      </w:r>
+      <w:r>
+        <w:rPr>
+          <w:rFonts w:ascii="Google Sans" w:eastAsia="Google Sans" w:hAnsi="Google Sans" w:cs="Google Sans"/>
+          <w:color w:val="1F1F1F"/>
+        </w:rPr>
+        <w:t xml:space="preserve">Prvý dotaz </w:t>
+      </w:r>
+      <w:r>
+        <w:rPr>
+          <w:rFonts w:ascii="Google Sans" w:eastAsia="Google Sans" w:hAnsi="Google Sans" w:cs="Google Sans"/>
+          <w:color w:val="1F1F1F"/>
+        </w:rPr>
+        <w:t xml:space="preserve">páruje platby s faktúrou ak v platbách čo páruje nie sú variabilné symboly duplicitné a sú rovnaké ako na nejakej nezaplatenej faktúre a suma platby je menšia alebo rovnaká ako zostatok nesplatenej sumy na faktúre. </w:t>
+      </w:r>
+      <w:r>
+        <w:rPr>
+          <w:rFonts w:ascii="Google Sans" w:eastAsia="Google Sans" w:hAnsi="Google Sans" w:cs="Google Sans"/>
+          <w:color w:val="1F1F1F"/>
+        </w:rPr>
+        <w:t xml:space="preserve">Je to </w:t>
+      </w:r>
+      <w:r>
+        <w:rPr>
+          <w:rFonts w:ascii="Google Sans" w:eastAsia="Google Sans" w:hAnsi="Google Sans" w:cs="Google Sans"/>
+          <w:color w:val="1F1F1F"/>
+        </w:rPr>
+        <w:t xml:space="preserve">pomocou SQL </w:t>
+      </w:r>
+      <w:proofErr w:type="spellStart"/>
+      <w:r>
+        <w:rPr>
+          <w:rFonts w:ascii="Google Sans" w:eastAsia="Google Sans" w:hAnsi="Google Sans" w:cs="Google Sans"/>
+          <w:color w:val="1F1F1F"/>
+        </w:rPr>
+        <w:t>poddotazu</w:t>
+      </w:r>
+      <w:proofErr w:type="spellEnd"/>
+      <w:r>
+        <w:rPr>
+          <w:rFonts w:ascii="Google Sans" w:eastAsia="Google Sans" w:hAnsi="Google Sans" w:cs="Google Sans"/>
+          <w:color w:val="1F1F1F"/>
+        </w:rPr>
+        <w:t xml:space="preserve"> (HAVING </w:t>
+      </w:r>
+      <w:proofErr w:type="spellStart"/>
+      <w:r>
+        <w:rPr>
+          <w:rFonts w:ascii="Google Sans" w:eastAsia="Google Sans" w:hAnsi="Google Sans" w:cs="Google Sans"/>
+          <w:color w:val="1F1F1F"/>
+        </w:rPr>
+        <w:t>Count</w:t>
+      </w:r>
+      <w:proofErr w:type="spellEnd"/>
+      <w:r>
+        <w:rPr>
+          <w:rFonts w:ascii="Google Sans" w:eastAsia="Google Sans" w:hAnsi="Google Sans" w:cs="Google Sans"/>
+          <w:color w:val="1F1F1F"/>
+        </w:rPr>
+        <w:t>(*) = 1)</w:t>
+      </w:r>
+      <w:r>
+        <w:rPr>
+          <w:rFonts w:ascii="Google Sans" w:eastAsia="Google Sans" w:hAnsi="Google Sans" w:cs="Google Sans"/>
+          <w:color w:val="1F1F1F"/>
+        </w:rPr>
+        <w:t>.</w:t>
+      </w:r>
+      <w:r>
+        <w:rPr>
+          <w:rFonts w:ascii="Google Sans" w:eastAsia="Google Sans" w:hAnsi="Google Sans" w:cs="Google Sans"/>
+          <w:color w:val="1F1F1F"/>
+        </w:rPr>
+        <w:t xml:space="preserve"> </w:t>
+      </w:r>
+      <w:r>
+        <w:rPr>
+          <w:rFonts w:ascii="Google Sans" w:eastAsia="Google Sans" w:hAnsi="Google Sans" w:cs="Google Sans"/>
+          <w:color w:val="1F1F1F"/>
+        </w:rPr>
+        <w:t xml:space="preserve"> </w:t>
+      </w:r>
+      <w:r>
+        <w:rPr>
+          <w:rFonts w:ascii="Google Sans" w:eastAsia="Google Sans" w:hAnsi="Google Sans" w:cs="Google Sans"/>
+          <w:color w:val="1F1F1F"/>
+        </w:rPr>
+        <w:t>D</w:t>
+      </w:r>
+      <w:r>
+        <w:rPr>
+          <w:rFonts w:ascii="Google Sans" w:eastAsia="Google Sans" w:hAnsi="Google Sans" w:cs="Google Sans"/>
+          <w:color w:val="1F1F1F"/>
+        </w:rPr>
+        <w:t xml:space="preserve">ruhý dotaz </w:t>
+      </w:r>
+      <w:r>
+        <w:rPr>
+          <w:rFonts w:ascii="Google Sans" w:eastAsia="Google Sans" w:hAnsi="Google Sans" w:cs="Google Sans"/>
+          <w:color w:val="1F1F1F"/>
+        </w:rPr>
+        <w:t>umožňuje duplicity variabilných symbolo</w:t>
+      </w:r>
+      <w:r>
+        <w:rPr>
+          <w:rFonts w:ascii="Google Sans" w:eastAsia="Google Sans" w:hAnsi="Google Sans" w:cs="Google Sans"/>
+          <w:color w:val="1F1F1F"/>
+        </w:rPr>
+        <w:t>v</w:t>
+      </w:r>
+      <w:r>
+        <w:rPr>
+          <w:rFonts w:ascii="Google Sans" w:eastAsia="Google Sans" w:hAnsi="Google Sans" w:cs="Google Sans"/>
+          <w:color w:val="1F1F1F"/>
+        </w:rPr>
+        <w:t xml:space="preserve"> ( </w:t>
+      </w:r>
+      <w:r>
+        <w:rPr>
+          <w:rFonts w:ascii="Google Sans" w:eastAsia="Google Sans" w:hAnsi="Google Sans" w:cs="Google Sans"/>
+          <w:color w:val="1F1F1F"/>
+        </w:rPr>
+        <w:t>pre</w:t>
+      </w:r>
+      <w:r>
+        <w:rPr>
+          <w:rFonts w:ascii="Google Sans" w:eastAsia="Google Sans" w:hAnsi="Google Sans" w:cs="Google Sans"/>
+          <w:color w:val="1F1F1F"/>
+        </w:rPr>
+        <w:t xml:space="preserve"> párovanie</w:t>
+      </w:r>
+      <w:r>
+        <w:rPr>
+          <w:rFonts w:ascii="Google Sans" w:eastAsia="Google Sans" w:hAnsi="Google Sans" w:cs="Google Sans"/>
+          <w:color w:val="1F1F1F"/>
+        </w:rPr>
+        <w:t xml:space="preserve"> splá</w:t>
+      </w:r>
+      <w:r>
+        <w:rPr>
+          <w:rFonts w:ascii="Google Sans" w:eastAsia="Google Sans" w:hAnsi="Google Sans" w:cs="Google Sans"/>
+          <w:color w:val="1F1F1F"/>
+        </w:rPr>
+        <w:t xml:space="preserve">tok). Spáruje ich </w:t>
+      </w:r>
+      <w:r>
+        <w:rPr>
+          <w:rFonts w:ascii="Google Sans" w:eastAsia="Google Sans" w:hAnsi="Google Sans" w:cs="Google Sans"/>
+          <w:color w:val="1F1F1F"/>
+        </w:rPr>
+        <w:t>ak splatia cel</w:t>
+      </w:r>
+      <w:r>
+        <w:rPr>
+          <w:rFonts w:ascii="Google Sans" w:eastAsia="Google Sans" w:hAnsi="Google Sans" w:cs="Google Sans"/>
+          <w:color w:val="1F1F1F"/>
+        </w:rPr>
+        <w:t xml:space="preserve">ý zvyšok na </w:t>
+      </w:r>
+      <w:r>
+        <w:rPr>
+          <w:rFonts w:ascii="Google Sans" w:eastAsia="Google Sans" w:hAnsi="Google Sans" w:cs="Google Sans"/>
+          <w:color w:val="1F1F1F"/>
+        </w:rPr>
+        <w:t>faktúr</w:t>
+      </w:r>
+      <w:r>
+        <w:rPr>
+          <w:rFonts w:ascii="Google Sans" w:eastAsia="Google Sans" w:hAnsi="Google Sans" w:cs="Google Sans"/>
+          <w:color w:val="1F1F1F"/>
+        </w:rPr>
+        <w:t>e</w:t>
+      </w:r>
+      <w:r>
+        <w:rPr>
+          <w:rFonts w:ascii="Google Sans" w:eastAsia="Google Sans" w:hAnsi="Google Sans" w:cs="Google Sans"/>
+          <w:color w:val="1F1F1F"/>
+        </w:rPr>
+        <w:t>.</w:t>
       </w:r>
     </w:p>
     <w:p>
@@ -471,7 +775,27 @@
           <w:bCs/>
           <w:color w:val="1F1F1F"/>
         </w:rPr>
-        <w:t>Manuálny fallback:</w:t>
+        <w:t xml:space="preserve">Manuálny </w:t>
+      </w:r>
+      <w:proofErr w:type="spellStart"/>
+      <w:r>
+        <w:rPr>
+          <w:rFonts w:ascii="Google Sans" w:eastAsia="Google Sans" w:hAnsi="Google Sans" w:cs="Google Sans"/>
+          <w:b/>
+          <w:bCs/>
+          <w:color w:val="1F1F1F"/>
+        </w:rPr>
+        <w:t>fallback</w:t>
+      </w:r>
+      <w:proofErr w:type="spellEnd"/>
+      <w:r>
+        <w:rPr>
+          <w:rFonts w:ascii="Google Sans" w:eastAsia="Google Sans" w:hAnsi="Google Sans" w:cs="Google Sans"/>
+          <w:b/>
+          <w:bCs/>
+          <w:color w:val="1F1F1F"/>
+        </w:rPr>
+        <w:t>:</w:t>
       </w:r>
       <w:r>
         <w:rPr>
@@ -495,8 +819,33 @@
           <w:rFonts w:ascii="Google Sans" w:eastAsia="Google Sans" w:hAnsi="Google Sans" w:cs="Google Sans"/>
           <w:color w:val="1F1F1F"/>
         </w:rPr>
-        <w:t>2. Metodika vývoja: Využitie AI a Prompt Engineeringu</w:t>
-      </w:r>
+        <w:t xml:space="preserve">2. Metodika vývoja: Využitie AI a </w:t>
+      </w:r>
+      <w:proofErr w:type="spellStart"/>
+      <w:r>
+        <w:rPr>
+          <w:rFonts w:ascii="Google Sans" w:eastAsia="Google Sans" w:hAnsi="Google Sans" w:cs="Google Sans"/>
+          <w:color w:val="1F1F1F"/>
+        </w:rPr>
+        <w:t>Prompt</w:t>
+      </w:r>
+      <w:proofErr w:type="spellEnd"/>
+      <w:r>
+        <w:rPr>
+          <w:rFonts w:ascii="Google Sans" w:eastAsia="Google Sans" w:hAnsi="Google Sans" w:cs="Google Sans"/>
+          <w:color w:val="1F1F1F"/>
+        </w:rPr>
+        <w:t xml:space="preserve"> </w:t>
+      </w:r>
+      <w:proofErr w:type="spellStart"/>
+      <w:r>
+        <w:rPr>
+          <w:rFonts w:ascii="Google Sans" w:eastAsia="Google Sans" w:hAnsi="Google Sans" w:cs="Google Sans"/>
+          <w:color w:val="1F1F1F"/>
+        </w:rPr>
+        <w:t>Engineeringu</w:t>
+      </w:r>
+      <w:proofErr w:type="spellEnd"/>
     </w:p>
     <w:p>
       <w:pPr>
@@ -518,7 +867,23 @@
           <w:rFonts w:ascii="Google Sans" w:eastAsia="Google Sans" w:hAnsi="Google Sans" w:cs="Google Sans"/>
           <w:color w:val="1F1F1F"/>
         </w:rPr>
-        <w:t>Aby sme boli pri obhajobe nášho prototypu maximálne transparentní, chceme jasne vysvetliť, ako sme postupovali pri fyzickej tvorbe databázy. V projekte sme vo veľkej miere využili nástroje umelej inteligencie (LLM modely), ktoré nám slúžili ako "mentori" a "pair-programátori".</w:t>
+        <w:t>Aby sme boli pri obhajobe nášho prototypu maximálne transparentní, chceme jasne vysvetliť, ako sme postupovali pri fyzickej tvorbe databázy. V projekte sme vo veľkej miere využili nástroje umelej inteligencie (LLM modely), ktoré nám slúžili ako "mentori" a "</w:t>
+      </w:r>
+      <w:proofErr w:type="spellStart"/>
+      <w:r>
+        <w:rPr>
+          <w:rFonts w:ascii="Google Sans" w:eastAsia="Google Sans" w:hAnsi="Google Sans" w:cs="Google Sans"/>
+          <w:color w:val="1F1F1F"/>
+        </w:rPr>
+        <w:t>pair</w:t>
+      </w:r>
+      <w:proofErr w:type="spellEnd"/>
+      <w:r>
+        <w:rPr>
+          <w:rFonts w:ascii="Google Sans" w:eastAsia="Google Sans" w:hAnsi="Google Sans" w:cs="Google Sans"/>
+          <w:color w:val="1F1F1F"/>
+        </w:rPr>
+        <w:t>-programátori".</w:t>
       </w:r>
     </w:p>
     <w:p>
@@ -646,7 +1011,23 @@
           <w:rFonts w:ascii="Google Sans" w:eastAsia="Google Sans" w:hAnsi="Google Sans" w:cs="Google Sans"/>
           <w:color w:val="1F1F1F"/>
         </w:rPr>
-        <w:t xml:space="preserve"> Aby sme splnili podmienku 350+ záznamov, využili sme skripty vygenerované cez AI prompt, ktoré nám automaticky dogenerovali zvyšok dát (aby simulovali rôzne scenáre úhrad a dátumy).</w:t>
+        <w:t xml:space="preserve"> Aby sme splnili podmienku 350+ záznamov, využili sme skripty vygenerované cez AI </w:t>
+      </w:r>
+      <w:proofErr w:type="spellStart"/>
+      <w:r>
+        <w:rPr>
+          <w:rFonts w:ascii="Google Sans" w:eastAsia="Google Sans" w:hAnsi="Google Sans" w:cs="Google Sans"/>
+          <w:color w:val="1F1F1F"/>
+        </w:rPr>
+        <w:t>prompt</w:t>
+      </w:r>
+      <w:proofErr w:type="spellEnd"/>
+      <w:r>
+        <w:rPr>
+          <w:rFonts w:ascii="Google Sans" w:eastAsia="Google Sans" w:hAnsi="Google Sans" w:cs="Google Sans"/>
+          <w:color w:val="1F1F1F"/>
+        </w:rPr>
+        <w:t>, ktoré nám automaticky dogenerovali zvyšok dát (aby simulovali rôzne scenáre úhrad a dátumy).</w:t>
       </w:r>
     </w:p>
     <w:p>
@@ -678,7 +1059,103 @@
           <w:rFonts w:ascii="Google Sans" w:eastAsia="Google Sans" w:hAnsi="Google Sans" w:cs="Google Sans"/>
           <w:color w:val="1F1F1F"/>
         </w:rPr>
-        <w:t xml:space="preserve"> Komplexnejšie operácie (ako napr. párovanie platieb so zohľadnením čiastočných úhrad, zaokrúhľovanie, podmienky IIf a agregačné poddotazy HAVING Count(*)) sme konzultovali s AI. Rovnako sme si pomocou AI zisťovali postupy, ako v Accesse logicky prepojiť hlavný formulár s podformulárom (napr. ako po výbere CSV súboru zobraziť v podformulári iba platby prislúchajúce tomuto konkrétnemu importu).</w:t>
+        <w:t xml:space="preserve"> Komplexnejšie operácie (ako napr. párovanie platieb so zohľadnením čiastočných úhrad, zaokrúhľovanie, podmienky </w:t>
+      </w:r>
+      <w:proofErr w:type="spellStart"/>
+      <w:r>
+        <w:rPr>
+          <w:rFonts w:ascii="Google Sans" w:eastAsia="Google Sans" w:hAnsi="Google Sans" w:cs="Google Sans"/>
+          <w:color w:val="1F1F1F"/>
+        </w:rPr>
+        <w:t>IIf</w:t>
+      </w:r>
+      <w:proofErr w:type="spellEnd"/>
+      <w:r>
+        <w:rPr>
+          <w:rFonts w:ascii="Google Sans" w:eastAsia="Google Sans" w:hAnsi="Google Sans" w:cs="Google Sans"/>
+          <w:color w:val="1F1F1F"/>
+        </w:rPr>
+        <w:t xml:space="preserve"> a </w:t>
+      </w:r>
+      <w:proofErr w:type="spellStart"/>
+      <w:r>
+        <w:rPr>
+          <w:rFonts w:ascii="Google Sans" w:eastAsia="Google Sans" w:hAnsi="Google Sans" w:cs="Google Sans"/>
+          <w:color w:val="1F1F1F"/>
+        </w:rPr>
+        <w:t>agregačné</w:t>
+      </w:r>
+      <w:proofErr w:type="spellEnd"/>
+      <w:r>
+        <w:rPr>
+          <w:rFonts w:ascii="Google Sans" w:eastAsia="Google Sans" w:hAnsi="Google Sans" w:cs="Google Sans"/>
+          <w:color w:val="1F1F1F"/>
+        </w:rPr>
+        <w:t xml:space="preserve"> </w:t>
+      </w:r>
+      <w:proofErr w:type="spellStart"/>
+      <w:r>
+        <w:rPr>
+          <w:rFonts w:ascii="Google Sans" w:eastAsia="Google Sans" w:hAnsi="Google Sans" w:cs="Google Sans"/>
+          <w:color w:val="1F1F1F"/>
+        </w:rPr>
+        <w:t>poddotazy</w:t>
+      </w:r>
+      <w:proofErr w:type="spellEnd"/>
+      <w:r>
+        <w:rPr>
+          <w:rFonts w:ascii="Google Sans" w:eastAsia="Google Sans" w:hAnsi="Google Sans" w:cs="Google Sans"/>
+          <w:color w:val="1F1F1F"/>
+        </w:rPr>
+        <w:t xml:space="preserve"> HAVING </w:t>
+      </w:r>
+      <w:proofErr w:type="spellStart"/>
+      <w:r>
+        <w:rPr>
+          <w:rFonts w:ascii="Google Sans" w:eastAsia="Google Sans" w:hAnsi="Google Sans" w:cs="Google Sans"/>
+          <w:color w:val="1F1F1F"/>
+        </w:rPr>
+        <w:t>Count</w:t>
+      </w:r>
+      <w:proofErr w:type="spellEnd"/>
+      <w:r>
+        <w:rPr>
+          <w:rFonts w:ascii="Google Sans" w:eastAsia="Google Sans" w:hAnsi="Google Sans" w:cs="Google Sans"/>
+          <w:color w:val="1F1F1F"/>
+        </w:rPr>
+        <w:t xml:space="preserve">(*)) sme konzultovali s AI. Rovnako sme si pomocou AI zisťovali postupy, ako v Accesse logicky prepojiť hlavný formulár s </w:t>
+      </w:r>
+      <w:proofErr w:type="spellStart"/>
+      <w:r>
+        <w:rPr>
+          <w:rFonts w:ascii="Google Sans" w:eastAsia="Google Sans" w:hAnsi="Google Sans" w:cs="Google Sans"/>
+          <w:color w:val="1F1F1F"/>
+        </w:rPr>
+        <w:t>podformulárom</w:t>
+      </w:r>
+      <w:proofErr w:type="spellEnd"/>
+      <w:r>
+        <w:rPr>
+          <w:rFonts w:ascii="Google Sans" w:eastAsia="Google Sans" w:hAnsi="Google Sans" w:cs="Google Sans"/>
+          <w:color w:val="1F1F1F"/>
+        </w:rPr>
+        <w:t xml:space="preserve"> (napr. ako po výbere CSV súboru zobraziť v </w:t>
+      </w:r>
+      <w:proofErr w:type="spellStart"/>
+      <w:r>
+        <w:rPr>
+          <w:rFonts w:ascii="Google Sans" w:eastAsia="Google Sans" w:hAnsi="Google Sans" w:cs="Google Sans"/>
+          <w:color w:val="1F1F1F"/>
+        </w:rPr>
+        <w:t>podformulári</w:t>
+      </w:r>
+      <w:proofErr w:type="spellEnd"/>
+      <w:r>
+        <w:rPr>
+          <w:rFonts w:ascii="Google Sans" w:eastAsia="Google Sans" w:hAnsi="Google Sans" w:cs="Google Sans"/>
+          <w:color w:val="1F1F1F"/>
+        </w:rPr>
+        <w:t xml:space="preserve"> iba platby prislúchajúce tomuto konkrétnemu importu).</w:t>
       </w:r>
     </w:p>
     <w:p>
@@ -773,7 +1250,23 @@
           <w:rFonts w:ascii="Google Sans" w:eastAsia="Google Sans" w:hAnsi="Google Sans" w:cs="Google Sans"/>
           <w:color w:val="1F1F1F"/>
         </w:rPr>
-        <w:t>, keďže sa v rámci osnov tohto predmetu do takejto hĺbky nevyučujú. Tieto skripty boli stopercentne vygenerované pomocou našich promptov pre umelú inteligenciu.</w:t>
+        <w:t xml:space="preserve">, keďže sa v rámci osnov tohto predmetu do takejto hĺbky nevyučujú. Tieto skripty boli stopercentne vygenerované pomocou našich </w:t>
+      </w:r>
+      <w:proofErr w:type="spellStart"/>
+      <w:r>
+        <w:rPr>
+          <w:rFonts w:ascii="Google Sans" w:eastAsia="Google Sans" w:hAnsi="Google Sans" w:cs="Google Sans"/>
+          <w:color w:val="1F1F1F"/>
+        </w:rPr>
+        <w:t>promptov</w:t>
+      </w:r>
+      <w:proofErr w:type="spellEnd"/>
+      <w:r>
+        <w:rPr>
+          <w:rFonts w:ascii="Google Sans" w:eastAsia="Google Sans" w:hAnsi="Google Sans" w:cs="Google Sans"/>
+          <w:color w:val="1F1F1F"/>
+        </w:rPr>
+        <w:t xml:space="preserve"> pre umelú inteligenciu.</w:t>
       </w:r>
     </w:p>
     <w:p>
@@ -790,7 +1283,23 @@
           <w:rFonts w:ascii="Google Sans" w:eastAsia="Google Sans" w:hAnsi="Google Sans" w:cs="Google Sans"/>
           <w:color w:val="1F1F1F"/>
         </w:rPr>
-        <w:t>2.3 Promptovanie, ladenie a testovanie ako legitímna práca</w:t>
+        <w:t xml:space="preserve">2.3 </w:t>
+      </w:r>
+      <w:proofErr w:type="spellStart"/>
+      <w:r>
+        <w:rPr>
+          <w:rFonts w:ascii="Google Sans" w:eastAsia="Google Sans" w:hAnsi="Google Sans" w:cs="Google Sans"/>
+          <w:color w:val="1F1F1F"/>
+        </w:rPr>
+        <w:t>Promptovanie</w:t>
+      </w:r>
+      <w:proofErr w:type="spellEnd"/>
+      <w:r>
+        <w:rPr>
+          <w:rFonts w:ascii="Google Sans" w:eastAsia="Google Sans" w:hAnsi="Google Sans" w:cs="Google Sans"/>
+          <w:color w:val="1F1F1F"/>
+        </w:rPr>
+        <w:t>, ladenie a testovanie ako legitímna práca</w:t>
       </w:r>
     </w:p>
     <w:p>
@@ -822,7 +1331,27 @@
           <w:bCs/>
           <w:color w:val="1F1F1F"/>
         </w:rPr>
-        <w:t>nebolo o jednom kliknutí na "Copy &amp; Paste"</w:t>
+        <w:t>nebolo o jednom kliknutí na "</w:t>
+      </w:r>
+      <w:proofErr w:type="spellStart"/>
+      <w:r>
+        <w:rPr>
+          <w:rFonts w:ascii="Google Sans" w:eastAsia="Google Sans" w:hAnsi="Google Sans" w:cs="Google Sans"/>
+          <w:b/>
+          <w:bCs/>
+          <w:color w:val="1F1F1F"/>
+        </w:rPr>
+        <w:t>Copy</w:t>
+      </w:r>
+      <w:proofErr w:type="spellEnd"/>
+      <w:r>
+        <w:rPr>
+          <w:rFonts w:ascii="Google Sans" w:eastAsia="Google Sans" w:hAnsi="Google Sans" w:cs="Google Sans"/>
+          <w:b/>
+          <w:bCs/>
+          <w:color w:val="1F1F1F"/>
+        </w:rPr>
+        <w:t xml:space="preserve"> &amp; Paste"</w:t>
       </w:r>
       <w:r>
         <w:rPr>
@@ -909,7 +1438,27 @@
           <w:bCs/>
           <w:color w:val="1F1F1F"/>
         </w:rPr>
-        <w:t>Nekonečné ladenie (Debugging):</w:t>
+        <w:t>Nekonečné ladenie (</w:t>
+      </w:r>
+      <w:proofErr w:type="spellStart"/>
+      <w:r>
+        <w:rPr>
+          <w:rFonts w:ascii="Google Sans" w:eastAsia="Google Sans" w:hAnsi="Google Sans" w:cs="Google Sans"/>
+          <w:b/>
+          <w:bCs/>
+          <w:color w:val="1F1F1F"/>
+        </w:rPr>
+        <w:t>Debugging</w:t>
+      </w:r>
+      <w:proofErr w:type="spellEnd"/>
+      <w:r>
+        <w:rPr>
+          <w:rFonts w:ascii="Google Sans" w:eastAsia="Google Sans" w:hAnsi="Google Sans" w:cs="Google Sans"/>
+          <w:b/>
+          <w:bCs/>
+          <w:color w:val="1F1F1F"/>
+        </w:rPr>
+        <w:t>):</w:t>
       </w:r>
       <w:r>
         <w:rPr>
@@ -932,7 +1481,39 @@
           <w:rFonts w:ascii="Google Sans" w:eastAsia="Google Sans" w:hAnsi="Google Sans" w:cs="Google Sans"/>
           <w:color w:val="1F1F1F"/>
         </w:rPr>
-        <w:t xml:space="preserve"> tým, že sme kódy testovali, analyzovali chybové hlášky Accessu, tieto chyby vracali späť do AI (tzv. iteratívny prompt engineering) a hľadali riešenia.</w:t>
+        <w:t xml:space="preserve"> tým, že sme kódy testovali, analyzovali chybové hlášky Accessu, tieto chyby vracali späť do AI (tzv. iteratívny </w:t>
+      </w:r>
+      <w:proofErr w:type="spellStart"/>
+      <w:r>
+        <w:rPr>
+          <w:rFonts w:ascii="Google Sans" w:eastAsia="Google Sans" w:hAnsi="Google Sans" w:cs="Google Sans"/>
+          <w:color w:val="1F1F1F"/>
+        </w:rPr>
+        <w:t>prompt</w:t>
+      </w:r>
+      <w:proofErr w:type="spellEnd"/>
+      <w:r>
+        <w:rPr>
+          <w:rFonts w:ascii="Google Sans" w:eastAsia="Google Sans" w:hAnsi="Google Sans" w:cs="Google Sans"/>
+          <w:color w:val="1F1F1F"/>
+        </w:rPr>
+        <w:t xml:space="preserve"> </w:t>
+      </w:r>
+      <w:proofErr w:type="spellStart"/>
+      <w:r>
+        <w:rPr>
+          <w:rFonts w:ascii="Google Sans" w:eastAsia="Google Sans" w:hAnsi="Google Sans" w:cs="Google Sans"/>
+          <w:color w:val="1F1F1F"/>
+        </w:rPr>
+        <w:t>engineering</w:t>
+      </w:r>
+      <w:proofErr w:type="spellEnd"/>
+      <w:r>
+        <w:rPr>
+          <w:rFonts w:ascii="Google Sans" w:eastAsia="Google Sans" w:hAnsi="Google Sans" w:cs="Google Sans"/>
+          <w:color w:val="1F1F1F"/>
+        </w:rPr>
+        <w:t>) a hľadali riešenia.</w:t>
       </w:r>
     </w:p>
     <w:p>
@@ -972,7 +1553,23 @@
         <w:pStyle w:val="Nadpis3"/>
       </w:pPr>
       <w:r>
-        <w:t>2.4 Iteratívne promptovanie a zmenové požiadavky (Change Requests)</w:t>
+        <w:t xml:space="preserve">2.4 Iteratívne </w:t>
+      </w:r>
+      <w:proofErr w:type="spellStart"/>
+      <w:r>
+        <w:t>promptovanie</w:t>
+      </w:r>
+      <w:proofErr w:type="spellEnd"/>
+      <w:r>
+        <w:t xml:space="preserve"> a zmenové požiadavky (Change </w:t>
+      </w:r>
+      <w:proofErr w:type="spellStart"/>
+      <w:r>
+        <w:t>Requests</w:t>
+      </w:r>
+      <w:proofErr w:type="spellEnd"/>
+      <w:r>
+        <w:t>)</w:t>
       </w:r>
     </w:p>
     <w:p>
@@ -1000,7 +1597,15 @@
       </w:pPr>
       <w:r>
         <w:lastRenderedPageBreak/>
-        <w:t>Pri vývoji s pomocou AI sme nezostali len pri prvotnom vygenerovaní kódu, ale aplikovali sme prístup tzv. iteratívneho vývoja. Postupne sme na základe testovania zadávali AI cielené zmenové požiadavky (Change Requests).</w:t>
+        <w:t xml:space="preserve">Pri vývoji s pomocou AI sme nezostali len pri prvotnom vygenerovaní kódu, ale aplikovali sme prístup tzv. iteratívneho vývoja. Postupne sme na základe testovania zadávali AI cielené zmenové požiadavky (Change </w:t>
+      </w:r>
+      <w:proofErr w:type="spellStart"/>
+      <w:r>
+        <w:t>Requests</w:t>
+      </w:r>
+      <w:proofErr w:type="spellEnd"/>
+      <w:r>
+        <w:t>).</w:t>
       </w:r>
     </w:p>
     <w:p>
@@ -1035,7 +1640,23 @@
           <w:b/>
           <w:bCs/>
         </w:rPr>
-        <w:t>Príklad 1: Zmenový prompt pre generátor bankových výpisov</w:t>
+        <w:t xml:space="preserve">Príklad 1: Zmenový </w:t>
+      </w:r>
+      <w:proofErr w:type="spellStart"/>
+      <w:r>
+        <w:rPr>
+          <w:b/>
+          <w:bCs/>
+        </w:rPr>
+        <w:t>prompt</w:t>
+      </w:r>
+      <w:proofErr w:type="spellEnd"/>
+      <w:r>
+        <w:rPr>
+          <w:b/>
+          <w:bCs/>
+        </w:rPr>
+        <w:t xml:space="preserve"> pre generátor bankových výpisov</w:t>
       </w:r>
     </w:p>
     <w:p>
@@ -1239,7 +1860,27 @@
           <w:bCs/>
           <w:color w:val="1F1F1F"/>
         </w:rPr>
-        <w:t>1. Tbl_partner (Kmeňové údaje)</w:t>
+        <w:t xml:space="preserve">1. </w:t>
+      </w:r>
+      <w:proofErr w:type="spellStart"/>
+      <w:r>
+        <w:rPr>
+          <w:rFonts w:ascii="Google Sans" w:eastAsia="Google Sans" w:hAnsi="Google Sans" w:cs="Google Sans"/>
+          <w:b/>
+          <w:bCs/>
+          <w:color w:val="1F1F1F"/>
+        </w:rPr>
+        <w:t>Tbl_partner</w:t>
+      </w:r>
+      <w:proofErr w:type="spellEnd"/>
+      <w:r>
+        <w:rPr>
+          <w:rFonts w:ascii="Google Sans" w:eastAsia="Google Sans" w:hAnsi="Google Sans" w:cs="Google Sans"/>
+          <w:b/>
+          <w:bCs/>
+          <w:color w:val="1F1F1F"/>
+        </w:rPr>
+        <w:t xml:space="preserve"> (Kmeňové údaje)</w:t>
       </w:r>
     </w:p>
     <w:p>
@@ -1270,7 +1911,23 @@
           <w:color w:val="1F1F1F"/>
         </w:rPr>
         <w:lastRenderedPageBreak/>
-        <w:t xml:space="preserve">Ulica, Mesto, Krajina, IČO, DIČ, IČ DPH a IBAN). Dôležitým poľom je typ_partnera, vďaka ktorému systém rozlišuje, či ide o odberateľa (klienta) alebo dodávateľa. Z technického hľadiska ide o dátový typ </w:t>
+        <w:t xml:space="preserve">Ulica, Mesto, Krajina, IČO, DIČ, IČ DPH a IBAN). Dôležitým poľom je </w:t>
+      </w:r>
+      <w:proofErr w:type="spellStart"/>
+      <w:r>
+        <w:rPr>
+          <w:rFonts w:ascii="Google Sans" w:eastAsia="Google Sans" w:hAnsi="Google Sans" w:cs="Google Sans"/>
+          <w:color w:val="1F1F1F"/>
+        </w:rPr>
+        <w:t>typ_partnera</w:t>
+      </w:r>
+      <w:proofErr w:type="spellEnd"/>
+      <w:r>
+        <w:rPr>
+          <w:rFonts w:ascii="Google Sans" w:eastAsia="Google Sans" w:hAnsi="Google Sans" w:cs="Google Sans"/>
+          <w:color w:val="1F1F1F"/>
+        </w:rPr>
+        <w:t xml:space="preserve">, vďaka ktorému systém rozlišuje, či ide o odberateľa (klienta) alebo dodávateľa. Z technického hľadiska ide o dátový typ </w:t>
       </w:r>
       <w:r>
         <w:rPr>
@@ -1286,7 +1943,23 @@
           <w:rFonts w:ascii="Google Sans" w:eastAsia="Google Sans" w:hAnsi="Google Sans" w:cs="Google Sans"/>
           <w:color w:val="1F1F1F"/>
         </w:rPr>
-        <w:t>. Aby bola táto hodnota pre používateľa databázy zrozumiteľná a logická, implementovali sme do tohto poľa výber hodnôt (rozbaľovací zoznam pre pole Áno/Nie), ktorý 0 a -1 prekladá do zrejmých textových popisov. Tým sa predchádza vytváraniu dvoch oddelených tabuliek a znižuje sa redundancia dát.</w:t>
+        <w:t>. Aby bola táto hodnota pre používateľa databázy zrozumiteľná a logická, implementovali sme do tohto poľa výber hodnôt (</w:t>
+      </w:r>
+      <w:proofErr w:type="spellStart"/>
+      <w:r>
+        <w:rPr>
+          <w:rFonts w:ascii="Google Sans" w:eastAsia="Google Sans" w:hAnsi="Google Sans" w:cs="Google Sans"/>
+          <w:color w:val="1F1F1F"/>
+        </w:rPr>
+        <w:t>rozbaľovací</w:t>
+      </w:r>
+      <w:proofErr w:type="spellEnd"/>
+      <w:r>
+        <w:rPr>
+          <w:rFonts w:ascii="Google Sans" w:eastAsia="Google Sans" w:hAnsi="Google Sans" w:cs="Google Sans"/>
+          <w:color w:val="1F1F1F"/>
+        </w:rPr>
+        <w:t xml:space="preserve"> zoznam pre pole Áno/Nie), ktorý 0 a -1 prekladá do zrejmých textových popisov. Tým sa predchádza vytváraniu dvoch oddelených tabuliek a znižuje sa redundancia dát.</w:t>
       </w:r>
     </w:p>
     <w:p>
@@ -1313,7 +1986,27 @@
           <w:bCs/>
           <w:color w:val="1F1F1F"/>
         </w:rPr>
-        <w:t>2. Tbl_faktura (Transakčné jadro)</w:t>
+        <w:t xml:space="preserve">2. </w:t>
+      </w:r>
+      <w:proofErr w:type="spellStart"/>
+      <w:r>
+        <w:rPr>
+          <w:rFonts w:ascii="Google Sans" w:eastAsia="Google Sans" w:hAnsi="Google Sans" w:cs="Google Sans"/>
+          <w:b/>
+          <w:bCs/>
+          <w:color w:val="1F1F1F"/>
+        </w:rPr>
+        <w:t>Tbl_faktura</w:t>
+      </w:r>
+      <w:proofErr w:type="spellEnd"/>
+      <w:r>
+        <w:rPr>
+          <w:rFonts w:ascii="Google Sans" w:eastAsia="Google Sans" w:hAnsi="Google Sans" w:cs="Google Sans"/>
+          <w:b/>
+          <w:bCs/>
+          <w:color w:val="1F1F1F"/>
+        </w:rPr>
+        <w:t xml:space="preserve"> (Transakčné jadro)</w:t>
       </w:r>
     </w:p>
     <w:p>
@@ -1379,7 +2072,27 @@
           <w:bCs/>
           <w:color w:val="1F1F1F"/>
         </w:rPr>
-        <w:t>3. tbl_platba (Vstup dát z banky)</w:t>
+        <w:t xml:space="preserve">3. </w:t>
+      </w:r>
+      <w:proofErr w:type="spellStart"/>
+      <w:r>
+        <w:rPr>
+          <w:rFonts w:ascii="Google Sans" w:eastAsia="Google Sans" w:hAnsi="Google Sans" w:cs="Google Sans"/>
+          <w:b/>
+          <w:bCs/>
+          <w:color w:val="1F1F1F"/>
+        </w:rPr>
+        <w:t>tbl_platba</w:t>
+      </w:r>
+      <w:proofErr w:type="spellEnd"/>
+      <w:r>
+        <w:rPr>
+          <w:rFonts w:ascii="Google Sans" w:eastAsia="Google Sans" w:hAnsi="Google Sans" w:cs="Google Sans"/>
+          <w:b/>
+          <w:bCs/>
+          <w:color w:val="1F1F1F"/>
+        </w:rPr>
+        <w:t xml:space="preserve"> (Vstup dát z banky)</w:t>
       </w:r>
     </w:p>
     <w:p>
@@ -1402,7 +2115,23 @@
           <w:rFonts w:ascii="Google Sans" w:eastAsia="Google Sans" w:hAnsi="Google Sans" w:cs="Google Sans"/>
           <w:color w:val="1F1F1F"/>
         </w:rPr>
-        <w:t>Táto tabuľka reprezentuje surové bankové výpisy importované z formátu CSV. Obsahuje sumu, dátum platby z banky, použitý kurz, textový variabilný symbol z banky a údaje o protistrane, plný názov csv súboru. Slúži ako vstupná brána pre náš párovací algoritmus.</w:t>
+        <w:t xml:space="preserve">Táto tabuľka reprezentuje surové bankové výpisy importované z formátu CSV. Obsahuje sumu, dátum platby z banky, použitý kurz, textový variabilný symbol z banky a údaje o protistrane, plný názov </w:t>
+      </w:r>
+      <w:proofErr w:type="spellStart"/>
+      <w:r>
+        <w:rPr>
+          <w:rFonts w:ascii="Google Sans" w:eastAsia="Google Sans" w:hAnsi="Google Sans" w:cs="Google Sans"/>
+          <w:color w:val="1F1F1F"/>
+        </w:rPr>
+        <w:t>csv</w:t>
+      </w:r>
+      <w:proofErr w:type="spellEnd"/>
+      <w:r>
+        <w:rPr>
+          <w:rFonts w:ascii="Google Sans" w:eastAsia="Google Sans" w:hAnsi="Google Sans" w:cs="Google Sans"/>
+          <w:color w:val="1F1F1F"/>
+        </w:rPr>
+        <w:t xml:space="preserve"> súboru. Slúži ako vstupná brána pre náš párovací algoritmus.</w:t>
       </w:r>
     </w:p>
     <w:p>
@@ -1429,7 +2158,27 @@
           <w:bCs/>
           <w:color w:val="1F1F1F"/>
         </w:rPr>
-        <w:t>4. Tbl_mena (Číselník mien)</w:t>
+        <w:t xml:space="preserve">4. </w:t>
+      </w:r>
+      <w:proofErr w:type="spellStart"/>
+      <w:r>
+        <w:rPr>
+          <w:rFonts w:ascii="Google Sans" w:eastAsia="Google Sans" w:hAnsi="Google Sans" w:cs="Google Sans"/>
+          <w:b/>
+          <w:bCs/>
+          <w:color w:val="1F1F1F"/>
+        </w:rPr>
+        <w:t>Tbl_mena</w:t>
+      </w:r>
+      <w:proofErr w:type="spellEnd"/>
+      <w:r>
+        <w:rPr>
+          <w:rFonts w:ascii="Google Sans" w:eastAsia="Google Sans" w:hAnsi="Google Sans" w:cs="Google Sans"/>
+          <w:b/>
+          <w:bCs/>
+          <w:color w:val="1F1F1F"/>
+        </w:rPr>
+        <w:t xml:space="preserve"> (Číselník mien)</w:t>
       </w:r>
     </w:p>
     <w:p>
@@ -1452,7 +2201,23 @@
           <w:rFonts w:ascii="Google Sans" w:eastAsia="Google Sans" w:hAnsi="Google Sans" w:cs="Google Sans"/>
           <w:color w:val="1F1F1F"/>
         </w:rPr>
-        <w:t>Jednoduchý číselník (napr. EUR, USD, GBP, CZK), ktorý sa priraďuje k faktúram aj platbám, aby sme dokázali spoľahlivo oddeliť domáce platby od tých zahraničných, ktoré si vyžadujú prepočet kurzového rozdielu, zodpovedá presne skratkám mien použitým v nbs v menovom kurze.</w:t>
+        <w:t xml:space="preserve">Jednoduchý číselník (napr. EUR, USD, GBP, CZK), ktorý sa priraďuje k faktúram aj platbám, aby sme dokázali spoľahlivo oddeliť domáce platby od tých zahraničných, ktoré si vyžadujú prepočet kurzového rozdielu, zodpovedá presne skratkám mien použitým v </w:t>
+      </w:r>
+      <w:proofErr w:type="spellStart"/>
+      <w:r>
+        <w:rPr>
+          <w:rFonts w:ascii="Google Sans" w:eastAsia="Google Sans" w:hAnsi="Google Sans" w:cs="Google Sans"/>
+          <w:color w:val="1F1F1F"/>
+        </w:rPr>
+        <w:t>nbs</w:t>
+      </w:r>
+      <w:proofErr w:type="spellEnd"/>
+      <w:r>
+        <w:rPr>
+          <w:rFonts w:ascii="Google Sans" w:eastAsia="Google Sans" w:hAnsi="Google Sans" w:cs="Google Sans"/>
+          <w:color w:val="1F1F1F"/>
+        </w:rPr>
+        <w:t xml:space="preserve"> v menovom kurze.</w:t>
       </w:r>
     </w:p>
     <w:p>
@@ -1479,7 +2244,27 @@
           <w:bCs/>
           <w:color w:val="1F1F1F"/>
         </w:rPr>
-        <w:t>5. Tbl_sposob_platby (Číselník spôsobov úhrad)</w:t>
+        <w:t xml:space="preserve">5. </w:t>
+      </w:r>
+      <w:proofErr w:type="spellStart"/>
+      <w:r>
+        <w:rPr>
+          <w:rFonts w:ascii="Google Sans" w:eastAsia="Google Sans" w:hAnsi="Google Sans" w:cs="Google Sans"/>
+          <w:b/>
+          <w:bCs/>
+          <w:color w:val="1F1F1F"/>
+        </w:rPr>
+        <w:t>Tbl_sposob_platby</w:t>
+      </w:r>
+      <w:proofErr w:type="spellEnd"/>
+      <w:r>
+        <w:rPr>
+          <w:rFonts w:ascii="Google Sans" w:eastAsia="Google Sans" w:hAnsi="Google Sans" w:cs="Google Sans"/>
+          <w:b/>
+          <w:bCs/>
+          <w:color w:val="1F1F1F"/>
+        </w:rPr>
+        <w:t xml:space="preserve"> (Číselník spôsobov úhrad)</w:t>
       </w:r>
     </w:p>
     <w:p>
@@ -1529,7 +2314,27 @@
           <w:bCs/>
           <w:color w:val="1F1F1F"/>
         </w:rPr>
-        <w:t>6. Tbl_kurzy_nbs (Historické kurzy - Externé dáta)</w:t>
+        <w:t xml:space="preserve">6. </w:t>
+      </w:r>
+      <w:proofErr w:type="spellStart"/>
+      <w:r>
+        <w:rPr>
+          <w:rFonts w:ascii="Google Sans" w:eastAsia="Google Sans" w:hAnsi="Google Sans" w:cs="Google Sans"/>
+          <w:b/>
+          <w:bCs/>
+          <w:color w:val="1F1F1F"/>
+        </w:rPr>
+        <w:t>Tbl_kurzy_nbs</w:t>
+      </w:r>
+      <w:proofErr w:type="spellEnd"/>
+      <w:r>
+        <w:rPr>
+          <w:rFonts w:ascii="Google Sans" w:eastAsia="Google Sans" w:hAnsi="Google Sans" w:cs="Google Sans"/>
+          <w:b/>
+          <w:bCs/>
+          <w:color w:val="1F1F1F"/>
+        </w:rPr>
+        <w:t xml:space="preserve"> (Historické kurzy - Externé dáta)</w:t>
       </w:r>
     </w:p>
     <w:p>
@@ -1552,7 +2357,23 @@
           <w:rFonts w:ascii="Google Sans" w:eastAsia="Google Sans" w:hAnsi="Google Sans" w:cs="Google Sans"/>
           <w:color w:val="1F1F1F"/>
         </w:rPr>
-        <w:t>Databáza kurzových lístkov automaticky sťahovaných cez API Národnej banky Slovenska. Ukladá sa sem čas (Time), mena (Currency) a hodnota (Rate).</w:t>
+        <w:t>Databáza kurzových lístkov automaticky sťahovaných cez API Národnej banky Slovenska. Ukladá sa sem čas (</w:t>
+      </w:r>
+      <w:proofErr w:type="spellStart"/>
+      <w:r>
+        <w:rPr>
+          <w:rFonts w:ascii="Google Sans" w:eastAsia="Google Sans" w:hAnsi="Google Sans" w:cs="Google Sans"/>
+          <w:color w:val="1F1F1F"/>
+        </w:rPr>
+        <w:t>Time</w:t>
+      </w:r>
+      <w:proofErr w:type="spellEnd"/>
+      <w:r>
+        <w:rPr>
+          <w:rFonts w:ascii="Google Sans" w:eastAsia="Google Sans" w:hAnsi="Google Sans" w:cs="Google Sans"/>
+          <w:color w:val="1F1F1F"/>
+        </w:rPr>
+        <w:t>), mena (Currency) a hodnota (Rate).</w:t>
       </w:r>
     </w:p>
     <w:p>
@@ -1569,7 +2390,23 @@
           <w:rFonts w:ascii="Google Sans" w:eastAsia="Google Sans" w:hAnsi="Google Sans" w:cs="Google Sans"/>
           <w:color w:val="1F1F1F"/>
         </w:rPr>
-        <w:t>3.2 Popis kľúčových dotazov (Queries) a ich význam</w:t>
+        <w:t>3.2 Popis kľúčových dotazov (</w:t>
+      </w:r>
+      <w:proofErr w:type="spellStart"/>
+      <w:r>
+        <w:rPr>
+          <w:rFonts w:ascii="Google Sans" w:eastAsia="Google Sans" w:hAnsi="Google Sans" w:cs="Google Sans"/>
+          <w:color w:val="1F1F1F"/>
+        </w:rPr>
+        <w:t>Queries</w:t>
+      </w:r>
+      <w:proofErr w:type="spellEnd"/>
+      <w:r>
+        <w:rPr>
+          <w:rFonts w:ascii="Google Sans" w:eastAsia="Google Sans" w:hAnsi="Google Sans" w:cs="Google Sans"/>
+          <w:color w:val="1F1F1F"/>
+        </w:rPr>
+        <w:t>) a ich význam</w:t>
       </w:r>
     </w:p>
     <w:p>
@@ -1592,7 +2429,39 @@
           <w:rFonts w:ascii="Google Sans" w:eastAsia="Google Sans" w:hAnsi="Google Sans" w:cs="Google Sans"/>
           <w:color w:val="1F1F1F"/>
         </w:rPr>
-        <w:t xml:space="preserve">Samotné tabuľky by boli bez procesnej logiky zbytočné. Preto sme v MS Access navrhli sadu dotazov (SQL Queries), ktoré plnia funkciu transformačnej vrstvy – zabezpečujú chod našej inovácie (Smart-Pairing), pripravujú dáta pre používateľské formuláre a generujú analytické </w:t>
+        <w:t xml:space="preserve">Samotné tabuľky by boli bez procesnej logiky zbytočné. Preto sme v MS Access navrhli sadu dotazov (SQL </w:t>
+      </w:r>
+      <w:proofErr w:type="spellStart"/>
+      <w:r>
+        <w:rPr>
+          <w:rFonts w:ascii="Google Sans" w:eastAsia="Google Sans" w:hAnsi="Google Sans" w:cs="Google Sans"/>
+          <w:color w:val="1F1F1F"/>
+        </w:rPr>
+        <w:t>Queries</w:t>
+      </w:r>
+      <w:proofErr w:type="spellEnd"/>
+      <w:r>
+        <w:rPr>
+          <w:rFonts w:ascii="Google Sans" w:eastAsia="Google Sans" w:hAnsi="Google Sans" w:cs="Google Sans"/>
+          <w:color w:val="1F1F1F"/>
+        </w:rPr>
+        <w:t>), ktoré plnia funkciu transformačnej vrstvy – zabezpečujú chod našej inovácie (</w:t>
+      </w:r>
+      <w:proofErr w:type="spellStart"/>
+      <w:r>
+        <w:rPr>
+          <w:rFonts w:ascii="Google Sans" w:eastAsia="Google Sans" w:hAnsi="Google Sans" w:cs="Google Sans"/>
+          <w:color w:val="1F1F1F"/>
+        </w:rPr>
+        <w:t>Smart-Pairing</w:t>
+      </w:r>
+      <w:proofErr w:type="spellEnd"/>
+      <w:r>
+        <w:rPr>
+          <w:rFonts w:ascii="Google Sans" w:eastAsia="Google Sans" w:hAnsi="Google Sans" w:cs="Google Sans"/>
+          <w:color w:val="1F1F1F"/>
+        </w:rPr>
+        <w:t xml:space="preserve">), pripravujú dáta pre používateľské formuláre a generujú analytické </w:t>
       </w:r>
       <w:r>
         <w:rPr>
@@ -1659,7 +2528,23 @@
           <w:rFonts w:ascii="Google Sans" w:eastAsia="Google Sans" w:hAnsi="Google Sans" w:cs="Google Sans"/>
           <w:color w:val="1F1F1F"/>
         </w:rPr>
-        <w:t>Aktualizačný Smart-Pairing dotaz. Prepája platby s faktúrami podľa Variabilného symbolu (VS). Obsahuje tri dôležité úrovne ochrany:</w:t>
+        <w:t xml:space="preserve">Aktualizačný </w:t>
+      </w:r>
+      <w:proofErr w:type="spellStart"/>
+      <w:r>
+        <w:rPr>
+          <w:rFonts w:ascii="Google Sans" w:eastAsia="Google Sans" w:hAnsi="Google Sans" w:cs="Google Sans"/>
+          <w:color w:val="1F1F1F"/>
+        </w:rPr>
+        <w:t>Smart-Pairing</w:t>
+      </w:r>
+      <w:proofErr w:type="spellEnd"/>
+      <w:r>
+        <w:rPr>
+          <w:rFonts w:ascii="Google Sans" w:eastAsia="Google Sans" w:hAnsi="Google Sans" w:cs="Google Sans"/>
+          <w:color w:val="1F1F1F"/>
+        </w:rPr>
+        <w:t xml:space="preserve"> dotaz. Prepája platby s faktúrami podľa Variabilného symbolu (VS). Obsahuje tri dôležité úrovne ochrany:</w:t>
       </w:r>
     </w:p>
     <w:p>
@@ -1785,7 +2670,23 @@
           <w:rFonts w:ascii="Google Sans" w:eastAsia="Google Sans" w:hAnsi="Google Sans" w:cs="Google Sans"/>
           <w:color w:val="1F1F1F"/>
         </w:rPr>
-        <w:t xml:space="preserve"> (využíva Subquery pre odfiltrovanie opakujúcich sa VS).</w:t>
+        <w:t xml:space="preserve"> (využíva </w:t>
+      </w:r>
+      <w:proofErr w:type="spellStart"/>
+      <w:r>
+        <w:rPr>
+          <w:rFonts w:ascii="Google Sans" w:eastAsia="Google Sans" w:hAnsi="Google Sans" w:cs="Google Sans"/>
+          <w:color w:val="1F1F1F"/>
+        </w:rPr>
+        <w:t>Subquery</w:t>
+      </w:r>
+      <w:proofErr w:type="spellEnd"/>
+      <w:r>
+        <w:rPr>
+          <w:rFonts w:ascii="Google Sans" w:eastAsia="Google Sans" w:hAnsi="Google Sans" w:cs="Google Sans"/>
+          <w:color w:val="1F1F1F"/>
+        </w:rPr>
+        <w:t xml:space="preserve"> pre odfiltrovanie opakujúcich sa VS).</w:t>
       </w:r>
       <w:r>
         <w:rPr>
@@ -1848,7 +2749,55 @@
           <w:rFonts w:ascii="Google Sans" w:eastAsia="Google Sans" w:hAnsi="Google Sans" w:cs="Google Sans"/>
           <w:color w:val="1F1F1F"/>
         </w:rPr>
-        <w:t>Automatizačný dotaz. Zabezpečuje, že sa automaticky aktualizuje IBAN partnera v tabuľke Tbl_partner na základe prijatých a spárovaných úhrad. Udržiava tak kmeňové dáta (Master Data) neustále aktuálne.</w:t>
+        <w:t xml:space="preserve">Automatizačný dotaz. Zabezpečuje, že sa automaticky aktualizuje IBAN partnera v tabuľke </w:t>
+      </w:r>
+      <w:proofErr w:type="spellStart"/>
+      <w:r>
+        <w:rPr>
+          <w:rFonts w:ascii="Google Sans" w:eastAsia="Google Sans" w:hAnsi="Google Sans" w:cs="Google Sans"/>
+          <w:color w:val="1F1F1F"/>
+        </w:rPr>
+        <w:t>Tbl_partner</w:t>
+      </w:r>
+      <w:proofErr w:type="spellEnd"/>
+      <w:r>
+        <w:rPr>
+          <w:rFonts w:ascii="Google Sans" w:eastAsia="Google Sans" w:hAnsi="Google Sans" w:cs="Google Sans"/>
+          <w:color w:val="1F1F1F"/>
+        </w:rPr>
+        <w:t xml:space="preserve"> na základe prijatých a spárovaných úhrad. Udržiava tak kmeňové dáta (</w:t>
+      </w:r>
+      <w:proofErr w:type="spellStart"/>
+      <w:r>
+        <w:rPr>
+          <w:rFonts w:ascii="Google Sans" w:eastAsia="Google Sans" w:hAnsi="Google Sans" w:cs="Google Sans"/>
+          <w:color w:val="1F1F1F"/>
+        </w:rPr>
+        <w:t>Master</w:t>
+      </w:r>
+      <w:proofErr w:type="spellEnd"/>
+      <w:r>
+        <w:rPr>
+          <w:rFonts w:ascii="Google Sans" w:eastAsia="Google Sans" w:hAnsi="Google Sans" w:cs="Google Sans"/>
+          <w:color w:val="1F1F1F"/>
+        </w:rPr>
+        <w:t xml:space="preserve"> </w:t>
+      </w:r>
+      <w:proofErr w:type="spellStart"/>
+      <w:r>
+        <w:rPr>
+          <w:rFonts w:ascii="Google Sans" w:eastAsia="Google Sans" w:hAnsi="Google Sans" w:cs="Google Sans"/>
+          <w:color w:val="1F1F1F"/>
+        </w:rPr>
+        <w:t>Data</w:t>
+      </w:r>
+      <w:proofErr w:type="spellEnd"/>
+      <w:r>
+        <w:rPr>
+          <w:rFonts w:ascii="Google Sans" w:eastAsia="Google Sans" w:hAnsi="Google Sans" w:cs="Google Sans"/>
+          <w:color w:val="1F1F1F"/>
+        </w:rPr>
+        <w:t>) neustále aktuálne.</w:t>
       </w:r>
     </w:p>
     <w:p>
@@ -1880,7 +2829,23 @@
           <w:rFonts w:ascii="Google Sans" w:eastAsia="Google Sans" w:hAnsi="Google Sans" w:cs="Google Sans"/>
           <w:color w:val="1F1F1F"/>
         </w:rPr>
-        <w:t xml:space="preserve"> Aktualizačný dotaz pre inteligentné hromadné párovanie splátok. Pokrýva scenár, kedy zákazník uhradí faktúru viacerými čiastkovými platbami s rovnakým variabilným symbolom. Dotaz využíva funkciu DSum na sčítanie všetkých takýchto nespárovaných platieb. Ich súčet (v absolútnej hodnote pre ošetrenie mínusových dodávateľských úhrad) sa porovnáva so sumou faktúry (s využitím zaokrúhľovania na centy). Ak nastane 100 % zhoda, systém všetky tieto čiastkové platby naraz a automaticky spáruje s danou faktúrou.</w:t>
+        <w:t xml:space="preserve"> Aktualizačný dotaz pre inteligentné hromadné párovanie splátok. Pokrýva scenár, kedy zákazník uhradí faktúru viacerými čiastkovými platbami s rovnakým variabilným symbolom. Dotaz využíva funkciu </w:t>
+      </w:r>
+      <w:proofErr w:type="spellStart"/>
+      <w:r>
+        <w:rPr>
+          <w:rFonts w:ascii="Google Sans" w:eastAsia="Google Sans" w:hAnsi="Google Sans" w:cs="Google Sans"/>
+          <w:color w:val="1F1F1F"/>
+        </w:rPr>
+        <w:t>DSum</w:t>
+      </w:r>
+      <w:proofErr w:type="spellEnd"/>
+      <w:r>
+        <w:rPr>
+          <w:rFonts w:ascii="Google Sans" w:eastAsia="Google Sans" w:hAnsi="Google Sans" w:cs="Google Sans"/>
+          <w:color w:val="1F1F1F"/>
+        </w:rPr>
+        <w:t xml:space="preserve"> na sčítanie všetkých takýchto nespárovaných platieb. Ich súčet (v absolútnej hodnote pre ošetrenie mínusových dodávateľských úhrad) sa porovnáva so sumou faktúry (s využitím zaokrúhľovania na centy). Ak nastane 100 % zhoda, systém všetky tieto čiastkové platby naraz a automaticky spáruje s danou faktúrou.</w:t>
       </w:r>
     </w:p>
     <w:p>
@@ -1907,17 +2872,19 @@
           <w:bCs/>
           <w:color w:val="1F1F1F"/>
         </w:rPr>
-        <w:t>4</w:t>
-      </w:r>
-      <w:r>
-        <w:rPr>
-          <w:rFonts w:ascii="Google Sans" w:eastAsia="Google Sans" w:hAnsi="Google Sans" w:cs="Google Sans"/>
-          <w:b/>
-          <w:bCs/>
-          <w:color w:val="1F1F1F"/>
-        </w:rPr>
-        <w:t>. qry_faktury</w:t>
-      </w:r>
+        <w:t xml:space="preserve">4. </w:t>
+      </w:r>
+      <w:proofErr w:type="spellStart"/>
+      <w:r>
+        <w:rPr>
+          <w:rFonts w:ascii="Google Sans" w:eastAsia="Google Sans" w:hAnsi="Google Sans" w:cs="Google Sans"/>
+          <w:b/>
+          <w:bCs/>
+          <w:color w:val="1F1F1F"/>
+        </w:rPr>
+        <w:t>qry_faktury</w:t>
+      </w:r>
+      <w:proofErr w:type="spellEnd"/>
     </w:p>
     <w:p>
       <w:pPr>
@@ -1966,17 +2933,19 @@
           <w:bCs/>
           <w:color w:val="1F1F1F"/>
         </w:rPr>
-        <w:t>5</w:t>
-      </w:r>
-      <w:r>
-        <w:rPr>
-          <w:rFonts w:ascii="Google Sans" w:eastAsia="Google Sans" w:hAnsi="Google Sans" w:cs="Google Sans"/>
-          <w:b/>
-          <w:bCs/>
-          <w:color w:val="1F1F1F"/>
-        </w:rPr>
-        <w:t>. qry_Faktury_Na_Vyber</w:t>
-      </w:r>
+        <w:t xml:space="preserve">5. </w:t>
+      </w:r>
+      <w:proofErr w:type="spellStart"/>
+      <w:r>
+        <w:rPr>
+          <w:rFonts w:ascii="Google Sans" w:eastAsia="Google Sans" w:hAnsi="Google Sans" w:cs="Google Sans"/>
+          <w:b/>
+          <w:bCs/>
+          <w:color w:val="1F1F1F"/>
+        </w:rPr>
+        <w:t>qry_Faktury_Na_Vyber</w:t>
+      </w:r>
+      <w:proofErr w:type="spellEnd"/>
     </w:p>
     <w:p>
       <w:pPr>
@@ -2014,7 +2983,39 @@
           <w:rFonts w:ascii="Google Sans" w:eastAsia="Google Sans" w:hAnsi="Google Sans" w:cs="Google Sans"/>
           <w:color w:val="1F1F1F"/>
         </w:rPr>
-        <w:t xml:space="preserve"> pohľadávky (ich zostatok &gt; 0). Zabezpečuje, že v ponuke rozbaľovacieho zoznamu (Combo Boxu) vo formulári sú účtovníkovi ponúkané len relevantné faktúry určené na doriešenie.</w:t>
+        <w:t xml:space="preserve"> pohľadávky (ich zostatok &gt; 0). Zabezpečuje, že v ponuke </w:t>
+      </w:r>
+      <w:proofErr w:type="spellStart"/>
+      <w:r>
+        <w:rPr>
+          <w:rFonts w:ascii="Google Sans" w:eastAsia="Google Sans" w:hAnsi="Google Sans" w:cs="Google Sans"/>
+          <w:color w:val="1F1F1F"/>
+        </w:rPr>
+        <w:t>rozbaľovacieho</w:t>
+      </w:r>
+      <w:proofErr w:type="spellEnd"/>
+      <w:r>
+        <w:rPr>
+          <w:rFonts w:ascii="Google Sans" w:eastAsia="Google Sans" w:hAnsi="Google Sans" w:cs="Google Sans"/>
+          <w:color w:val="1F1F1F"/>
+        </w:rPr>
+        <w:t xml:space="preserve"> zoznamu (</w:t>
+      </w:r>
+      <w:proofErr w:type="spellStart"/>
+      <w:r>
+        <w:rPr>
+          <w:rFonts w:ascii="Google Sans" w:eastAsia="Google Sans" w:hAnsi="Google Sans" w:cs="Google Sans"/>
+          <w:color w:val="1F1F1F"/>
+        </w:rPr>
+        <w:t>Combo</w:t>
+      </w:r>
+      <w:proofErr w:type="spellEnd"/>
+      <w:r>
+        <w:rPr>
+          <w:rFonts w:ascii="Google Sans" w:eastAsia="Google Sans" w:hAnsi="Google Sans" w:cs="Google Sans"/>
+          <w:color w:val="1F1F1F"/>
+        </w:rPr>
+        <w:t xml:space="preserve"> Boxu) vo formulári sú účtovníkovi ponúkané len relevantné faktúry určené na doriešenie.</w:t>
       </w:r>
     </w:p>
     <w:p>
@@ -2041,17 +3042,19 @@
           <w:bCs/>
           <w:color w:val="1F1F1F"/>
         </w:rPr>
-        <w:t>6</w:t>
-      </w:r>
-      <w:r>
-        <w:rPr>
-          <w:rFonts w:ascii="Google Sans" w:eastAsia="Google Sans" w:hAnsi="Google Sans" w:cs="Google Sans"/>
-          <w:b/>
-          <w:bCs/>
-          <w:color w:val="1F1F1F"/>
-        </w:rPr>
-        <w:t>. qry_Nesparovane_Platby</w:t>
-      </w:r>
+        <w:t xml:space="preserve">6. </w:t>
+      </w:r>
+      <w:proofErr w:type="spellStart"/>
+      <w:r>
+        <w:rPr>
+          <w:rFonts w:ascii="Google Sans" w:eastAsia="Google Sans" w:hAnsi="Google Sans" w:cs="Google Sans"/>
+          <w:b/>
+          <w:bCs/>
+          <w:color w:val="1F1F1F"/>
+        </w:rPr>
+        <w:t>qry_Nesparovane_Platby</w:t>
+      </w:r>
+      <w:proofErr w:type="spellEnd"/>
     </w:p>
     <w:p>
       <w:pPr>
@@ -2073,7 +3076,55 @@
           <w:rFonts w:ascii="Google Sans" w:eastAsia="Google Sans" w:hAnsi="Google Sans" w:cs="Google Sans"/>
           <w:color w:val="1F1F1F"/>
         </w:rPr>
-        <w:t>Logické sito. Filtruje bankové pohyby, ktoré neprešli automatickým párovaním (FK_faktura Is Null). Tento dotaz slúži ako výhradný zdroj dát pre náš formulár manuálneho párovania.</w:t>
+        <w:t>Logické sito. Filtruje bankové pohyby, ktoré neprešli automatickým párovaním (</w:t>
+      </w:r>
+      <w:proofErr w:type="spellStart"/>
+      <w:r>
+        <w:rPr>
+          <w:rFonts w:ascii="Google Sans" w:eastAsia="Google Sans" w:hAnsi="Google Sans" w:cs="Google Sans"/>
+          <w:color w:val="1F1F1F"/>
+        </w:rPr>
+        <w:t>FK_faktura</w:t>
+      </w:r>
+      <w:proofErr w:type="spellEnd"/>
+      <w:r>
+        <w:rPr>
+          <w:rFonts w:ascii="Google Sans" w:eastAsia="Google Sans" w:hAnsi="Google Sans" w:cs="Google Sans"/>
+          <w:color w:val="1F1F1F"/>
+        </w:rPr>
+        <w:t xml:space="preserve"> </w:t>
+      </w:r>
+      <w:proofErr w:type="spellStart"/>
+      <w:r>
+        <w:rPr>
+          <w:rFonts w:ascii="Google Sans" w:eastAsia="Google Sans" w:hAnsi="Google Sans" w:cs="Google Sans"/>
+          <w:color w:val="1F1F1F"/>
+        </w:rPr>
+        <w:t>Is</w:t>
+      </w:r>
+      <w:proofErr w:type="spellEnd"/>
+      <w:r>
+        <w:rPr>
+          <w:rFonts w:ascii="Google Sans" w:eastAsia="Google Sans" w:hAnsi="Google Sans" w:cs="Google Sans"/>
+          <w:color w:val="1F1F1F"/>
+        </w:rPr>
+        <w:t xml:space="preserve"> </w:t>
+      </w:r>
+      <w:proofErr w:type="spellStart"/>
+      <w:r>
+        <w:rPr>
+          <w:rFonts w:ascii="Google Sans" w:eastAsia="Google Sans" w:hAnsi="Google Sans" w:cs="Google Sans"/>
+          <w:color w:val="1F1F1F"/>
+        </w:rPr>
+        <w:t>Null</w:t>
+      </w:r>
+      <w:proofErr w:type="spellEnd"/>
+      <w:r>
+        <w:rPr>
+          <w:rFonts w:ascii="Google Sans" w:eastAsia="Google Sans" w:hAnsi="Google Sans" w:cs="Google Sans"/>
+          <w:color w:val="1F1F1F"/>
+        </w:rPr>
+        <w:t>). Tento dotaz slúži ako výhradný zdroj dát pre náš formulár manuálneho párovania.</w:t>
       </w:r>
     </w:p>
     <w:p>
@@ -2101,17 +3152,19 @@
           <w:color w:val="1F1F1F"/>
         </w:rPr>
         <w:lastRenderedPageBreak/>
-        <w:t>7</w:t>
-      </w:r>
-      <w:r>
-        <w:rPr>
-          <w:rFonts w:ascii="Google Sans" w:eastAsia="Google Sans" w:hAnsi="Google Sans" w:cs="Google Sans"/>
-          <w:b/>
-          <w:bCs/>
-          <w:color w:val="1F1F1F"/>
-        </w:rPr>
-        <w:t>. qry_Platby_Prehlad</w:t>
-      </w:r>
+        <w:t xml:space="preserve">7. </w:t>
+      </w:r>
+      <w:proofErr w:type="spellStart"/>
+      <w:r>
+        <w:rPr>
+          <w:rFonts w:ascii="Google Sans" w:eastAsia="Google Sans" w:hAnsi="Google Sans" w:cs="Google Sans"/>
+          <w:b/>
+          <w:bCs/>
+          <w:color w:val="1F1F1F"/>
+        </w:rPr>
+        <w:t>qry_Platby_Prehlad</w:t>
+      </w:r>
+      <w:proofErr w:type="spellEnd"/>
     </w:p>
     <w:p>
       <w:pPr>
@@ -2169,8 +3222,19 @@
           <w:bCs/>
           <w:color w:val="1F1F1F"/>
         </w:rPr>
-        <w:t>. qry_Sparovane_Faktury_Prehlad</w:t>
-      </w:r>
+        <w:t xml:space="preserve">. </w:t>
+      </w:r>
+      <w:proofErr w:type="spellStart"/>
+      <w:r>
+        <w:rPr>
+          <w:rFonts w:ascii="Google Sans" w:eastAsia="Google Sans" w:hAnsi="Google Sans" w:cs="Google Sans"/>
+          <w:b/>
+          <w:bCs/>
+          <w:color w:val="1F1F1F"/>
+        </w:rPr>
+        <w:t>qry_Sparovane_Faktury_Prehlad</w:t>
+      </w:r>
+      <w:proofErr w:type="spellEnd"/>
       <w:r>
         <w:rPr>
           <w:rFonts w:ascii="Google Sans" w:eastAsia="Google Sans" w:hAnsi="Google Sans" w:cs="Google Sans"/>
@@ -2201,7 +3265,23 @@
           <w:rFonts w:ascii="Google Sans" w:eastAsia="Google Sans" w:hAnsi="Google Sans" w:cs="Google Sans"/>
           <w:color w:val="1F1F1F"/>
         </w:rPr>
-        <w:t>Detailný transakčný report (Exportný dataset). Namiesto agregácie celkových zostatkov tento dotaz zobrazuje každú prijatú platbu (vrátane čiastočných splátok) ako samostatný riadok. Vďaka tomuto detailnému rozpadu dokáže systém vyčísliť presný kurzový rozdiel pre každú jednotlivú splátku v čase jej prijatia. Tento surový transakčný dotaz slúži ako hlavný exportný podklad pre generovanie flexibilných kontingenčných tabuliek a manažérskych grafov v rámci doriešenia User Story #5 v aplikácii Excel.</w:t>
+        <w:t xml:space="preserve">Detailný transakčný report (Exportný </w:t>
+      </w:r>
+      <w:proofErr w:type="spellStart"/>
+      <w:r>
+        <w:rPr>
+          <w:rFonts w:ascii="Google Sans" w:eastAsia="Google Sans" w:hAnsi="Google Sans" w:cs="Google Sans"/>
+          <w:color w:val="1F1F1F"/>
+        </w:rPr>
+        <w:t>dataset</w:t>
+      </w:r>
+      <w:proofErr w:type="spellEnd"/>
+      <w:r>
+        <w:rPr>
+          <w:rFonts w:ascii="Google Sans" w:eastAsia="Google Sans" w:hAnsi="Google Sans" w:cs="Google Sans"/>
+          <w:color w:val="1F1F1F"/>
+        </w:rPr>
+        <w:t>). Namiesto agregácie celkových zostatkov tento dotaz zobrazuje každú prijatú platbu (vrátane čiastočných splátok) ako samostatný riadok. Vďaka tomuto detailnému rozpadu dokáže systém vyčísliť presný kurzový rozdiel pre každú jednotlivú splátku v čase jej prijatia. Tento surový transakčný dotaz slúži ako hlavný exportný podklad pre generovanie flexibilných kontingenčných tabuliek a manažérskych grafov v rámci doriešenia User Story #5 v aplikácii Excel.</w:t>
       </w:r>
     </w:p>
     <w:p>
@@ -2224,7 +3304,23 @@
           <w:rFonts w:ascii="Google Sans" w:eastAsia="Google Sans" w:hAnsi="Google Sans" w:cs="Google Sans"/>
           <w:color w:val="1F1F1F"/>
         </w:rPr>
-        <w:t>Analytické rozšírenie: Najnovšie bol do reportu pridaný aj analytický príznak Auto_Sparovane (Áno/Nie), vďaka ktorému bude môcť Business Analytik v Exceli vyhodnotiť percentuálnu úspešnosť našej umelej inteligencie a presne zmerať úsporu času tým, že zistí, koľko platieb sa spárovalo automaticky a koľko si vyžadovalo manuálny zásah.</w:t>
+        <w:t xml:space="preserve">Analytické rozšírenie: Najnovšie bol do reportu pridaný aj analytický príznak </w:t>
+      </w:r>
+      <w:proofErr w:type="spellStart"/>
+      <w:r>
+        <w:rPr>
+          <w:rFonts w:ascii="Google Sans" w:eastAsia="Google Sans" w:hAnsi="Google Sans" w:cs="Google Sans"/>
+          <w:color w:val="1F1F1F"/>
+        </w:rPr>
+        <w:t>Auto_Sparovane</w:t>
+      </w:r>
+      <w:proofErr w:type="spellEnd"/>
+      <w:r>
+        <w:rPr>
+          <w:rFonts w:ascii="Google Sans" w:eastAsia="Google Sans" w:hAnsi="Google Sans" w:cs="Google Sans"/>
+          <w:color w:val="1F1F1F"/>
+        </w:rPr>
+        <w:t xml:space="preserve"> (Áno/Nie), vďaka ktorému bude môcť Business Analytik v Exceli vyhodnotiť percentuálnu úspešnosť našej umelej inteligencie a presne zmerať úsporu času tým, že zistí, koľko platieb sa spárovalo automaticky a koľko si vyžadovalo manuálny zásah.</w:t>
       </w:r>
     </w:p>
     <w:p>
@@ -2283,7 +3379,27 @@
           <w:bCs/>
           <w:color w:val="1F1F1F"/>
         </w:rPr>
-        <w:t>. qry_mazanie_kurzov_nbs (Administračný dotaz)</w:t>
+        <w:t xml:space="preserve">. </w:t>
+      </w:r>
+      <w:proofErr w:type="spellStart"/>
+      <w:r>
+        <w:rPr>
+          <w:rFonts w:ascii="Google Sans" w:eastAsia="Google Sans" w:hAnsi="Google Sans" w:cs="Google Sans"/>
+          <w:b/>
+          <w:bCs/>
+          <w:color w:val="1F1F1F"/>
+        </w:rPr>
+        <w:t>qry_mazanie_kurzov_nbs</w:t>
+      </w:r>
+      <w:proofErr w:type="spellEnd"/>
+      <w:r>
+        <w:rPr>
+          <w:rFonts w:ascii="Google Sans" w:eastAsia="Google Sans" w:hAnsi="Google Sans" w:cs="Google Sans"/>
+          <w:b/>
+          <w:bCs/>
+          <w:color w:val="1F1F1F"/>
+        </w:rPr>
+        <w:t xml:space="preserve"> (Administračný dotaz)</w:t>
       </w:r>
     </w:p>
     <w:p>
@@ -2306,7 +3422,55 @@
           <w:rFonts w:ascii="Google Sans" w:eastAsia="Google Sans" w:hAnsi="Google Sans" w:cs="Google Sans"/>
           <w:color w:val="1F1F1F"/>
         </w:rPr>
-        <w:t>Odstraňovací dotaz (DELETE Query). Administrátorský nástroj, ktorý slúži na kompletné vymazanie histórie stiahnutých kurzov z tabuľky Tbl_kurzy_nbs. Využíva sa pri hard-resete databázy pred novým testovacím cyklom na vynútenie opätovného stiahnutia dát z API NBS.</w:t>
+        <w:t xml:space="preserve">Odstraňovací dotaz (DELETE </w:t>
+      </w:r>
+      <w:proofErr w:type="spellStart"/>
+      <w:r>
+        <w:rPr>
+          <w:rFonts w:ascii="Google Sans" w:eastAsia="Google Sans" w:hAnsi="Google Sans" w:cs="Google Sans"/>
+          <w:color w:val="1F1F1F"/>
+        </w:rPr>
+        <w:t>Query</w:t>
+      </w:r>
+      <w:proofErr w:type="spellEnd"/>
+      <w:r>
+        <w:rPr>
+          <w:rFonts w:ascii="Google Sans" w:eastAsia="Google Sans" w:hAnsi="Google Sans" w:cs="Google Sans"/>
+          <w:color w:val="1F1F1F"/>
+        </w:rPr>
+        <w:t xml:space="preserve">). Administrátorský nástroj, ktorý slúži na kompletné vymazanie histórie stiahnutých kurzov z tabuľky </w:t>
+      </w:r>
+      <w:proofErr w:type="spellStart"/>
+      <w:r>
+        <w:rPr>
+          <w:rFonts w:ascii="Google Sans" w:eastAsia="Google Sans" w:hAnsi="Google Sans" w:cs="Google Sans"/>
+          <w:color w:val="1F1F1F"/>
+        </w:rPr>
+        <w:t>Tbl_kurzy_nbs</w:t>
+      </w:r>
+      <w:proofErr w:type="spellEnd"/>
+      <w:r>
+        <w:rPr>
+          <w:rFonts w:ascii="Google Sans" w:eastAsia="Google Sans" w:hAnsi="Google Sans" w:cs="Google Sans"/>
+          <w:color w:val="1F1F1F"/>
+        </w:rPr>
+        <w:t xml:space="preserve">. Využíva sa pri </w:t>
+      </w:r>
+      <w:proofErr w:type="spellStart"/>
+      <w:r>
+        <w:rPr>
+          <w:rFonts w:ascii="Google Sans" w:eastAsia="Google Sans" w:hAnsi="Google Sans" w:cs="Google Sans"/>
+          <w:color w:val="1F1F1F"/>
+        </w:rPr>
+        <w:t>hard</w:t>
+      </w:r>
+      <w:proofErr w:type="spellEnd"/>
+      <w:r>
+        <w:rPr>
+          <w:rFonts w:ascii="Google Sans" w:eastAsia="Google Sans" w:hAnsi="Google Sans" w:cs="Google Sans"/>
+          <w:color w:val="1F1F1F"/>
+        </w:rPr>
+        <w:t>-resete databázy pred novým testovacím cyklom na vynútenie opätovného stiahnutia dát z API NBS.</w:t>
       </w:r>
     </w:p>
     <w:p>
@@ -2358,7 +3522,27 @@
           <w:bCs/>
           <w:color w:val="1F1F1F"/>
         </w:rPr>
-        <w:t>. vymaz_kurzNBS_z_faktur (Administračný dotaz)</w:t>
+        <w:t xml:space="preserve">. </w:t>
+      </w:r>
+      <w:proofErr w:type="spellStart"/>
+      <w:r>
+        <w:rPr>
+          <w:rFonts w:ascii="Google Sans" w:eastAsia="Google Sans" w:hAnsi="Google Sans" w:cs="Google Sans"/>
+          <w:b/>
+          <w:bCs/>
+          <w:color w:val="1F1F1F"/>
+        </w:rPr>
+        <w:t>vymaz_kurzNBS_z_faktur</w:t>
+      </w:r>
+      <w:proofErr w:type="spellEnd"/>
+      <w:r>
+        <w:rPr>
+          <w:rFonts w:ascii="Google Sans" w:eastAsia="Google Sans" w:hAnsi="Google Sans" w:cs="Google Sans"/>
+          <w:b/>
+          <w:bCs/>
+          <w:color w:val="1F1F1F"/>
+        </w:rPr>
+        <w:t xml:space="preserve"> (Administračný dotaz)</w:t>
       </w:r>
     </w:p>
     <w:p>
@@ -2381,7 +3565,55 @@
           <w:rFonts w:ascii="Google Sans" w:eastAsia="Google Sans" w:hAnsi="Google Sans" w:cs="Google Sans"/>
           <w:color w:val="1F1F1F"/>
         </w:rPr>
-        <w:t>Aktualizačný dotaz (UPDATE Query). Používa sa spoločne s predchádzajúcim dotazom pri resete databázy. Hromadne vymaže (nastaví na Null) už priradené kurzy priamo v hlavičkách faktúr v tabuľke Tbl_faktura.</w:t>
+        <w:t xml:space="preserve">Aktualizačný dotaz (UPDATE </w:t>
+      </w:r>
+      <w:proofErr w:type="spellStart"/>
+      <w:r>
+        <w:rPr>
+          <w:rFonts w:ascii="Google Sans" w:eastAsia="Google Sans" w:hAnsi="Google Sans" w:cs="Google Sans"/>
+          <w:color w:val="1F1F1F"/>
+        </w:rPr>
+        <w:t>Query</w:t>
+      </w:r>
+      <w:proofErr w:type="spellEnd"/>
+      <w:r>
+        <w:rPr>
+          <w:rFonts w:ascii="Google Sans" w:eastAsia="Google Sans" w:hAnsi="Google Sans" w:cs="Google Sans"/>
+          <w:color w:val="1F1F1F"/>
+        </w:rPr>
+        <w:t xml:space="preserve">). Používa sa spoločne s predchádzajúcim dotazom pri resete databázy. Hromadne vymaže (nastaví na </w:t>
+      </w:r>
+      <w:proofErr w:type="spellStart"/>
+      <w:r>
+        <w:rPr>
+          <w:rFonts w:ascii="Google Sans" w:eastAsia="Google Sans" w:hAnsi="Google Sans" w:cs="Google Sans"/>
+          <w:color w:val="1F1F1F"/>
+        </w:rPr>
+        <w:t>Null</w:t>
+      </w:r>
+      <w:proofErr w:type="spellEnd"/>
+      <w:r>
+        <w:rPr>
+          <w:rFonts w:ascii="Google Sans" w:eastAsia="Google Sans" w:hAnsi="Google Sans" w:cs="Google Sans"/>
+          <w:color w:val="1F1F1F"/>
+        </w:rPr>
+        <w:t xml:space="preserve">) už priradené kurzy priamo v hlavičkách faktúr v tabuľke </w:t>
+      </w:r>
+      <w:proofErr w:type="spellStart"/>
+      <w:r>
+        <w:rPr>
+          <w:rFonts w:ascii="Google Sans" w:eastAsia="Google Sans" w:hAnsi="Google Sans" w:cs="Google Sans"/>
+          <w:color w:val="1F1F1F"/>
+        </w:rPr>
+        <w:t>Tbl_faktura</w:t>
+      </w:r>
+      <w:proofErr w:type="spellEnd"/>
+      <w:r>
+        <w:rPr>
+          <w:rFonts w:ascii="Google Sans" w:eastAsia="Google Sans" w:hAnsi="Google Sans" w:cs="Google Sans"/>
+          <w:color w:val="1F1F1F"/>
+        </w:rPr>
+        <w:t>.</w:t>
       </w:r>
     </w:p>
     <w:p>
@@ -2398,7 +3630,23 @@
           <w:rFonts w:ascii="Google Sans" w:eastAsia="Google Sans" w:hAnsi="Google Sans" w:cs="Google Sans"/>
           <w:color w:val="1F1F1F"/>
         </w:rPr>
-        <w:t>3.3 Popis kľúčových formulárov (Forms) a používateľského rozhrania</w:t>
+        <w:t>3.3 Popis kľúčových formulárov (</w:t>
+      </w:r>
+      <w:proofErr w:type="spellStart"/>
+      <w:r>
+        <w:rPr>
+          <w:rFonts w:ascii="Google Sans" w:eastAsia="Google Sans" w:hAnsi="Google Sans" w:cs="Google Sans"/>
+          <w:color w:val="1F1F1F"/>
+        </w:rPr>
+        <w:t>Forms</w:t>
+      </w:r>
+      <w:proofErr w:type="spellEnd"/>
+      <w:r>
+        <w:rPr>
+          <w:rFonts w:ascii="Google Sans" w:eastAsia="Google Sans" w:hAnsi="Google Sans" w:cs="Google Sans"/>
+          <w:color w:val="1F1F1F"/>
+        </w:rPr>
+        <w:t>) a používateľského rozhrania</w:t>
       </w:r>
     </w:p>
     <w:p>
@@ -2448,7 +3696,47 @@
           <w:bCs/>
           <w:color w:val="1F1F1F"/>
         </w:rPr>
-        <w:t>1. frm_Smartbalance-Hlavné_menu (Dashboard)</w:t>
+        <w:t xml:space="preserve">1. </w:t>
+      </w:r>
+      <w:proofErr w:type="spellStart"/>
+      <w:r>
+        <w:rPr>
+          <w:rFonts w:ascii="Google Sans" w:eastAsia="Google Sans" w:hAnsi="Google Sans" w:cs="Google Sans"/>
+          <w:b/>
+          <w:bCs/>
+          <w:color w:val="1F1F1F"/>
+        </w:rPr>
+        <w:t>frm_Smartbalance-Hlavné_menu</w:t>
+      </w:r>
+      <w:proofErr w:type="spellEnd"/>
+      <w:r>
+        <w:rPr>
+          <w:rFonts w:ascii="Google Sans" w:eastAsia="Google Sans" w:hAnsi="Google Sans" w:cs="Google Sans"/>
+          <w:b/>
+          <w:bCs/>
+          <w:color w:val="1F1F1F"/>
+        </w:rPr>
+        <w:t xml:space="preserve"> (</w:t>
+      </w:r>
+      <w:proofErr w:type="spellStart"/>
+      <w:r>
+        <w:rPr>
+          <w:rFonts w:ascii="Google Sans" w:eastAsia="Google Sans" w:hAnsi="Google Sans" w:cs="Google Sans"/>
+          <w:b/>
+          <w:bCs/>
+          <w:color w:val="1F1F1F"/>
+        </w:rPr>
+        <w:t>Dashboard</w:t>
+      </w:r>
+      <w:proofErr w:type="spellEnd"/>
+      <w:r>
+        <w:rPr>
+          <w:rFonts w:ascii="Google Sans" w:eastAsia="Google Sans" w:hAnsi="Google Sans" w:cs="Google Sans"/>
+          <w:b/>
+          <w:bCs/>
+          <w:color w:val="1F1F1F"/>
+        </w:rPr>
+        <w:t>)</w:t>
       </w:r>
     </w:p>
     <w:p>
@@ -2472,7 +3760,23 @@
           <w:color w:val="1F1F1F"/>
         </w:rPr>
         <w:lastRenderedPageBreak/>
-        <w:t>Hlavný úvodný formulár aplikácie. Slúži ako centrálny riadiaci panel (Dashboard), ktorý sa otvorí ihneď po štarte databázy. Sústreďuje ovládanie celého systému do niekoľkých veľkých tlačidiel (Spustenie automatického párovania, Nahrávanie výpisov, Exporty do Excelu). Pre používateľa predstavuje bezpečné a intuitívne prostredie bez nutnosti hľadať objekty v bočnom paneli Accessu.</w:t>
+        <w:t>Hlavný úvodný formulár aplikácie. Slúži ako centrálny riadiaci panel (</w:t>
+      </w:r>
+      <w:proofErr w:type="spellStart"/>
+      <w:r>
+        <w:rPr>
+          <w:rFonts w:ascii="Google Sans" w:eastAsia="Google Sans" w:hAnsi="Google Sans" w:cs="Google Sans"/>
+          <w:color w:val="1F1F1F"/>
+        </w:rPr>
+        <w:t>Dashboard</w:t>
+      </w:r>
+      <w:proofErr w:type="spellEnd"/>
+      <w:r>
+        <w:rPr>
+          <w:rFonts w:ascii="Google Sans" w:eastAsia="Google Sans" w:hAnsi="Google Sans" w:cs="Google Sans"/>
+          <w:color w:val="1F1F1F"/>
+        </w:rPr>
+        <w:t>), ktorý sa otvorí ihneď po štarte databázy. Sústreďuje ovládanie celého systému do niekoľkých veľkých tlačidiel (Spustenie automatického párovania, Nahrávanie výpisov, Exporty do Excelu). Pre používateľa predstavuje bezpečné a intuitívne prostredie bez nutnosti hľadať objekty v bočnom paneli Accessu.</w:t>
       </w:r>
     </w:p>
     <w:p>
@@ -2495,12 +3799,37 @@
           <w:color w:val="1F1F1F"/>
         </w:rPr>
       </w:pPr>
-      <w:r>
-        <w:rPr>
-          <w:rFonts w:ascii="Google Sans" w:eastAsia="Google Sans" w:hAnsi="Google Sans" w:cs="Google Sans"/>
-          <w:color w:val="1F1F1F"/>
-        </w:rPr>
-        <w:t>Hard Reset modul: Do tohto formulára sme implementovali špeciálne administrátorské tlačidlo pre vývojárov a testerov. Po sérii bezpečnostných výziev (MsgBox) dokáže na jedno kliknutie vymazať všetky platby, resetovať stiahnuté kurzy z NBS a pripraviť úplne čisté prostredie pre nové kolo testovania.</w:t>
+      <w:proofErr w:type="spellStart"/>
+      <w:r>
+        <w:rPr>
+          <w:rFonts w:ascii="Google Sans" w:eastAsia="Google Sans" w:hAnsi="Google Sans" w:cs="Google Sans"/>
+          <w:color w:val="1F1F1F"/>
+        </w:rPr>
+        <w:t>Hard</w:t>
+      </w:r>
+      <w:proofErr w:type="spellEnd"/>
+      <w:r>
+        <w:rPr>
+          <w:rFonts w:ascii="Google Sans" w:eastAsia="Google Sans" w:hAnsi="Google Sans" w:cs="Google Sans"/>
+          <w:color w:val="1F1F1F"/>
+        </w:rPr>
+        <w:t xml:space="preserve"> Reset modul: Do tohto formulára sme implementovali špeciálne administrátorské tlačidlo pre vývojárov a testerov. Po sérii bezpečnostných výziev (</w:t>
+      </w:r>
+      <w:proofErr w:type="spellStart"/>
+      <w:r>
+        <w:rPr>
+          <w:rFonts w:ascii="Google Sans" w:eastAsia="Google Sans" w:hAnsi="Google Sans" w:cs="Google Sans"/>
+          <w:color w:val="1F1F1F"/>
+        </w:rPr>
+        <w:t>MsgBox</w:t>
+      </w:r>
+      <w:proofErr w:type="spellEnd"/>
+      <w:r>
+        <w:rPr>
+          <w:rFonts w:ascii="Google Sans" w:eastAsia="Google Sans" w:hAnsi="Google Sans" w:cs="Google Sans"/>
+          <w:color w:val="1F1F1F"/>
+        </w:rPr>
+        <w:t>) dokáže na jedno kliknutie vymazať všetky platby, resetovať stiahnuté kurzy z NBS a pripraviť úplne čisté prostredie pre nové kolo testovania.</w:t>
       </w:r>
     </w:p>
     <w:p>
@@ -2527,8 +3856,39 @@
           <w:bCs/>
           <w:color w:val="1F1F1F"/>
         </w:rPr>
-        <w:t>2. Frm_ImportPlatieb a subfrm_Platby</w:t>
-      </w:r>
+        <w:t xml:space="preserve">2. </w:t>
+      </w:r>
+      <w:proofErr w:type="spellStart"/>
+      <w:r>
+        <w:rPr>
+          <w:rFonts w:ascii="Google Sans" w:eastAsia="Google Sans" w:hAnsi="Google Sans" w:cs="Google Sans"/>
+          <w:b/>
+          <w:bCs/>
+          <w:color w:val="1F1F1F"/>
+        </w:rPr>
+        <w:t>Frm_ImportPlatieb</w:t>
+      </w:r>
+      <w:proofErr w:type="spellEnd"/>
+      <w:r>
+        <w:rPr>
+          <w:rFonts w:ascii="Google Sans" w:eastAsia="Google Sans" w:hAnsi="Google Sans" w:cs="Google Sans"/>
+          <w:b/>
+          <w:bCs/>
+          <w:color w:val="1F1F1F"/>
+        </w:rPr>
+        <w:t xml:space="preserve"> a </w:t>
+      </w:r>
+      <w:proofErr w:type="spellStart"/>
+      <w:r>
+        <w:rPr>
+          <w:rFonts w:ascii="Google Sans" w:eastAsia="Google Sans" w:hAnsi="Google Sans" w:cs="Google Sans"/>
+          <w:b/>
+          <w:bCs/>
+          <w:color w:val="1F1F1F"/>
+        </w:rPr>
+        <w:t>subfrm_Platby</w:t>
+      </w:r>
+      <w:proofErr w:type="spellEnd"/>
     </w:p>
     <w:p>
       <w:pPr>
@@ -2545,12 +3905,21 @@
           <w:color w:val="1F1F1F"/>
         </w:rPr>
       </w:pPr>
-      <w:r>
-        <w:rPr>
-          <w:rFonts w:ascii="Google Sans" w:eastAsia="Google Sans" w:hAnsi="Google Sans" w:cs="Google Sans"/>
-          <w:color w:val="1F1F1F"/>
-        </w:rPr>
-        <w:t>Sada formulárov určená pre vstup dát. Používateľ cez tento formulár vizuálne vyberá CSV súbor z disku počítača. Formulár po odovzdaní cesty k súboru automaticky spustí importný VBA skript.</w:t>
+      <w:proofErr w:type="spellStart"/>
+      <w:r>
+        <w:rPr>
+          <w:rFonts w:ascii="Google Sans" w:eastAsia="Google Sans" w:hAnsi="Google Sans" w:cs="Google Sans"/>
+          <w:color w:val="1F1F1F"/>
+        </w:rPr>
+        <w:t>Sada</w:t>
+      </w:r>
+      <w:proofErr w:type="spellEnd"/>
+      <w:r>
+        <w:rPr>
+          <w:rFonts w:ascii="Google Sans" w:eastAsia="Google Sans" w:hAnsi="Google Sans" w:cs="Google Sans"/>
+          <w:color w:val="1F1F1F"/>
+        </w:rPr>
+        <w:t xml:space="preserve"> formulárov určená pre vstup dát. Používateľ cez tento formulár vizuálne vyberá CSV súbor z disku počítača. Formulár po odovzdaní cesty k súboru automaticky spustí importný VBA skript.</w:t>
       </w:r>
     </w:p>
     <w:p>
@@ -2568,14 +3937,45 @@
         </w:pBdr>
         <w:spacing w:after="120" w:line="275" w:lineRule="auto"/>
       </w:pPr>
-      <w:r>
-        <w:rPr>
-          <w:rFonts w:ascii="Google Sans" w:eastAsia="Google Sans" w:hAnsi="Google Sans" w:cs="Google Sans"/>
-          <w:b/>
-          <w:bCs/>
-          <w:color w:val="1F1F1F"/>
-        </w:rPr>
-        <w:t>subfrm_Platby (Podformulár):</w:t>
+      <w:proofErr w:type="spellStart"/>
+      <w:r>
+        <w:rPr>
+          <w:rFonts w:ascii="Google Sans" w:eastAsia="Google Sans" w:hAnsi="Google Sans" w:cs="Google Sans"/>
+          <w:b/>
+          <w:bCs/>
+          <w:color w:val="1F1F1F"/>
+        </w:rPr>
+        <w:t>subfrm_Platby</w:t>
+      </w:r>
+      <w:proofErr w:type="spellEnd"/>
+      <w:r>
+        <w:rPr>
+          <w:rFonts w:ascii="Google Sans" w:eastAsia="Google Sans" w:hAnsi="Google Sans" w:cs="Google Sans"/>
+          <w:b/>
+          <w:bCs/>
+          <w:color w:val="1F1F1F"/>
+        </w:rPr>
+        <w:t xml:space="preserve"> (</w:t>
+      </w:r>
+      <w:proofErr w:type="spellStart"/>
+      <w:r>
+        <w:rPr>
+          <w:rFonts w:ascii="Google Sans" w:eastAsia="Google Sans" w:hAnsi="Google Sans" w:cs="Google Sans"/>
+          <w:b/>
+          <w:bCs/>
+          <w:color w:val="1F1F1F"/>
+        </w:rPr>
+        <w:t>Podformulár</w:t>
+      </w:r>
+      <w:proofErr w:type="spellEnd"/>
+      <w:r>
+        <w:rPr>
+          <w:rFonts w:ascii="Google Sans" w:eastAsia="Google Sans" w:hAnsi="Google Sans" w:cs="Google Sans"/>
+          <w:b/>
+          <w:bCs/>
+          <w:color w:val="1F1F1F"/>
+        </w:rPr>
+        <w:t>):</w:t>
       </w:r>
       <w:r>
         <w:rPr>
@@ -2609,8 +4009,19 @@
           <w:bCs/>
           <w:color w:val="1F1F1F"/>
         </w:rPr>
-        <w:t>3. Frm_Manualne_Parovanie</w:t>
-      </w:r>
+        <w:t xml:space="preserve">3. </w:t>
+      </w:r>
+      <w:proofErr w:type="spellStart"/>
+      <w:r>
+        <w:rPr>
+          <w:rFonts w:ascii="Google Sans" w:eastAsia="Google Sans" w:hAnsi="Google Sans" w:cs="Google Sans"/>
+          <w:b/>
+          <w:bCs/>
+          <w:color w:val="1F1F1F"/>
+        </w:rPr>
+        <w:t>Frm_Manualne_Parovanie</w:t>
+      </w:r>
+      <w:proofErr w:type="spellEnd"/>
     </w:p>
     <w:p>
       <w:pPr>
@@ -2632,7 +4043,87 @@
           <w:rFonts w:ascii="Google Sans" w:eastAsia="Google Sans" w:hAnsi="Google Sans" w:cs="Google Sans"/>
           <w:color w:val="1F1F1F"/>
         </w:rPr>
-        <w:t>Operačný formulár na riešenie výnimiek (Exception Handling). Obsahuje zoznam výlučne tých platieb, na ktorých zlyhala automatika (napr. kvôli hrubým preklepom vo VS). Pre priradenie správnej faktúry formulár využíva inteligentný rozbaľovací zoznam (Combo Box) napojený na dotaz qry_Faktury_Na_Vyber, ktorý ponúka len nezaplatené faktúry a radí ich logicky podľa sumy zostatku. Súčasťou je aj bezpečnostná kontrola v podobe potvrdzovacieho dialógového okna pred samotným uložením spárovania.</w:t>
+        <w:t>Operačný formulár na riešenie výnimiek (</w:t>
+      </w:r>
+      <w:proofErr w:type="spellStart"/>
+      <w:r>
+        <w:rPr>
+          <w:rFonts w:ascii="Google Sans" w:eastAsia="Google Sans" w:hAnsi="Google Sans" w:cs="Google Sans"/>
+          <w:color w:val="1F1F1F"/>
+        </w:rPr>
+        <w:t>Exception</w:t>
+      </w:r>
+      <w:proofErr w:type="spellEnd"/>
+      <w:r>
+        <w:rPr>
+          <w:rFonts w:ascii="Google Sans" w:eastAsia="Google Sans" w:hAnsi="Google Sans" w:cs="Google Sans"/>
+          <w:color w:val="1F1F1F"/>
+        </w:rPr>
+        <w:t xml:space="preserve"> </w:t>
+      </w:r>
+      <w:proofErr w:type="spellStart"/>
+      <w:r>
+        <w:rPr>
+          <w:rFonts w:ascii="Google Sans" w:eastAsia="Google Sans" w:hAnsi="Google Sans" w:cs="Google Sans"/>
+          <w:color w:val="1F1F1F"/>
+        </w:rPr>
+        <w:t>Handling</w:t>
+      </w:r>
+      <w:proofErr w:type="spellEnd"/>
+      <w:r>
+        <w:rPr>
+          <w:rFonts w:ascii="Google Sans" w:eastAsia="Google Sans" w:hAnsi="Google Sans" w:cs="Google Sans"/>
+          <w:color w:val="1F1F1F"/>
+        </w:rPr>
+        <w:t xml:space="preserve">). Obsahuje zoznam výlučne tých platieb, na ktorých zlyhala automatika (napr. kvôli hrubým preklepom vo VS). Pre priradenie správnej faktúry formulár využíva inteligentný </w:t>
+      </w:r>
+      <w:proofErr w:type="spellStart"/>
+      <w:r>
+        <w:rPr>
+          <w:rFonts w:ascii="Google Sans" w:eastAsia="Google Sans" w:hAnsi="Google Sans" w:cs="Google Sans"/>
+          <w:color w:val="1F1F1F"/>
+        </w:rPr>
+        <w:t>rozbaľovací</w:t>
+      </w:r>
+      <w:proofErr w:type="spellEnd"/>
+      <w:r>
+        <w:rPr>
+          <w:rFonts w:ascii="Google Sans" w:eastAsia="Google Sans" w:hAnsi="Google Sans" w:cs="Google Sans"/>
+          <w:color w:val="1F1F1F"/>
+        </w:rPr>
+        <w:t xml:space="preserve"> zoznam (</w:t>
+      </w:r>
+      <w:proofErr w:type="spellStart"/>
+      <w:r>
+        <w:rPr>
+          <w:rFonts w:ascii="Google Sans" w:eastAsia="Google Sans" w:hAnsi="Google Sans" w:cs="Google Sans"/>
+          <w:color w:val="1F1F1F"/>
+        </w:rPr>
+        <w:t>Combo</w:t>
+      </w:r>
+      <w:proofErr w:type="spellEnd"/>
+      <w:r>
+        <w:rPr>
+          <w:rFonts w:ascii="Google Sans" w:eastAsia="Google Sans" w:hAnsi="Google Sans" w:cs="Google Sans"/>
+          <w:color w:val="1F1F1F"/>
+        </w:rPr>
+        <w:t xml:space="preserve"> Box) napojený na dotaz </w:t>
+      </w:r>
+      <w:proofErr w:type="spellStart"/>
+      <w:r>
+        <w:rPr>
+          <w:rFonts w:ascii="Google Sans" w:eastAsia="Google Sans" w:hAnsi="Google Sans" w:cs="Google Sans"/>
+          <w:color w:val="1F1F1F"/>
+        </w:rPr>
+        <w:t>qry_Faktury_Na_Vyber</w:t>
+      </w:r>
+      <w:proofErr w:type="spellEnd"/>
+      <w:r>
+        <w:rPr>
+          <w:rFonts w:ascii="Google Sans" w:eastAsia="Google Sans" w:hAnsi="Google Sans" w:cs="Google Sans"/>
+          <w:color w:val="1F1F1F"/>
+        </w:rPr>
+        <w:t>, ktorý ponúka len nezaplatené faktúry a radí ich logicky podľa sumy zostatku. Súčasťou je aj bezpečnostná kontrola v podobe potvrdzovacieho dialógového okna pred samotným uložením spárovania.</w:t>
       </w:r>
     </w:p>
     <w:p>
@@ -2739,8 +4230,39 @@
           <w:bCs/>
           <w:color w:val="1F1F1F"/>
         </w:rPr>
-        <w:t>4. Frm_ImportNBS a subfrm_Kurzy</w:t>
-      </w:r>
+        <w:t xml:space="preserve">4. </w:t>
+      </w:r>
+      <w:proofErr w:type="spellStart"/>
+      <w:r>
+        <w:rPr>
+          <w:rFonts w:ascii="Google Sans" w:eastAsia="Google Sans" w:hAnsi="Google Sans" w:cs="Google Sans"/>
+          <w:b/>
+          <w:bCs/>
+          <w:color w:val="1F1F1F"/>
+        </w:rPr>
+        <w:t>Frm_ImportNBS</w:t>
+      </w:r>
+      <w:proofErr w:type="spellEnd"/>
+      <w:r>
+        <w:rPr>
+          <w:rFonts w:ascii="Google Sans" w:eastAsia="Google Sans" w:hAnsi="Google Sans" w:cs="Google Sans"/>
+          <w:b/>
+          <w:bCs/>
+          <w:color w:val="1F1F1F"/>
+        </w:rPr>
+        <w:t xml:space="preserve"> a </w:t>
+      </w:r>
+      <w:proofErr w:type="spellStart"/>
+      <w:r>
+        <w:rPr>
+          <w:rFonts w:ascii="Google Sans" w:eastAsia="Google Sans" w:hAnsi="Google Sans" w:cs="Google Sans"/>
+          <w:b/>
+          <w:bCs/>
+          <w:color w:val="1F1F1F"/>
+        </w:rPr>
+        <w:t>subfrm_Kurzy</w:t>
+      </w:r>
+      <w:proofErr w:type="spellEnd"/>
     </w:p>
     <w:p>
       <w:pPr>
@@ -2780,14 +4302,45 @@
         </w:pBdr>
         <w:spacing w:after="120" w:line="275" w:lineRule="auto"/>
       </w:pPr>
-      <w:r>
-        <w:rPr>
-          <w:rFonts w:ascii="Google Sans" w:eastAsia="Google Sans" w:hAnsi="Google Sans" w:cs="Google Sans"/>
-          <w:b/>
-          <w:bCs/>
-          <w:color w:val="1F1F1F"/>
-        </w:rPr>
-        <w:t>subfrm_Kurzy (Podformulár):</w:t>
+      <w:proofErr w:type="spellStart"/>
+      <w:r>
+        <w:rPr>
+          <w:rFonts w:ascii="Google Sans" w:eastAsia="Google Sans" w:hAnsi="Google Sans" w:cs="Google Sans"/>
+          <w:b/>
+          <w:bCs/>
+          <w:color w:val="1F1F1F"/>
+        </w:rPr>
+        <w:t>subfrm_Kurzy</w:t>
+      </w:r>
+      <w:proofErr w:type="spellEnd"/>
+      <w:r>
+        <w:rPr>
+          <w:rFonts w:ascii="Google Sans" w:eastAsia="Google Sans" w:hAnsi="Google Sans" w:cs="Google Sans"/>
+          <w:b/>
+          <w:bCs/>
+          <w:color w:val="1F1F1F"/>
+        </w:rPr>
+        <w:t xml:space="preserve"> (</w:t>
+      </w:r>
+      <w:proofErr w:type="spellStart"/>
+      <w:r>
+        <w:rPr>
+          <w:rFonts w:ascii="Google Sans" w:eastAsia="Google Sans" w:hAnsi="Google Sans" w:cs="Google Sans"/>
+          <w:b/>
+          <w:bCs/>
+          <w:color w:val="1F1F1F"/>
+        </w:rPr>
+        <w:t>Podformulár</w:t>
+      </w:r>
+      <w:proofErr w:type="spellEnd"/>
+      <w:r>
+        <w:rPr>
+          <w:rFonts w:ascii="Google Sans" w:eastAsia="Google Sans" w:hAnsi="Google Sans" w:cs="Google Sans"/>
+          <w:b/>
+          <w:bCs/>
+          <w:color w:val="1F1F1F"/>
+        </w:rPr>
+        <w:t>):</w:t>
       </w:r>
       <w:r>
         <w:rPr>
@@ -2853,12 +4406,21 @@
         </w:pBdr>
         <w:spacing w:line="275" w:lineRule="auto"/>
       </w:pPr>
-      <w:r>
-        <w:rPr>
-          <w:rFonts w:ascii="Google Sans" w:eastAsia="Google Sans" w:hAnsi="Google Sans" w:cs="Google Sans"/>
-          <w:color w:val="1F1F1F"/>
-        </w:rPr>
-        <w:t xml:space="preserve">Tbl_partner </w:t>
+      <w:proofErr w:type="spellStart"/>
+      <w:r>
+        <w:rPr>
+          <w:rFonts w:ascii="Google Sans" w:eastAsia="Google Sans" w:hAnsi="Google Sans" w:cs="Google Sans"/>
+          <w:color w:val="1F1F1F"/>
+        </w:rPr>
+        <w:t>Tbl_partner</w:t>
+      </w:r>
+      <w:proofErr w:type="spellEnd"/>
+      <w:r>
+        <w:rPr>
+          <w:rFonts w:ascii="Google Sans" w:eastAsia="Google Sans" w:hAnsi="Google Sans" w:cs="Google Sans"/>
+          <w:color w:val="1F1F1F"/>
+        </w:rPr>
+        <w:t xml:space="preserve"> </w:t>
       </w:r>
       <w:r>
         <w:rPr>
@@ -2874,7 +4436,23 @@
           <w:rFonts w:ascii="Google Sans" w:eastAsia="Google Sans" w:hAnsi="Google Sans" w:cs="Google Sans"/>
           <w:color w:val="1F1F1F"/>
         </w:rPr>
-        <w:t xml:space="preserve"> Tbl_faktura: Jeden partner môže mať u nás viacero faktúr. Relácia nám zaručuje, že nevystavíme faktúru na neexistujúceho partnera.</w:t>
+        <w:t xml:space="preserve"> </w:t>
+      </w:r>
+      <w:proofErr w:type="spellStart"/>
+      <w:r>
+        <w:rPr>
+          <w:rFonts w:ascii="Google Sans" w:eastAsia="Google Sans" w:hAnsi="Google Sans" w:cs="Google Sans"/>
+          <w:color w:val="1F1F1F"/>
+        </w:rPr>
+        <w:t>Tbl_faktura</w:t>
+      </w:r>
+      <w:proofErr w:type="spellEnd"/>
+      <w:r>
+        <w:rPr>
+          <w:rFonts w:ascii="Google Sans" w:eastAsia="Google Sans" w:hAnsi="Google Sans" w:cs="Google Sans"/>
+          <w:color w:val="1F1F1F"/>
+        </w:rPr>
+        <w:t>: Jeden partner môže mať u nás viacero faktúr. Relácia nám zaručuje, že nevystavíme faktúru na neexistujúceho partnera.</w:t>
       </w:r>
     </w:p>
     <w:p>
@@ -2892,12 +4470,21 @@
         </w:pBdr>
         <w:spacing w:line="275" w:lineRule="auto"/>
       </w:pPr>
-      <w:r>
-        <w:rPr>
-          <w:rFonts w:ascii="Google Sans" w:eastAsia="Google Sans" w:hAnsi="Google Sans" w:cs="Google Sans"/>
-          <w:color w:val="1F1F1F"/>
-        </w:rPr>
-        <w:t xml:space="preserve">Tbl_faktura </w:t>
+      <w:proofErr w:type="spellStart"/>
+      <w:r>
+        <w:rPr>
+          <w:rFonts w:ascii="Google Sans" w:eastAsia="Google Sans" w:hAnsi="Google Sans" w:cs="Google Sans"/>
+          <w:color w:val="1F1F1F"/>
+        </w:rPr>
+        <w:t>Tbl_faktura</w:t>
+      </w:r>
+      <w:proofErr w:type="spellEnd"/>
+      <w:r>
+        <w:rPr>
+          <w:rFonts w:ascii="Google Sans" w:eastAsia="Google Sans" w:hAnsi="Google Sans" w:cs="Google Sans"/>
+          <w:color w:val="1F1F1F"/>
+        </w:rPr>
+        <w:t xml:space="preserve"> </w:t>
       </w:r>
       <w:r>
         <w:rPr>
@@ -2913,7 +4500,55 @@
           <w:rFonts w:ascii="Google Sans" w:eastAsia="Google Sans" w:hAnsi="Google Sans" w:cs="Google Sans"/>
           <w:color w:val="1F1F1F"/>
         </w:rPr>
-        <w:t xml:space="preserve"> tbl_platba: Toto prepojenie (ID_faktura -&gt; FK_faktura) je absolútne kľúčové. Vzťah </w:t>
+        <w:t xml:space="preserve"> </w:t>
+      </w:r>
+      <w:proofErr w:type="spellStart"/>
+      <w:r>
+        <w:rPr>
+          <w:rFonts w:ascii="Google Sans" w:eastAsia="Google Sans" w:hAnsi="Google Sans" w:cs="Google Sans"/>
+          <w:color w:val="1F1F1F"/>
+        </w:rPr>
+        <w:t>tbl_platba</w:t>
+      </w:r>
+      <w:proofErr w:type="spellEnd"/>
+      <w:r>
+        <w:rPr>
+          <w:rFonts w:ascii="Google Sans" w:eastAsia="Google Sans" w:hAnsi="Google Sans" w:cs="Google Sans"/>
+          <w:color w:val="1F1F1F"/>
+        </w:rPr>
+        <w:t>: Toto prepojenie (</w:t>
+      </w:r>
+      <w:proofErr w:type="spellStart"/>
+      <w:r>
+        <w:rPr>
+          <w:rFonts w:ascii="Google Sans" w:eastAsia="Google Sans" w:hAnsi="Google Sans" w:cs="Google Sans"/>
+          <w:color w:val="1F1F1F"/>
+        </w:rPr>
+        <w:t>ID_faktura</w:t>
+      </w:r>
+      <w:proofErr w:type="spellEnd"/>
+      <w:r>
+        <w:rPr>
+          <w:rFonts w:ascii="Google Sans" w:eastAsia="Google Sans" w:hAnsi="Google Sans" w:cs="Google Sans"/>
+          <w:color w:val="1F1F1F"/>
+        </w:rPr>
+        <w:t xml:space="preserve"> -&gt; </w:t>
+      </w:r>
+      <w:proofErr w:type="spellStart"/>
+      <w:r>
+        <w:rPr>
+          <w:rFonts w:ascii="Google Sans" w:eastAsia="Google Sans" w:hAnsi="Google Sans" w:cs="Google Sans"/>
+          <w:color w:val="1F1F1F"/>
+        </w:rPr>
+        <w:t>FK_faktura</w:t>
+      </w:r>
+      <w:proofErr w:type="spellEnd"/>
+      <w:r>
+        <w:rPr>
+          <w:rFonts w:ascii="Google Sans" w:eastAsia="Google Sans" w:hAnsi="Google Sans" w:cs="Google Sans"/>
+          <w:color w:val="1F1F1F"/>
+        </w:rPr>
+        <w:t xml:space="preserve">) je absolútne kľúčové. Vzťah </w:t>
       </w:r>
       <w:r>
         <w:rPr>
@@ -2947,14 +4582,25 @@
         </w:pBdr>
         <w:spacing w:after="120" w:line="275" w:lineRule="auto"/>
       </w:pPr>
-      <w:r>
-        <w:rPr>
-          <w:rFonts w:ascii="Google Sans" w:eastAsia="Google Sans" w:hAnsi="Google Sans" w:cs="Google Sans"/>
-          <w:b/>
-          <w:bCs/>
-          <w:color w:val="1F1F1F"/>
-        </w:rPr>
-        <w:t>Tbl_kurzy_nbs (Zámerne bez relácie):</w:t>
+      <w:proofErr w:type="spellStart"/>
+      <w:r>
+        <w:rPr>
+          <w:rFonts w:ascii="Google Sans" w:eastAsia="Google Sans" w:hAnsi="Google Sans" w:cs="Google Sans"/>
+          <w:b/>
+          <w:bCs/>
+          <w:color w:val="1F1F1F"/>
+        </w:rPr>
+        <w:t>Tbl_kurzy_nbs</w:t>
+      </w:r>
+      <w:proofErr w:type="spellEnd"/>
+      <w:r>
+        <w:rPr>
+          <w:rFonts w:ascii="Google Sans" w:eastAsia="Google Sans" w:hAnsi="Google Sans" w:cs="Google Sans"/>
+          <w:b/>
+          <w:bCs/>
+          <w:color w:val="1F1F1F"/>
+        </w:rPr>
+        <w:t xml:space="preserve"> (Zámerne bez relácie):</w:t>
       </w:r>
       <w:r>
         <w:rPr>
@@ -3023,7 +4669,71 @@
           <w:rFonts w:ascii="Google Sans" w:eastAsia="Google Sans" w:hAnsi="Google Sans" w:cs="Google Sans"/>
           <w:color w:val="1F1F1F"/>
         </w:rPr>
-        <w:t>Aby formuláre a integrácie s vonkajším svetom fungovali plynulo, databáza obsahuje niekoľko kľúčových modulov napísaných v jazyku Visual Basic for Applications (VBA):</w:t>
+        <w:t xml:space="preserve">Aby formuláre a integrácie s vonkajším svetom fungovali plynulo, databáza obsahuje niekoľko kľúčových modulov napísaných v jazyku </w:t>
+      </w:r>
+      <w:proofErr w:type="spellStart"/>
+      <w:r>
+        <w:rPr>
+          <w:rFonts w:ascii="Google Sans" w:eastAsia="Google Sans" w:hAnsi="Google Sans" w:cs="Google Sans"/>
+          <w:color w:val="1F1F1F"/>
+        </w:rPr>
+        <w:t>Visual</w:t>
+      </w:r>
+      <w:proofErr w:type="spellEnd"/>
+      <w:r>
+        <w:rPr>
+          <w:rFonts w:ascii="Google Sans" w:eastAsia="Google Sans" w:hAnsi="Google Sans" w:cs="Google Sans"/>
+          <w:color w:val="1F1F1F"/>
+        </w:rPr>
+        <w:t xml:space="preserve"> </w:t>
+      </w:r>
+      <w:proofErr w:type="spellStart"/>
+      <w:r>
+        <w:rPr>
+          <w:rFonts w:ascii="Google Sans" w:eastAsia="Google Sans" w:hAnsi="Google Sans" w:cs="Google Sans"/>
+          <w:color w:val="1F1F1F"/>
+        </w:rPr>
+        <w:t>Basic</w:t>
+      </w:r>
+      <w:proofErr w:type="spellEnd"/>
+      <w:r>
+        <w:rPr>
+          <w:rFonts w:ascii="Google Sans" w:eastAsia="Google Sans" w:hAnsi="Google Sans" w:cs="Google Sans"/>
+          <w:color w:val="1F1F1F"/>
+        </w:rPr>
+        <w:t xml:space="preserve"> </w:t>
+      </w:r>
+      <w:proofErr w:type="spellStart"/>
+      <w:r>
+        <w:rPr>
+          <w:rFonts w:ascii="Google Sans" w:eastAsia="Google Sans" w:hAnsi="Google Sans" w:cs="Google Sans"/>
+          <w:color w:val="1F1F1F"/>
+        </w:rPr>
+        <w:t>for</w:t>
+      </w:r>
+      <w:proofErr w:type="spellEnd"/>
+      <w:r>
+        <w:rPr>
+          <w:rFonts w:ascii="Google Sans" w:eastAsia="Google Sans" w:hAnsi="Google Sans" w:cs="Google Sans"/>
+          <w:color w:val="1F1F1F"/>
+        </w:rPr>
+        <w:t xml:space="preserve"> </w:t>
+      </w:r>
+      <w:proofErr w:type="spellStart"/>
+      <w:r>
+        <w:rPr>
+          <w:rFonts w:ascii="Google Sans" w:eastAsia="Google Sans" w:hAnsi="Google Sans" w:cs="Google Sans"/>
+          <w:color w:val="1F1F1F"/>
+        </w:rPr>
+        <w:t>Applications</w:t>
+      </w:r>
+      <w:proofErr w:type="spellEnd"/>
+      <w:r>
+        <w:rPr>
+          <w:rFonts w:ascii="Google Sans" w:eastAsia="Google Sans" w:hAnsi="Google Sans" w:cs="Google Sans"/>
+          <w:color w:val="1F1F1F"/>
+        </w:rPr>
+        <w:t xml:space="preserve"> (VBA):</w:t>
       </w:r>
     </w:p>
     <w:p>
@@ -3080,14 +4790,66 @@
           <w:bCs/>
           <w:color w:val="1F1F1F"/>
         </w:rPr>
-        <w:t>FX Automator:</w:t>
-      </w:r>
-      <w:r>
-        <w:rPr>
-          <w:rFonts w:ascii="Google Sans" w:eastAsia="Google Sans" w:hAnsi="Google Sans" w:cs="Google Sans"/>
-          <w:color w:val="1F1F1F"/>
-        </w:rPr>
-        <w:t xml:space="preserve"> Komunikuje s externým serverom. Prostredníctvom HTTP GET requestov sťahuje XML odpovede z API Národnej banky Slovenska, parsuje z nich meny a kurzy, a ukladá ich do našich tabuliek.</w:t>
+        <w:t xml:space="preserve">FX </w:t>
+      </w:r>
+      <w:proofErr w:type="spellStart"/>
+      <w:r>
+        <w:rPr>
+          <w:rFonts w:ascii="Google Sans" w:eastAsia="Google Sans" w:hAnsi="Google Sans" w:cs="Google Sans"/>
+          <w:b/>
+          <w:bCs/>
+          <w:color w:val="1F1F1F"/>
+        </w:rPr>
+        <w:t>Automator</w:t>
+      </w:r>
+      <w:proofErr w:type="spellEnd"/>
+      <w:r>
+        <w:rPr>
+          <w:rFonts w:ascii="Google Sans" w:eastAsia="Google Sans" w:hAnsi="Google Sans" w:cs="Google Sans"/>
+          <w:b/>
+          <w:bCs/>
+          <w:color w:val="1F1F1F"/>
+        </w:rPr>
+        <w:t>:</w:t>
+      </w:r>
+      <w:r>
+        <w:rPr>
+          <w:rFonts w:ascii="Google Sans" w:eastAsia="Google Sans" w:hAnsi="Google Sans" w:cs="Google Sans"/>
+          <w:color w:val="1F1F1F"/>
+        </w:rPr>
+        <w:t xml:space="preserve"> Komunikuje s externým serverom. Prostredníctvom HTTP GET </w:t>
+      </w:r>
+      <w:proofErr w:type="spellStart"/>
+      <w:r>
+        <w:rPr>
+          <w:rFonts w:ascii="Google Sans" w:eastAsia="Google Sans" w:hAnsi="Google Sans" w:cs="Google Sans"/>
+          <w:color w:val="1F1F1F"/>
+        </w:rPr>
+        <w:t>requestov</w:t>
+      </w:r>
+      <w:proofErr w:type="spellEnd"/>
+      <w:r>
+        <w:rPr>
+          <w:rFonts w:ascii="Google Sans" w:eastAsia="Google Sans" w:hAnsi="Google Sans" w:cs="Google Sans"/>
+          <w:color w:val="1F1F1F"/>
+        </w:rPr>
+        <w:t xml:space="preserve"> sťahuje XML odpovede z API Národnej banky Slovenska, </w:t>
+      </w:r>
+      <w:proofErr w:type="spellStart"/>
+      <w:r>
+        <w:rPr>
+          <w:rFonts w:ascii="Google Sans" w:eastAsia="Google Sans" w:hAnsi="Google Sans" w:cs="Google Sans"/>
+          <w:color w:val="1F1F1F"/>
+        </w:rPr>
+        <w:t>parsuje</w:t>
+      </w:r>
+      <w:proofErr w:type="spellEnd"/>
+      <w:r>
+        <w:rPr>
+          <w:rFonts w:ascii="Google Sans" w:eastAsia="Google Sans" w:hAnsi="Google Sans" w:cs="Google Sans"/>
+          <w:color w:val="1F1F1F"/>
+        </w:rPr>
+        <w:t xml:space="preserve"> z nich meny a kurzy, a ukladá ich do našich tabuliek.</w:t>
       </w:r>
     </w:p>
     <w:p>
@@ -3112,7 +4874,47 @@
           <w:bCs/>
           <w:color w:val="1F1F1F"/>
         </w:rPr>
-        <w:t>Generátor údajov (Data Generator):</w:t>
+        <w:t>Generátor údajov (</w:t>
+      </w:r>
+      <w:proofErr w:type="spellStart"/>
+      <w:r>
+        <w:rPr>
+          <w:rFonts w:ascii="Google Sans" w:eastAsia="Google Sans" w:hAnsi="Google Sans" w:cs="Google Sans"/>
+          <w:b/>
+          <w:bCs/>
+          <w:color w:val="1F1F1F"/>
+        </w:rPr>
+        <w:t>Data</w:t>
+      </w:r>
+      <w:proofErr w:type="spellEnd"/>
+      <w:r>
+        <w:rPr>
+          <w:rFonts w:ascii="Google Sans" w:eastAsia="Google Sans" w:hAnsi="Google Sans" w:cs="Google Sans"/>
+          <w:b/>
+          <w:bCs/>
+          <w:color w:val="1F1F1F"/>
+        </w:rPr>
+        <w:t xml:space="preserve"> </w:t>
+      </w:r>
+      <w:proofErr w:type="spellStart"/>
+      <w:r>
+        <w:rPr>
+          <w:rFonts w:ascii="Google Sans" w:eastAsia="Google Sans" w:hAnsi="Google Sans" w:cs="Google Sans"/>
+          <w:b/>
+          <w:bCs/>
+          <w:color w:val="1F1F1F"/>
+        </w:rPr>
+        <w:t>Generator</w:t>
+      </w:r>
+      <w:proofErr w:type="spellEnd"/>
+      <w:r>
+        <w:rPr>
+          <w:rFonts w:ascii="Google Sans" w:eastAsia="Google Sans" w:hAnsi="Google Sans" w:cs="Google Sans"/>
+          <w:b/>
+          <w:bCs/>
+          <w:color w:val="1F1F1F"/>
+        </w:rPr>
+        <w:t>):</w:t>
       </w:r>
       <w:r>
         <w:rPr>
@@ -3151,7 +4953,23 @@
           <w:rFonts w:ascii="Google Sans" w:eastAsia="Google Sans" w:hAnsi="Google Sans" w:cs="Google Sans"/>
           <w:color w:val="1F1F1F"/>
         </w:rPr>
-        <w:t xml:space="preserve"> Skripty naviazané na tlačidlá v Dashboarde, ktoré riadia spúšťanie dotazov, potláčanie varovných hlásení Accessu a bezpečný export do Excelu.</w:t>
+        <w:t xml:space="preserve"> Skripty naviazané na tlačidlá v </w:t>
+      </w:r>
+      <w:proofErr w:type="spellStart"/>
+      <w:r>
+        <w:rPr>
+          <w:rFonts w:ascii="Google Sans" w:eastAsia="Google Sans" w:hAnsi="Google Sans" w:cs="Google Sans"/>
+          <w:color w:val="1F1F1F"/>
+        </w:rPr>
+        <w:t>Dashboarde</w:t>
+      </w:r>
+      <w:proofErr w:type="spellEnd"/>
+      <w:r>
+        <w:rPr>
+          <w:rFonts w:ascii="Google Sans" w:eastAsia="Google Sans" w:hAnsi="Google Sans" w:cs="Google Sans"/>
+          <w:color w:val="1F1F1F"/>
+        </w:rPr>
+        <w:t>, ktoré riadia spúšťanie dotazov, potláčanie varovných hlásení Accessu a bezpečný export do Excelu.</w:t>
       </w:r>
     </w:p>
     <w:p>
@@ -3255,7 +5073,39 @@
           <w:rFonts w:ascii="Google Sans" w:eastAsia="Google Sans" w:hAnsi="Google Sans" w:cs="Google Sans"/>
           <w:color w:val="1F1F1F"/>
         </w:rPr>
-        <w:t xml:space="preserve"> K jednej faktúre prislúchali dve rôzne platby (s rôznymi dátumami). Náš algoritmus toto úspešne pokryl vďaka voľnejšej podmienke (suma_platby &lt;= suma_faktury).</w:t>
+        <w:t xml:space="preserve"> K jednej faktúre prislúchali dve rôzne platby (s rôznymi dátumami). Náš algoritmus toto úspešne pokryl vďaka voľnejšej podmienke (</w:t>
+      </w:r>
+      <w:proofErr w:type="spellStart"/>
+      <w:r>
+        <w:rPr>
+          <w:rFonts w:ascii="Google Sans" w:eastAsia="Google Sans" w:hAnsi="Google Sans" w:cs="Google Sans"/>
+          <w:color w:val="1F1F1F"/>
+        </w:rPr>
+        <w:t>suma_platby</w:t>
+      </w:r>
+      <w:proofErr w:type="spellEnd"/>
+      <w:r>
+        <w:rPr>
+          <w:rFonts w:ascii="Google Sans" w:eastAsia="Google Sans" w:hAnsi="Google Sans" w:cs="Google Sans"/>
+          <w:color w:val="1F1F1F"/>
+        </w:rPr>
+        <w:t xml:space="preserve"> &lt;= </w:t>
+      </w:r>
+      <w:proofErr w:type="spellStart"/>
+      <w:r>
+        <w:rPr>
+          <w:rFonts w:ascii="Google Sans" w:eastAsia="Google Sans" w:hAnsi="Google Sans" w:cs="Google Sans"/>
+          <w:color w:val="1F1F1F"/>
+        </w:rPr>
+        <w:t>suma_faktury</w:t>
+      </w:r>
+      <w:proofErr w:type="spellEnd"/>
+      <w:r>
+        <w:rPr>
+          <w:rFonts w:ascii="Google Sans" w:eastAsia="Google Sans" w:hAnsi="Google Sans" w:cs="Google Sans"/>
+          <w:color w:val="1F1F1F"/>
+        </w:rPr>
+        <w:t>).</w:t>
       </w:r>
     </w:p>
     <w:p>
@@ -3289,13 +5139,38 @@
         </w:rPr>
         <w:t xml:space="preserve"> Nasimulovali sme situáciu, kde klient zaplatil dvakrát s rovnakým VS. Vďaka </w:t>
       </w:r>
+      <w:proofErr w:type="spellStart"/>
       <w:r>
         <w:rPr>
           <w:rFonts w:ascii="Google Sans" w:eastAsia="Google Sans" w:hAnsi="Google Sans" w:cs="Google Sans"/>
           <w:color w:val="1F1F1F"/>
         </w:rPr>
         <w:lastRenderedPageBreak/>
-        <w:t>agregačnému filtru (HAVING Count(*) = 1) systém túto chybu zachytil a úmyselne nespároval, aby na to upozornil používateľa.</w:t>
+        <w:t>agregačnému</w:t>
+      </w:r>
+      <w:proofErr w:type="spellEnd"/>
+      <w:r>
+        <w:rPr>
+          <w:rFonts w:ascii="Google Sans" w:eastAsia="Google Sans" w:hAnsi="Google Sans" w:cs="Google Sans"/>
+          <w:color w:val="1F1F1F"/>
+        </w:rPr>
+        <w:t xml:space="preserve"> filtru (HAVING </w:t>
+      </w:r>
+      <w:proofErr w:type="spellStart"/>
+      <w:r>
+        <w:rPr>
+          <w:rFonts w:ascii="Google Sans" w:eastAsia="Google Sans" w:hAnsi="Google Sans" w:cs="Google Sans"/>
+          <w:color w:val="1F1F1F"/>
+        </w:rPr>
+        <w:t>Count</w:t>
+      </w:r>
+      <w:proofErr w:type="spellEnd"/>
+      <w:r>
+        <w:rPr>
+          <w:rFonts w:ascii="Google Sans" w:eastAsia="Google Sans" w:hAnsi="Google Sans" w:cs="Google Sans"/>
+          <w:color w:val="1F1F1F"/>
+        </w:rPr>
+        <w:t>(*) = 1) systém túto chybu zachytil a úmyselne nespároval, aby na to upozornil používateľa.</w:t>
       </w:r>
     </w:p>
     <w:p>
@@ -3367,7 +5242,39 @@
           <w:rFonts w:ascii="Google Sans" w:eastAsia="Google Sans" w:hAnsi="Google Sans" w:cs="Google Sans"/>
           <w:color w:val="1F1F1F"/>
         </w:rPr>
-        <w:t>Cieľom Access databázy nie je údaje v nej "uväzniť", ale odovzdať ich ďalej na vizualizáciu. Do hlavného menu (Dashboardu) sme preto zakomponovali dedikovanú sekciu na priamy export dotazov do formátu .xlsx.</w:t>
+        <w:t>Cieľom Access databázy nie je údaje v nej "uväzniť", ale odovzdať ich ďalej na vizualizáciu. Do hlavného menu (</w:t>
+      </w:r>
+      <w:proofErr w:type="spellStart"/>
+      <w:r>
+        <w:rPr>
+          <w:rFonts w:ascii="Google Sans" w:eastAsia="Google Sans" w:hAnsi="Google Sans" w:cs="Google Sans"/>
+          <w:color w:val="1F1F1F"/>
+        </w:rPr>
+        <w:t>Dashboardu</w:t>
+      </w:r>
+      <w:proofErr w:type="spellEnd"/>
+      <w:r>
+        <w:rPr>
+          <w:rFonts w:ascii="Google Sans" w:eastAsia="Google Sans" w:hAnsi="Google Sans" w:cs="Google Sans"/>
+          <w:color w:val="1F1F1F"/>
+        </w:rPr>
+        <w:t>) sme preto zakomponovali dedikovanú sekciu na priamy export dotazov do formátu .</w:t>
+      </w:r>
+      <w:proofErr w:type="spellStart"/>
+      <w:r>
+        <w:rPr>
+          <w:rFonts w:ascii="Google Sans" w:eastAsia="Google Sans" w:hAnsi="Google Sans" w:cs="Google Sans"/>
+          <w:color w:val="1F1F1F"/>
+        </w:rPr>
+        <w:t>xlsx</w:t>
+      </w:r>
+      <w:proofErr w:type="spellEnd"/>
+      <w:r>
+        <w:rPr>
+          <w:rFonts w:ascii="Google Sans" w:eastAsia="Google Sans" w:hAnsi="Google Sans" w:cs="Google Sans"/>
+          <w:color w:val="1F1F1F"/>
+        </w:rPr>
+        <w:t>.</w:t>
       </w:r>
     </w:p>
     <w:p>
@@ -3415,14 +5322,50 @@
           <w:bCs/>
           <w:color w:val="1F1F1F"/>
         </w:rPr>
-        <w:t>Analýza FX (qry_Sparovane_Faktury_Prehlad):</w:t>
-      </w:r>
-      <w:r>
-        <w:rPr>
-          <w:rFonts w:ascii="Google Sans" w:eastAsia="Google Sans" w:hAnsi="Google Sans" w:cs="Google Sans"/>
-          <w:color w:val="1F1F1F"/>
-        </w:rPr>
-        <w:t xml:space="preserve"> Hlavný dataset pre kontingenčné tabuľky a manažérske grafy s vyčíslenými kurzovými ziskami a stratami.</w:t>
+        <w:t>Analýza FX (</w:t>
+      </w:r>
+      <w:proofErr w:type="spellStart"/>
+      <w:r>
+        <w:rPr>
+          <w:rFonts w:ascii="Google Sans" w:eastAsia="Google Sans" w:hAnsi="Google Sans" w:cs="Google Sans"/>
+          <w:b/>
+          <w:bCs/>
+          <w:color w:val="1F1F1F"/>
+        </w:rPr>
+        <w:t>qry_Sparovane_Faktury_Prehlad</w:t>
+      </w:r>
+      <w:proofErr w:type="spellEnd"/>
+      <w:r>
+        <w:rPr>
+          <w:rFonts w:ascii="Google Sans" w:eastAsia="Google Sans" w:hAnsi="Google Sans" w:cs="Google Sans"/>
+          <w:b/>
+          <w:bCs/>
+          <w:color w:val="1F1F1F"/>
+        </w:rPr>
+        <w:t>):</w:t>
+      </w:r>
+      <w:r>
+        <w:rPr>
+          <w:rFonts w:ascii="Google Sans" w:eastAsia="Google Sans" w:hAnsi="Google Sans" w:cs="Google Sans"/>
+          <w:color w:val="1F1F1F"/>
+        </w:rPr>
+        <w:t xml:space="preserve"> Hlavný </w:t>
+      </w:r>
+      <w:proofErr w:type="spellStart"/>
+      <w:r>
+        <w:rPr>
+          <w:rFonts w:ascii="Google Sans" w:eastAsia="Google Sans" w:hAnsi="Google Sans" w:cs="Google Sans"/>
+          <w:color w:val="1F1F1F"/>
+        </w:rPr>
+        <w:t>dataset</w:t>
+      </w:r>
+      <w:proofErr w:type="spellEnd"/>
+      <w:r>
+        <w:rPr>
+          <w:rFonts w:ascii="Google Sans" w:eastAsia="Google Sans" w:hAnsi="Google Sans" w:cs="Google Sans"/>
+          <w:color w:val="1F1F1F"/>
+        </w:rPr>
+        <w:t xml:space="preserve"> pre kontingenčné tabuľky a manažérske grafy s vyčíslenými kurzovými ziskami a stratami.</w:t>
       </w:r>
     </w:p>
     <w:p>
@@ -3486,7 +5429,55 @@
           <w:rFonts w:ascii="Google Sans" w:eastAsia="Google Sans" w:hAnsi="Google Sans" w:cs="Google Sans"/>
           <w:color w:val="1F1F1F"/>
         </w:rPr>
-        <w:t xml:space="preserve"> Aktualizované tzv. Master Data obohatené o nové IBANy z banky.</w:t>
+        <w:t xml:space="preserve"> Aktualizované tzv. </w:t>
+      </w:r>
+      <w:proofErr w:type="spellStart"/>
+      <w:r>
+        <w:rPr>
+          <w:rFonts w:ascii="Google Sans" w:eastAsia="Google Sans" w:hAnsi="Google Sans" w:cs="Google Sans"/>
+          <w:color w:val="1F1F1F"/>
+        </w:rPr>
+        <w:t>Master</w:t>
+      </w:r>
+      <w:proofErr w:type="spellEnd"/>
+      <w:r>
+        <w:rPr>
+          <w:rFonts w:ascii="Google Sans" w:eastAsia="Google Sans" w:hAnsi="Google Sans" w:cs="Google Sans"/>
+          <w:color w:val="1F1F1F"/>
+        </w:rPr>
+        <w:t xml:space="preserve"> </w:t>
+      </w:r>
+      <w:proofErr w:type="spellStart"/>
+      <w:r>
+        <w:rPr>
+          <w:rFonts w:ascii="Google Sans" w:eastAsia="Google Sans" w:hAnsi="Google Sans" w:cs="Google Sans"/>
+          <w:color w:val="1F1F1F"/>
+        </w:rPr>
+        <w:t>Data</w:t>
+      </w:r>
+      <w:proofErr w:type="spellEnd"/>
+      <w:r>
+        <w:rPr>
+          <w:rFonts w:ascii="Google Sans" w:eastAsia="Google Sans" w:hAnsi="Google Sans" w:cs="Google Sans"/>
+          <w:color w:val="1F1F1F"/>
+        </w:rPr>
+        <w:t xml:space="preserve"> obohatené o nové </w:t>
+      </w:r>
+      <w:proofErr w:type="spellStart"/>
+      <w:r>
+        <w:rPr>
+          <w:rFonts w:ascii="Google Sans" w:eastAsia="Google Sans" w:hAnsi="Google Sans" w:cs="Google Sans"/>
+          <w:color w:val="1F1F1F"/>
+        </w:rPr>
+        <w:t>IBANy</w:t>
+      </w:r>
+      <w:proofErr w:type="spellEnd"/>
+      <w:r>
+        <w:rPr>
+          <w:rFonts w:ascii="Google Sans" w:eastAsia="Google Sans" w:hAnsi="Google Sans" w:cs="Google Sans"/>
+          <w:color w:val="1F1F1F"/>
+        </w:rPr>
+        <w:t xml:space="preserve"> z banky.</w:t>
       </w:r>
     </w:p>
     <w:p>
@@ -3558,7 +5549,23 @@
           <w:rFonts w:ascii="Google Sans" w:eastAsia="Google Sans" w:hAnsi="Google Sans" w:cs="Google Sans"/>
           <w:color w:val="1F1F1F"/>
         </w:rPr>
-        <w:t>Aby sme vytvorili naozaj uveriteľné a robustné prostredie s požadovanými 350+ záznamami a vyhli sa chybám pri manuálnom prepisovaní, naprogramovali sme s využitím AI promptingu špecializovaný testovací modul vo VBA. Tento modul simuluje prevádzku reálnej firmy a reálne scenáre z praxe.</w:t>
+        <w:t xml:space="preserve">Aby sme vytvorili naozaj uveriteľné a robustné prostredie s požadovanými 350+ záznamami a vyhli sa chybám pri manuálnom prepisovaní, naprogramovali sme s využitím AI </w:t>
+      </w:r>
+      <w:proofErr w:type="spellStart"/>
+      <w:r>
+        <w:rPr>
+          <w:rFonts w:ascii="Google Sans" w:eastAsia="Google Sans" w:hAnsi="Google Sans" w:cs="Google Sans"/>
+          <w:color w:val="1F1F1F"/>
+        </w:rPr>
+        <w:t>promptingu</w:t>
+      </w:r>
+      <w:proofErr w:type="spellEnd"/>
+      <w:r>
+        <w:rPr>
+          <w:rFonts w:ascii="Google Sans" w:eastAsia="Google Sans" w:hAnsi="Google Sans" w:cs="Google Sans"/>
+          <w:color w:val="1F1F1F"/>
+        </w:rPr>
+        <w:t xml:space="preserve"> špecializovaný testovací modul vo VBA. Tento modul simuluje prevádzku reálnej firmy a reálne scenáre z praxe.</w:t>
       </w:r>
     </w:p>
     <w:p>
@@ -3651,7 +5658,23 @@
           <w:rFonts w:ascii="Google Sans" w:eastAsia="Google Sans" w:hAnsi="Google Sans" w:cs="Google Sans"/>
           <w:color w:val="1F1F1F"/>
         </w:rPr>
-        <w:t xml:space="preserve"> Zabezpečuje, aby dátumy vystavenia faktúr nepresiahli aktuálny mesiac a pomocou funkcie Weekday automaticky preskakuje víkendy.</w:t>
+        <w:t xml:space="preserve"> Zabezpečuje, aby dátumy vystavenia faktúr nepresiahli aktuálny mesiac a pomocou funkcie </w:t>
+      </w:r>
+      <w:proofErr w:type="spellStart"/>
+      <w:r>
+        <w:rPr>
+          <w:rFonts w:ascii="Google Sans" w:eastAsia="Google Sans" w:hAnsi="Google Sans" w:cs="Google Sans"/>
+          <w:color w:val="1F1F1F"/>
+        </w:rPr>
+        <w:t>Weekday</w:t>
+      </w:r>
+      <w:proofErr w:type="spellEnd"/>
+      <w:r>
+        <w:rPr>
+          <w:rFonts w:ascii="Google Sans" w:eastAsia="Google Sans" w:hAnsi="Google Sans" w:cs="Google Sans"/>
+          <w:color w:val="1F1F1F"/>
+        </w:rPr>
+        <w:t xml:space="preserve"> automaticky preskakuje víkendy.</w:t>
       </w:r>
     </w:p>
     <w:p>
@@ -3683,7 +5706,23 @@
           <w:rFonts w:ascii="Google Sans" w:eastAsia="Google Sans" w:hAnsi="Google Sans" w:cs="Google Sans"/>
           <w:color w:val="1F1F1F"/>
         </w:rPr>
-        <w:t xml:space="preserve"> Na základe poľa typ_partnera správne rozlišuje, či ide o dodávateľskú (Prijatú) alebo odberateľskú (Vystavenú) faktúru, a podľa toho priraďuje menu (EUR, CZK, GBP, atď.).</w:t>
+        <w:t xml:space="preserve"> Na základe poľa </w:t>
+      </w:r>
+      <w:proofErr w:type="spellStart"/>
+      <w:r>
+        <w:rPr>
+          <w:rFonts w:ascii="Google Sans" w:eastAsia="Google Sans" w:hAnsi="Google Sans" w:cs="Google Sans"/>
+          <w:color w:val="1F1F1F"/>
+        </w:rPr>
+        <w:t>typ_partnera</w:t>
+      </w:r>
+      <w:proofErr w:type="spellEnd"/>
+      <w:r>
+        <w:rPr>
+          <w:rFonts w:ascii="Google Sans" w:eastAsia="Google Sans" w:hAnsi="Google Sans" w:cs="Google Sans"/>
+          <w:color w:val="1F1F1F"/>
+        </w:rPr>
+        <w:t xml:space="preserve"> správne rozlišuje, či ide o dodávateľskú (Prijatú) alebo odberateľskú (Vystavenú) faktúru, a podľa toho priraďuje menu (EUR, CZK, GBP, atď.).</w:t>
       </w:r>
     </w:p>
     <w:p>
@@ -3708,8 +5747,19 @@
           <w:bCs/>
           <w:color w:val="1F1F1F"/>
         </w:rPr>
-        <w:t>Procedúra: GenerujMesenéBankovéVýpisyCSV</w:t>
-      </w:r>
+        <w:t xml:space="preserve">Procedúra: </w:t>
+      </w:r>
+      <w:proofErr w:type="spellStart"/>
+      <w:r>
+        <w:rPr>
+          <w:rFonts w:ascii="Google Sans" w:eastAsia="Google Sans" w:hAnsi="Google Sans" w:cs="Google Sans"/>
+          <w:b/>
+          <w:bCs/>
+          <w:color w:val="1F1F1F"/>
+        </w:rPr>
+        <w:t>GenerujMesenéBankovéVýpisyCSV</w:t>
+      </w:r>
+      <w:proofErr w:type="spellEnd"/>
       <w:r>
         <w:rPr>
           <w:color w:val="000000"/>
@@ -3755,7 +5805,21 @@
           <w:rStyle w:val="Vrazn"/>
         </w:rPr>
         <w:lastRenderedPageBreak/>
-        <w:t>Simulátor chýb (Probabilita):</w:t>
+        <w:t>Simulátor chýb (</w:t>
+      </w:r>
+      <w:proofErr w:type="spellStart"/>
+      <w:r>
+        <w:rPr>
+          <w:rStyle w:val="Vrazn"/>
+        </w:rPr>
+        <w:t>Probabilita</w:t>
+      </w:r>
+      <w:proofErr w:type="spellEnd"/>
+      <w:r>
+        <w:rPr>
+          <w:rStyle w:val="Vrazn"/>
+        </w:rPr>
+        <w:t>):</w:t>
       </w:r>
       <w:r>
         <w:t xml:space="preserve"> Náhodne priraďuje úhrady do vyššie popísaných scenárov rozdelených na dve hlavné vetvy:</w:t>
@@ -3831,8 +5895,19 @@
           <w:bCs/>
           <w:color w:val="1F1F1F"/>
         </w:rPr>
-        <w:t>Procedúra: DoplnDummyIBANyPrePartnerov</w:t>
-      </w:r>
+        <w:t xml:space="preserve">Procedúra: </w:t>
+      </w:r>
+      <w:proofErr w:type="spellStart"/>
+      <w:r>
+        <w:rPr>
+          <w:rFonts w:ascii="Google Sans" w:eastAsia="Google Sans" w:hAnsi="Google Sans" w:cs="Google Sans"/>
+          <w:b/>
+          <w:bCs/>
+          <w:color w:val="1F1F1F"/>
+        </w:rPr>
+        <w:t>DoplnDummyIBANyPrePartnerov</w:t>
+      </w:r>
+      <w:proofErr w:type="spellEnd"/>
       <w:r>
         <w:rPr>
           <w:color w:val="000000"/>
@@ -3908,7 +5983,23 @@
           <w:rFonts w:ascii="Google Sans" w:eastAsia="Google Sans" w:hAnsi="Google Sans" w:cs="Google Sans"/>
           <w:color w:val="1F1F1F"/>
         </w:rPr>
-        <w:t xml:space="preserve"> Program tu hádže virtuálnou mincou. 50 % odberateľom vloží správny IBAN, no zvyšným 50 % vloží hodnotu Null (chýbajúci údaj). </w:t>
+        <w:t xml:space="preserve"> Program tu hádže virtuálnou mincou. 50 % odberateľom vloží správny IBAN, no zvyšným 50 % vloží hodnotu </w:t>
+      </w:r>
+      <w:proofErr w:type="spellStart"/>
+      <w:r>
+        <w:rPr>
+          <w:rFonts w:ascii="Google Sans" w:eastAsia="Google Sans" w:hAnsi="Google Sans" w:cs="Google Sans"/>
+          <w:color w:val="1F1F1F"/>
+        </w:rPr>
+        <w:t>Null</w:t>
+      </w:r>
+      <w:proofErr w:type="spellEnd"/>
+      <w:r>
+        <w:rPr>
+          <w:rFonts w:ascii="Google Sans" w:eastAsia="Google Sans" w:hAnsi="Google Sans" w:cs="Google Sans"/>
+          <w:color w:val="1F1F1F"/>
+        </w:rPr>
+        <w:t xml:space="preserve"> (chýbajúci údaj). </w:t>
       </w:r>
     </w:p>
     <w:p>
@@ -3925,7 +6016,23 @@
           <w:rFonts w:ascii="Google Sans" w:eastAsia="Google Sans" w:hAnsi="Google Sans" w:cs="Google Sans"/>
           <w:color w:val="1F1F1F"/>
         </w:rPr>
-        <w:t>4. Návod na testovanie prototypu (Workflow pre simuláciu prevádzky)</w:t>
+        <w:t>4. Návod na testovanie prototypu (</w:t>
+      </w:r>
+      <w:proofErr w:type="spellStart"/>
+      <w:r>
+        <w:rPr>
+          <w:rFonts w:ascii="Google Sans" w:eastAsia="Google Sans" w:hAnsi="Google Sans" w:cs="Google Sans"/>
+          <w:color w:val="1F1F1F"/>
+        </w:rPr>
+        <w:t>Workflow</w:t>
+      </w:r>
+      <w:proofErr w:type="spellEnd"/>
+      <w:r>
+        <w:rPr>
+          <w:rFonts w:ascii="Google Sans" w:eastAsia="Google Sans" w:hAnsi="Google Sans" w:cs="Google Sans"/>
+          <w:color w:val="1F1F1F"/>
+        </w:rPr>
+        <w:t xml:space="preserve"> pre simuláciu prevádzky)</w:t>
       </w:r>
     </w:p>
     <w:p>
@@ -3948,7 +6055,71 @@
           <w:rFonts w:ascii="Google Sans" w:eastAsia="Google Sans" w:hAnsi="Google Sans" w:cs="Google Sans"/>
           <w:color w:val="1F1F1F"/>
         </w:rPr>
-        <w:t>Pre zabezpečenie transparentnosti a plynulého odovzdania projektu sme pripravili na platforme GitHub kompletný repozitár (e-smartbalance), v ktorom sú okrem samotnej databázy uložené aj vygenerované testovacie dáta. Tento štruktúrovaný workflow umožňuje komukoľvek – členom tímu, audítorovi alebo vyučujúcej – overiť plnú funkčnosť nášho jadra "Smart-Pairing".</w:t>
+        <w:t xml:space="preserve">Pre zabezpečenie transparentnosti a plynulého odovzdania projektu sme pripravili na platforme </w:t>
+      </w:r>
+      <w:proofErr w:type="spellStart"/>
+      <w:r>
+        <w:rPr>
+          <w:rFonts w:ascii="Google Sans" w:eastAsia="Google Sans" w:hAnsi="Google Sans" w:cs="Google Sans"/>
+          <w:color w:val="1F1F1F"/>
+        </w:rPr>
+        <w:t>GitHub</w:t>
+      </w:r>
+      <w:proofErr w:type="spellEnd"/>
+      <w:r>
+        <w:rPr>
+          <w:rFonts w:ascii="Google Sans" w:eastAsia="Google Sans" w:hAnsi="Google Sans" w:cs="Google Sans"/>
+          <w:color w:val="1F1F1F"/>
+        </w:rPr>
+        <w:t xml:space="preserve"> kompletný repozitár (e-</w:t>
+      </w:r>
+      <w:proofErr w:type="spellStart"/>
+      <w:r>
+        <w:rPr>
+          <w:rFonts w:ascii="Google Sans" w:eastAsia="Google Sans" w:hAnsi="Google Sans" w:cs="Google Sans"/>
+          <w:color w:val="1F1F1F"/>
+        </w:rPr>
+        <w:t>smartbalance</w:t>
+      </w:r>
+      <w:proofErr w:type="spellEnd"/>
+      <w:r>
+        <w:rPr>
+          <w:rFonts w:ascii="Google Sans" w:eastAsia="Google Sans" w:hAnsi="Google Sans" w:cs="Google Sans"/>
+          <w:color w:val="1F1F1F"/>
+        </w:rPr>
+        <w:t xml:space="preserve">), v ktorom sú okrem samotnej databázy uložené aj vygenerované testovacie dáta. Tento štruktúrovaný </w:t>
+      </w:r>
+      <w:proofErr w:type="spellStart"/>
+      <w:r>
+        <w:rPr>
+          <w:rFonts w:ascii="Google Sans" w:eastAsia="Google Sans" w:hAnsi="Google Sans" w:cs="Google Sans"/>
+          <w:color w:val="1F1F1F"/>
+        </w:rPr>
+        <w:t>workflow</w:t>
+      </w:r>
+      <w:proofErr w:type="spellEnd"/>
+      <w:r>
+        <w:rPr>
+          <w:rFonts w:ascii="Google Sans" w:eastAsia="Google Sans" w:hAnsi="Google Sans" w:cs="Google Sans"/>
+          <w:color w:val="1F1F1F"/>
+        </w:rPr>
+        <w:t xml:space="preserve"> umožňuje komukoľvek – členom tímu, audítorovi alebo vyučujúcej – overiť plnú funkčnosť nášho jadra "</w:t>
+      </w:r>
+      <w:proofErr w:type="spellStart"/>
+      <w:r>
+        <w:rPr>
+          <w:rFonts w:ascii="Google Sans" w:eastAsia="Google Sans" w:hAnsi="Google Sans" w:cs="Google Sans"/>
+          <w:color w:val="1F1F1F"/>
+        </w:rPr>
+        <w:t>Smart-Pairing</w:t>
+      </w:r>
+      <w:proofErr w:type="spellEnd"/>
+      <w:r>
+        <w:rPr>
+          <w:rFonts w:ascii="Google Sans" w:eastAsia="Google Sans" w:hAnsi="Google Sans" w:cs="Google Sans"/>
+          <w:color w:val="1F1F1F"/>
+        </w:rPr>
+        <w:t>".</w:t>
       </w:r>
     </w:p>
     <w:p>
@@ -3971,7 +6142,39 @@
           <w:rFonts w:ascii="Google Sans" w:eastAsia="Google Sans" w:hAnsi="Google Sans" w:cs="Google Sans"/>
           <w:color w:val="1F1F1F"/>
         </w:rPr>
-        <w:t>V repozitári sa nachádzajú zdrojové kódy (VBA moduly .bas), diagramy z ARISu (.adf), kompletný dokument k user story 1, ako aj sady generovaných výpisov z banky a Excel exportov. Z pohľadu testovania sú kľúčové vopred vygenerované mesačné bankové výpisy (napríklad bankovy_vypis_2026_01.csv až bankovy_vypis_2026_04.csv), ktoré simulujú reálnu prevádzku a obsahujú vnesené anomálie (preklepy, splátky, duplicity).</w:t>
+        <w:t xml:space="preserve">V repozitári sa nachádzajú zdrojové kódy (VBA moduly .bas), diagramy z </w:t>
+      </w:r>
+      <w:proofErr w:type="spellStart"/>
+      <w:r>
+        <w:rPr>
+          <w:rFonts w:ascii="Google Sans" w:eastAsia="Google Sans" w:hAnsi="Google Sans" w:cs="Google Sans"/>
+          <w:color w:val="1F1F1F"/>
+        </w:rPr>
+        <w:t>ARISu</w:t>
+      </w:r>
+      <w:proofErr w:type="spellEnd"/>
+      <w:r>
+        <w:rPr>
+          <w:rFonts w:ascii="Google Sans" w:eastAsia="Google Sans" w:hAnsi="Google Sans" w:cs="Google Sans"/>
+          <w:color w:val="1F1F1F"/>
+        </w:rPr>
+        <w:t xml:space="preserve"> (.</w:t>
+      </w:r>
+      <w:proofErr w:type="spellStart"/>
+      <w:r>
+        <w:rPr>
+          <w:rFonts w:ascii="Google Sans" w:eastAsia="Google Sans" w:hAnsi="Google Sans" w:cs="Google Sans"/>
+          <w:color w:val="1F1F1F"/>
+        </w:rPr>
+        <w:t>adf</w:t>
+      </w:r>
+      <w:proofErr w:type="spellEnd"/>
+      <w:r>
+        <w:rPr>
+          <w:rFonts w:ascii="Google Sans" w:eastAsia="Google Sans" w:hAnsi="Google Sans" w:cs="Google Sans"/>
+          <w:color w:val="1F1F1F"/>
+        </w:rPr>
+        <w:t>), kompletný dokument k user story 1, ako aj sady generovaných výpisov z banky a Excel exportov. Z pohľadu testovania sú kľúčové vopred vygenerované mesačné bankové výpisy (napríklad bankovy_vypis_2026_01.csv až bankovy_vypis_2026_04.csv), ktoré simulujú reálnu prevádzku a obsahujú vnesené anomálie (preklepy, splátky, duplicity).</w:t>
       </w:r>
     </w:p>
     <w:p>
@@ -3983,12 +6186,21 @@
           <w:color w:val="1F1F1F"/>
         </w:rPr>
       </w:pPr>
-      <w:r>
-        <w:rPr>
-          <w:rFonts w:ascii="Google Sans" w:eastAsia="Google Sans" w:hAnsi="Google Sans" w:cs="Google Sans"/>
-          <w:color w:val="1F1F1F"/>
-        </w:rPr>
-        <w:t>Workflow pre úspešné pretestovanie aplikácie:</w:t>
+      <w:proofErr w:type="spellStart"/>
+      <w:r>
+        <w:rPr>
+          <w:rFonts w:ascii="Google Sans" w:eastAsia="Google Sans" w:hAnsi="Google Sans" w:cs="Google Sans"/>
+          <w:color w:val="1F1F1F"/>
+        </w:rPr>
+        <w:t>Workflow</w:t>
+      </w:r>
+      <w:proofErr w:type="spellEnd"/>
+      <w:r>
+        <w:rPr>
+          <w:rFonts w:ascii="Google Sans" w:eastAsia="Google Sans" w:hAnsi="Google Sans" w:cs="Google Sans"/>
+          <w:color w:val="1F1F1F"/>
+        </w:rPr>
+        <w:t xml:space="preserve"> pre úspešné pretestovanie aplikácie:</w:t>
       </w:r>
     </w:p>
     <w:p>
@@ -4038,7 +6250,23 @@
           <w:rFonts w:ascii="Google Sans" w:eastAsia="Google Sans" w:hAnsi="Google Sans" w:cs="Google Sans"/>
           <w:color w:val="1F1F1F"/>
         </w:rPr>
-        <w:t>Aby bolo možné otestovať systém "od nuly", simuláciu začíname zmazaním starých platieb, ak nejaké sú. V MS Access otvorte tabuľku tbl_platba a vymažte všetky jej aktuálne záznamy. Týmto zresetujete testovací režim.</w:t>
+        <w:t xml:space="preserve">Aby bolo možné otestovať systém "od nuly", simuláciu začíname zmazaním starých platieb, ak nejaké sú. V MS Access otvorte tabuľku </w:t>
+      </w:r>
+      <w:proofErr w:type="spellStart"/>
+      <w:r>
+        <w:rPr>
+          <w:rFonts w:ascii="Google Sans" w:eastAsia="Google Sans" w:hAnsi="Google Sans" w:cs="Google Sans"/>
+          <w:color w:val="1F1F1F"/>
+        </w:rPr>
+        <w:t>tbl_platba</w:t>
+      </w:r>
+      <w:proofErr w:type="spellEnd"/>
+      <w:r>
+        <w:rPr>
+          <w:rFonts w:ascii="Google Sans" w:eastAsia="Google Sans" w:hAnsi="Google Sans" w:cs="Google Sans"/>
+          <w:color w:val="1F1F1F"/>
+        </w:rPr>
+        <w:t xml:space="preserve"> a vymažte všetky jej aktuálne záznamy. Týmto zresetujete testovací režim.</w:t>
       </w:r>
     </w:p>
     <w:p>
@@ -4065,7 +6293,47 @@
           <w:bCs/>
           <w:color w:val="1F1F1F"/>
         </w:rPr>
-        <w:t>KROK 2: Import bankových výpisov (Data Ingestion)</w:t>
+        <w:t>KROK 2: Import bankových výpisov (</w:t>
+      </w:r>
+      <w:proofErr w:type="spellStart"/>
+      <w:r>
+        <w:rPr>
+          <w:rFonts w:ascii="Google Sans" w:eastAsia="Google Sans" w:hAnsi="Google Sans" w:cs="Google Sans"/>
+          <w:b/>
+          <w:bCs/>
+          <w:color w:val="1F1F1F"/>
+        </w:rPr>
+        <w:t>Data</w:t>
+      </w:r>
+      <w:proofErr w:type="spellEnd"/>
+      <w:r>
+        <w:rPr>
+          <w:rFonts w:ascii="Google Sans" w:eastAsia="Google Sans" w:hAnsi="Google Sans" w:cs="Google Sans"/>
+          <w:b/>
+          <w:bCs/>
+          <w:color w:val="1F1F1F"/>
+        </w:rPr>
+        <w:t xml:space="preserve"> </w:t>
+      </w:r>
+      <w:proofErr w:type="spellStart"/>
+      <w:r>
+        <w:rPr>
+          <w:rFonts w:ascii="Google Sans" w:eastAsia="Google Sans" w:hAnsi="Google Sans" w:cs="Google Sans"/>
+          <w:b/>
+          <w:bCs/>
+          <w:color w:val="1F1F1F"/>
+        </w:rPr>
+        <w:t>Ingestion</w:t>
+      </w:r>
+      <w:proofErr w:type="spellEnd"/>
+      <w:r>
+        <w:rPr>
+          <w:rFonts w:ascii="Google Sans" w:eastAsia="Google Sans" w:hAnsi="Google Sans" w:cs="Google Sans"/>
+          <w:b/>
+          <w:bCs/>
+          <w:color w:val="1F1F1F"/>
+        </w:rPr>
+        <w:t>)</w:t>
       </w:r>
     </w:p>
     <w:p>
@@ -4089,7 +6357,39 @@
           <w:color w:val="1F1F1F"/>
         </w:rPr>
         <w:lastRenderedPageBreak/>
-        <w:t xml:space="preserve">Otvorte hlavný úvodný formulár frm_Smartbalance-Hlavné_menu (Dashboard). Kliknite na prvé tlačidlo pre </w:t>
+        <w:t xml:space="preserve">Otvorte hlavný úvodný formulár </w:t>
+      </w:r>
+      <w:proofErr w:type="spellStart"/>
+      <w:r>
+        <w:rPr>
+          <w:rFonts w:ascii="Google Sans" w:eastAsia="Google Sans" w:hAnsi="Google Sans" w:cs="Google Sans"/>
+          <w:color w:val="1F1F1F"/>
+        </w:rPr>
+        <w:t>frm_Smartbalance-Hlavné_menu</w:t>
+      </w:r>
+      <w:proofErr w:type="spellEnd"/>
+      <w:r>
+        <w:rPr>
+          <w:rFonts w:ascii="Google Sans" w:eastAsia="Google Sans" w:hAnsi="Google Sans" w:cs="Google Sans"/>
+          <w:color w:val="1F1F1F"/>
+        </w:rPr>
+        <w:t xml:space="preserve"> (</w:t>
+      </w:r>
+      <w:proofErr w:type="spellStart"/>
+      <w:r>
+        <w:rPr>
+          <w:rFonts w:ascii="Google Sans" w:eastAsia="Google Sans" w:hAnsi="Google Sans" w:cs="Google Sans"/>
+          <w:color w:val="1F1F1F"/>
+        </w:rPr>
+        <w:t>Dashboard</w:t>
+      </w:r>
+      <w:proofErr w:type="spellEnd"/>
+      <w:r>
+        <w:rPr>
+          <w:rFonts w:ascii="Google Sans" w:eastAsia="Google Sans" w:hAnsi="Google Sans" w:cs="Google Sans"/>
+          <w:color w:val="1F1F1F"/>
+        </w:rPr>
+        <w:t xml:space="preserve">). Kliknite na prvé tlačidlo pre </w:t>
       </w:r>
       <w:r>
         <w:rPr>
@@ -4105,7 +6405,39 @@
           <w:rFonts w:ascii="Google Sans" w:eastAsia="Google Sans" w:hAnsi="Google Sans" w:cs="Google Sans"/>
           <w:color w:val="1F1F1F"/>
         </w:rPr>
-        <w:t>. Zobrazí sa dialógové okno, v ktorom z vášho klonovaného GitHub repozitára vyberte niektorý z pripravených mesačných výpisov (napríklad bankovy_vypis_2026_01.csv). Po potvrdení podformulár okamžite načíta a vizualizuje importované platby z daného mesiaca.</w:t>
+        <w:t xml:space="preserve">. Zobrazí sa dialógové okno, v ktorom z vášho klonovaného </w:t>
+      </w:r>
+      <w:proofErr w:type="spellStart"/>
+      <w:r>
+        <w:rPr>
+          <w:rFonts w:ascii="Google Sans" w:eastAsia="Google Sans" w:hAnsi="Google Sans" w:cs="Google Sans"/>
+          <w:color w:val="1F1F1F"/>
+        </w:rPr>
+        <w:t>GitHub</w:t>
+      </w:r>
+      <w:proofErr w:type="spellEnd"/>
+      <w:r>
+        <w:rPr>
+          <w:rFonts w:ascii="Google Sans" w:eastAsia="Google Sans" w:hAnsi="Google Sans" w:cs="Google Sans"/>
+          <w:color w:val="1F1F1F"/>
+        </w:rPr>
+        <w:t xml:space="preserve"> repozitára vyberte niektorý z pripravených mesačných výpisov (napríklad bankovy_vypis_2026_01.csv). Po potvrdení </w:t>
+      </w:r>
+      <w:proofErr w:type="spellStart"/>
+      <w:r>
+        <w:rPr>
+          <w:rFonts w:ascii="Google Sans" w:eastAsia="Google Sans" w:hAnsi="Google Sans" w:cs="Google Sans"/>
+          <w:color w:val="1F1F1F"/>
+        </w:rPr>
+        <w:t>podformulár</w:t>
+      </w:r>
+      <w:proofErr w:type="spellEnd"/>
+      <w:r>
+        <w:rPr>
+          <w:rFonts w:ascii="Google Sans" w:eastAsia="Google Sans" w:hAnsi="Google Sans" w:cs="Google Sans"/>
+          <w:color w:val="1F1F1F"/>
+        </w:rPr>
+        <w:t xml:space="preserve"> okamžite načíta a vizualizuje importované platby z daného mesiaca.</w:t>
       </w:r>
     </w:p>
     <w:p>
@@ -4132,7 +6464,27 @@
           <w:bCs/>
           <w:color w:val="1F1F1F"/>
         </w:rPr>
-        <w:t>KROK 3: Spustenie automatického párovania (Smart-Pairing)</w:t>
+        <w:t>KROK 3: Spustenie automatického párovania (</w:t>
+      </w:r>
+      <w:proofErr w:type="spellStart"/>
+      <w:r>
+        <w:rPr>
+          <w:rFonts w:ascii="Google Sans" w:eastAsia="Google Sans" w:hAnsi="Google Sans" w:cs="Google Sans"/>
+          <w:b/>
+          <w:bCs/>
+          <w:color w:val="1F1F1F"/>
+        </w:rPr>
+        <w:t>Smart-Pairing</w:t>
+      </w:r>
+      <w:proofErr w:type="spellEnd"/>
+      <w:r>
+        <w:rPr>
+          <w:rFonts w:ascii="Google Sans" w:eastAsia="Google Sans" w:hAnsi="Google Sans" w:cs="Google Sans"/>
+          <w:b/>
+          <w:bCs/>
+          <w:color w:val="1F1F1F"/>
+        </w:rPr>
+        <w:t>)</w:t>
       </w:r>
     </w:p>
     <w:p>
@@ -4155,17 +6507,64 @@
           <w:rFonts w:ascii="Google Sans" w:eastAsia="Google Sans" w:hAnsi="Google Sans" w:cs="Google Sans"/>
           <w:color w:val="1F1F1F"/>
         </w:rPr>
-        <w:t xml:space="preserve">Vráťte sa na Dashboard a kliknite na Párovanie a spracovanie  platieb. Otvorí sa nový formulár v ktorom stlačte tlačidlo pre </w:t>
-      </w:r>
-      <w:r>
-        <w:rPr>
-          <w:rFonts w:ascii="Google Sans" w:eastAsia="Google Sans" w:hAnsi="Google Sans" w:cs="Google Sans"/>
-          <w:b/>
-          <w:bCs/>
-          <w:color w:val="1F1F1F"/>
-        </w:rPr>
-        <w:t>Spustiť smart pairing</w:t>
-      </w:r>
+        <w:t xml:space="preserve">Vráťte sa na </w:t>
+      </w:r>
+      <w:proofErr w:type="spellStart"/>
+      <w:r>
+        <w:rPr>
+          <w:rFonts w:ascii="Google Sans" w:eastAsia="Google Sans" w:hAnsi="Google Sans" w:cs="Google Sans"/>
+          <w:color w:val="1F1F1F"/>
+        </w:rPr>
+        <w:t>Dashboard</w:t>
+      </w:r>
+      <w:proofErr w:type="spellEnd"/>
+      <w:r>
+        <w:rPr>
+          <w:rFonts w:ascii="Google Sans" w:eastAsia="Google Sans" w:hAnsi="Google Sans" w:cs="Google Sans"/>
+          <w:color w:val="1F1F1F"/>
+        </w:rPr>
+        <w:t xml:space="preserve"> a kliknite na Párovanie a spracovanie  platieb. Otvorí sa nový formulár v ktorom stlačte tlačidlo pre </w:t>
+      </w:r>
+      <w:r>
+        <w:rPr>
+          <w:rFonts w:ascii="Google Sans" w:eastAsia="Google Sans" w:hAnsi="Google Sans" w:cs="Google Sans"/>
+          <w:b/>
+          <w:bCs/>
+          <w:color w:val="1F1F1F"/>
+        </w:rPr>
+        <w:t xml:space="preserve">Spustiť </w:t>
+      </w:r>
+      <w:proofErr w:type="spellStart"/>
+      <w:r>
+        <w:rPr>
+          <w:rFonts w:ascii="Google Sans" w:eastAsia="Google Sans" w:hAnsi="Google Sans" w:cs="Google Sans"/>
+          <w:b/>
+          <w:bCs/>
+          <w:color w:val="1F1F1F"/>
+        </w:rPr>
+        <w:t>smart</w:t>
+      </w:r>
+      <w:proofErr w:type="spellEnd"/>
+      <w:r>
+        <w:rPr>
+          <w:rFonts w:ascii="Google Sans" w:eastAsia="Google Sans" w:hAnsi="Google Sans" w:cs="Google Sans"/>
+          <w:b/>
+          <w:bCs/>
+          <w:color w:val="1F1F1F"/>
+        </w:rPr>
+        <w:t xml:space="preserve"> </w:t>
+      </w:r>
+      <w:proofErr w:type="spellStart"/>
+      <w:r>
+        <w:rPr>
+          <w:rFonts w:ascii="Google Sans" w:eastAsia="Google Sans" w:hAnsi="Google Sans" w:cs="Google Sans"/>
+          <w:b/>
+          <w:bCs/>
+          <w:color w:val="1F1F1F"/>
+        </w:rPr>
+        <w:t>pairing</w:t>
+      </w:r>
+      <w:proofErr w:type="spellEnd"/>
       <w:r>
         <w:rPr>
           <w:rFonts w:ascii="Google Sans" w:eastAsia="Google Sans" w:hAnsi="Google Sans" w:cs="Google Sans"/>
@@ -4198,7 +6597,47 @@
           <w:bCs/>
           <w:color w:val="1F1F1F"/>
         </w:rPr>
-        <w:t>KROK 4: Manuálne párovanie a skúmanie hraničných situácií (Edge Cases)</w:t>
+        <w:t>KROK 4: Manuálne párovanie a skúmanie hraničných situácií (</w:t>
+      </w:r>
+      <w:proofErr w:type="spellStart"/>
+      <w:r>
+        <w:rPr>
+          <w:rFonts w:ascii="Google Sans" w:eastAsia="Google Sans" w:hAnsi="Google Sans" w:cs="Google Sans"/>
+          <w:b/>
+          <w:bCs/>
+          <w:color w:val="1F1F1F"/>
+        </w:rPr>
+        <w:t>Edge</w:t>
+      </w:r>
+      <w:proofErr w:type="spellEnd"/>
+      <w:r>
+        <w:rPr>
+          <w:rFonts w:ascii="Google Sans" w:eastAsia="Google Sans" w:hAnsi="Google Sans" w:cs="Google Sans"/>
+          <w:b/>
+          <w:bCs/>
+          <w:color w:val="1F1F1F"/>
+        </w:rPr>
+        <w:t xml:space="preserve"> </w:t>
+      </w:r>
+      <w:proofErr w:type="spellStart"/>
+      <w:r>
+        <w:rPr>
+          <w:rFonts w:ascii="Google Sans" w:eastAsia="Google Sans" w:hAnsi="Google Sans" w:cs="Google Sans"/>
+          <w:b/>
+          <w:bCs/>
+          <w:color w:val="1F1F1F"/>
+        </w:rPr>
+        <w:t>Cases</w:t>
+      </w:r>
+      <w:proofErr w:type="spellEnd"/>
+      <w:r>
+        <w:rPr>
+          <w:rFonts w:ascii="Google Sans" w:eastAsia="Google Sans" w:hAnsi="Google Sans" w:cs="Google Sans"/>
+          <w:b/>
+          <w:bCs/>
+          <w:color w:val="1F1F1F"/>
+        </w:rPr>
+        <w:t>)</w:t>
       </w:r>
     </w:p>
     <w:p>
@@ -4221,7 +6660,23 @@
           <w:rFonts w:ascii="Google Sans" w:eastAsia="Google Sans" w:hAnsi="Google Sans" w:cs="Google Sans"/>
           <w:color w:val="1F1F1F"/>
         </w:rPr>
-        <w:t>V údajoch formulára ostanú už iba nespárované platby ktoré cez rozbaľovací zoznam môžeme prepojiť s nejakou neuhradenou faktúrou. Po priradení musíme ešte prepojenie potvrdiť. Toto je ideálny moment na skúmanie, aké situácie vznikajú v praxi:</w:t>
+        <w:t xml:space="preserve">V údajoch formulára ostanú už iba nespárované platby ktoré cez </w:t>
+      </w:r>
+      <w:proofErr w:type="spellStart"/>
+      <w:r>
+        <w:rPr>
+          <w:rFonts w:ascii="Google Sans" w:eastAsia="Google Sans" w:hAnsi="Google Sans" w:cs="Google Sans"/>
+          <w:color w:val="1F1F1F"/>
+        </w:rPr>
+        <w:t>rozbaľovací</w:t>
+      </w:r>
+      <w:proofErr w:type="spellEnd"/>
+      <w:r>
+        <w:rPr>
+          <w:rFonts w:ascii="Google Sans" w:eastAsia="Google Sans" w:hAnsi="Google Sans" w:cs="Google Sans"/>
+          <w:color w:val="1F1F1F"/>
+        </w:rPr>
+        <w:t xml:space="preserve"> zoznam môžeme prepojiť s nejakou neuhradenou faktúrou. Po priradení musíme ešte prepojenie potvrdiť. Toto je ideálny moment na skúmanie, aké situácie vznikajú v praxi:</w:t>
       </w:r>
     </w:p>
     <w:p>
@@ -4253,7 +6708,23 @@
           <w:rFonts w:ascii="Google Sans" w:eastAsia="Google Sans" w:hAnsi="Google Sans" w:cs="Google Sans"/>
           <w:color w:val="1F1F1F"/>
         </w:rPr>
-        <w:t xml:space="preserve"> Účtovník musí faktúru dohľadať (rozbaľovací zoznam mu pomáha zoradením podľa sumy) a po spárovaní systém uloží nové pravidlo.</w:t>
+        <w:t xml:space="preserve"> Účtovník musí faktúru dohľadať (</w:t>
+      </w:r>
+      <w:proofErr w:type="spellStart"/>
+      <w:r>
+        <w:rPr>
+          <w:rFonts w:ascii="Google Sans" w:eastAsia="Google Sans" w:hAnsi="Google Sans" w:cs="Google Sans"/>
+          <w:color w:val="1F1F1F"/>
+        </w:rPr>
+        <w:t>rozbaľovací</w:t>
+      </w:r>
+      <w:proofErr w:type="spellEnd"/>
+      <w:r>
+        <w:rPr>
+          <w:rFonts w:ascii="Google Sans" w:eastAsia="Google Sans" w:hAnsi="Google Sans" w:cs="Google Sans"/>
+          <w:color w:val="1F1F1F"/>
+        </w:rPr>
+        <w:t xml:space="preserve"> zoznam mu pomáha zoradením podľa sumy) a po spárovaní systém uloží nové pravidlo.</w:t>
       </w:r>
     </w:p>
     <w:p>
@@ -4344,7 +6815,27 @@
           <w:bCs/>
           <w:color w:val="1F1F1F"/>
         </w:rPr>
-        <w:t>KROK 5: Generovanie exportov pre analytiku (Príprava na US#5)</w:t>
+        <w:t xml:space="preserve">KROK 5: Generovanie exportov pre </w:t>
+      </w:r>
+      <w:proofErr w:type="spellStart"/>
+      <w:r>
+        <w:rPr>
+          <w:rFonts w:ascii="Google Sans" w:eastAsia="Google Sans" w:hAnsi="Google Sans" w:cs="Google Sans"/>
+          <w:b/>
+          <w:bCs/>
+          <w:color w:val="1F1F1F"/>
+        </w:rPr>
+        <w:t>analytiku</w:t>
+      </w:r>
+      <w:proofErr w:type="spellEnd"/>
+      <w:r>
+        <w:rPr>
+          <w:rFonts w:ascii="Google Sans" w:eastAsia="Google Sans" w:hAnsi="Google Sans" w:cs="Google Sans"/>
+          <w:b/>
+          <w:bCs/>
+          <w:color w:val="1F1F1F"/>
+        </w:rPr>
+        <w:t xml:space="preserve"> (Príprava na US#5)</w:t>
       </w:r>
     </w:p>
     <w:p>
@@ -4367,7 +6858,23 @@
           <w:rFonts w:ascii="Google Sans" w:eastAsia="Google Sans" w:hAnsi="Google Sans" w:cs="Google Sans"/>
           <w:color w:val="1F1F1F"/>
         </w:rPr>
-        <w:t xml:space="preserve">Keď sú platby úspešne spárované, v Dashboarde kliknite na tlačidlá pre </w:t>
+        <w:t xml:space="preserve">Keď sú platby úspešne spárované, v </w:t>
+      </w:r>
+      <w:proofErr w:type="spellStart"/>
+      <w:r>
+        <w:rPr>
+          <w:rFonts w:ascii="Google Sans" w:eastAsia="Google Sans" w:hAnsi="Google Sans" w:cs="Google Sans"/>
+          <w:color w:val="1F1F1F"/>
+        </w:rPr>
+        <w:t>Dashboarde</w:t>
+      </w:r>
+      <w:proofErr w:type="spellEnd"/>
+      <w:r>
+        <w:rPr>
+          <w:rFonts w:ascii="Google Sans" w:eastAsia="Google Sans" w:hAnsi="Google Sans" w:cs="Google Sans"/>
+          <w:color w:val="1F1F1F"/>
+        </w:rPr>
+        <w:t xml:space="preserve"> kliknite na tlačidlá pre </w:t>
       </w:r>
       <w:r>
         <w:rPr>
@@ -4400,8 +6907,17 @@
           <w:rFonts w:ascii="Google Sans" w:eastAsia="Google Sans" w:hAnsi="Google Sans" w:cs="Google Sans"/>
           <w:color w:val="1F1F1F"/>
         </w:rPr>
-        <w:t>4.1 Bezpečnostné pokyny pre klonovanie a tímovú prácu v GitHube</w:t>
-      </w:r>
+        <w:t xml:space="preserve">4.1 Bezpečnostné pokyny pre klonovanie a tímovú prácu v </w:t>
+      </w:r>
+      <w:proofErr w:type="spellStart"/>
+      <w:r>
+        <w:rPr>
+          <w:rFonts w:ascii="Google Sans" w:eastAsia="Google Sans" w:hAnsi="Google Sans" w:cs="Google Sans"/>
+          <w:color w:val="1F1F1F"/>
+        </w:rPr>
+        <w:t>GitHube</w:t>
+      </w:r>
+      <w:proofErr w:type="spellEnd"/>
     </w:p>
     <w:p>
       <w:pPr>
@@ -4423,15 +6939,40 @@
           <w:rFonts w:ascii="Google Sans" w:eastAsia="Google Sans" w:hAnsi="Google Sans" w:cs="Google Sans"/>
           <w:color w:val="1F1F1F"/>
         </w:rPr>
-        <w:t>Keďže náš prototyp je postavený na MS Access, musíme pri spoločnej práci v zdieľanom GitHub repozitári dodržiavať prísne bezpečnostné pravidlá. Databázový súbor (</w:t>
+        <w:t xml:space="preserve">Keďže náš prototyp je postavený na MS Access, musíme pri spoločnej práci v zdieľanom </w:t>
+      </w:r>
+      <w:proofErr w:type="spellStart"/>
+      <w:r>
+        <w:rPr>
+          <w:rFonts w:ascii="Google Sans" w:eastAsia="Google Sans" w:hAnsi="Google Sans" w:cs="Google Sans"/>
+          <w:color w:val="1F1F1F"/>
+        </w:rPr>
+        <w:t>GitHub</w:t>
+      </w:r>
+      <w:proofErr w:type="spellEnd"/>
+      <w:r>
+        <w:rPr>
+          <w:rFonts w:ascii="Google Sans" w:eastAsia="Google Sans" w:hAnsi="Google Sans" w:cs="Google Sans"/>
+          <w:color w:val="1F1F1F"/>
+        </w:rPr>
+        <w:t xml:space="preserve"> repozitári dodržiavať prísne bezpečnostné pravidlá. Databázový súbor (</w:t>
       </w:r>
       <w:r>
         <w:rPr>
           <w:rFonts w:ascii="Google Sans" w:eastAsia="Google Sans" w:hAnsi="Google Sans" w:cs="Google Sans"/>
           <w:color w:val="444746"/>
         </w:rPr>
-        <w:t>.accdb</w:t>
-      </w:r>
+        <w:t>.</w:t>
+      </w:r>
+      <w:proofErr w:type="spellStart"/>
+      <w:r>
+        <w:rPr>
+          <w:rFonts w:ascii="Google Sans" w:eastAsia="Google Sans" w:hAnsi="Google Sans" w:cs="Google Sans"/>
+          <w:color w:val="444746"/>
+        </w:rPr>
+        <w:t>accdb</w:t>
+      </w:r>
+      <w:proofErr w:type="spellEnd"/>
       <w:r>
         <w:rPr>
           <w:rFonts w:ascii="Google Sans" w:eastAsia="Google Sans" w:hAnsi="Google Sans" w:cs="Google Sans"/>
@@ -4453,7 +6994,23 @@
           <w:rFonts w:ascii="Google Sans" w:eastAsia="Google Sans" w:hAnsi="Google Sans" w:cs="Google Sans"/>
           <w:color w:val="1F1F1F"/>
         </w:rPr>
-        <w:t>, čo znamená, že Git nedokáže automaticky zlúčiť (merge) zmeny od viacerých ľudí tak, ako to robí pri bežnom textovom kóde.</w:t>
+        <w:t>, čo znamená, že Git nedokáže automaticky zlúčiť (</w:t>
+      </w:r>
+      <w:proofErr w:type="spellStart"/>
+      <w:r>
+        <w:rPr>
+          <w:rFonts w:ascii="Google Sans" w:eastAsia="Google Sans" w:hAnsi="Google Sans" w:cs="Google Sans"/>
+          <w:color w:val="1F1F1F"/>
+        </w:rPr>
+        <w:t>merge</w:t>
+      </w:r>
+      <w:proofErr w:type="spellEnd"/>
+      <w:r>
+        <w:rPr>
+          <w:rFonts w:ascii="Google Sans" w:eastAsia="Google Sans" w:hAnsi="Google Sans" w:cs="Google Sans"/>
+          <w:color w:val="1F1F1F"/>
+        </w:rPr>
+        <w:t>) zmeny od viacerých ľudí tak, ako to robí pri bežnom textovom kóde.</w:t>
       </w:r>
     </w:p>
     <w:p>
@@ -4476,7 +7033,23 @@
           <w:rFonts w:ascii="Google Sans" w:eastAsia="Google Sans" w:hAnsi="Google Sans" w:cs="Google Sans"/>
           <w:color w:val="1F1F1F"/>
         </w:rPr>
-        <w:t xml:space="preserve">Ak by viacerí členovia tímu upravovali databázu súčasne a pokúsili sa ju pushnúť do repozitára, vznikol by neriešiteľný konflikt a niečia práca by sa nenávratne prepísala. Preto ak by niekto </w:t>
+        <w:t xml:space="preserve">Ak by viacerí členovia tímu upravovali databázu súčasne a pokúsili sa ju </w:t>
+      </w:r>
+      <w:proofErr w:type="spellStart"/>
+      <w:r>
+        <w:rPr>
+          <w:rFonts w:ascii="Google Sans" w:eastAsia="Google Sans" w:hAnsi="Google Sans" w:cs="Google Sans"/>
+          <w:color w:val="1F1F1F"/>
+        </w:rPr>
+        <w:t>pushnúť</w:t>
+      </w:r>
+      <w:proofErr w:type="spellEnd"/>
+      <w:r>
+        <w:rPr>
+          <w:rFonts w:ascii="Google Sans" w:eastAsia="Google Sans" w:hAnsi="Google Sans" w:cs="Google Sans"/>
+          <w:color w:val="1F1F1F"/>
+        </w:rPr>
+        <w:t xml:space="preserve"> do repozitára, vznikol by neriešiteľný konflikt a niečia práca by sa nenávratne prepísala. Preto ak by niekto </w:t>
       </w:r>
       <w:r>
         <w:rPr>
@@ -4509,14 +7082,82 @@
           <w:bCs/>
           <w:color w:val="1F1F1F"/>
         </w:rPr>
-        <w:t>1. Pravidlo "Jeden vládne všetkým" (Gatekeeper model)</w:t>
-      </w:r>
-      <w:r>
-        <w:rPr>
-          <w:rFonts w:ascii="Google Sans" w:eastAsia="Google Sans" w:hAnsi="Google Sans" w:cs="Google Sans"/>
-          <w:color w:val="1F1F1F"/>
-        </w:rPr>
-        <w:t xml:space="preserve"> Aby sme predišli chaosu, určili sme, že hlavnú architektúru databázy a importovanie nových objektov (formulárov, dotazov) bude do Master vetvy (main) nahrávať výlučne jeden poverený člen tímu. Ostatní členovia si môžu repozitár naklonovať pre účely testovania (podľa KROKov 1-5 vyššie), ale ak vytvárajú nové funkcie, mali by hotové objekty odovzdať koordinátorovi na zlúčenie.</w:t>
+        <w:t>1. Pravidlo "Jeden vládne všetkým" (</w:t>
+      </w:r>
+      <w:proofErr w:type="spellStart"/>
+      <w:r>
+        <w:rPr>
+          <w:rFonts w:ascii="Google Sans" w:eastAsia="Google Sans" w:hAnsi="Google Sans" w:cs="Google Sans"/>
+          <w:b/>
+          <w:bCs/>
+          <w:color w:val="1F1F1F"/>
+        </w:rPr>
+        <w:t>Gatekeeper</w:t>
+      </w:r>
+      <w:proofErr w:type="spellEnd"/>
+      <w:r>
+        <w:rPr>
+          <w:rFonts w:ascii="Google Sans" w:eastAsia="Google Sans" w:hAnsi="Google Sans" w:cs="Google Sans"/>
+          <w:b/>
+          <w:bCs/>
+          <w:color w:val="1F1F1F"/>
+        </w:rPr>
+        <w:t xml:space="preserve"> model)</w:t>
+      </w:r>
+      <w:r>
+        <w:rPr>
+          <w:rFonts w:ascii="Google Sans" w:eastAsia="Google Sans" w:hAnsi="Google Sans" w:cs="Google Sans"/>
+          <w:color w:val="1F1F1F"/>
+        </w:rPr>
+        <w:t xml:space="preserve"> Aby sme predišli chaosu, určili sme, že hlavnú architektúru databázy a importovanie nových objektov (formulárov, dotazov) bude do </w:t>
+      </w:r>
+      <w:proofErr w:type="spellStart"/>
+      <w:r>
+        <w:rPr>
+          <w:rFonts w:ascii="Google Sans" w:eastAsia="Google Sans" w:hAnsi="Google Sans" w:cs="Google Sans"/>
+          <w:color w:val="1F1F1F"/>
+        </w:rPr>
+        <w:t>Master</w:t>
+      </w:r>
+      <w:proofErr w:type="spellEnd"/>
+      <w:r>
+        <w:rPr>
+          <w:rFonts w:ascii="Google Sans" w:eastAsia="Google Sans" w:hAnsi="Google Sans" w:cs="Google Sans"/>
+          <w:color w:val="1F1F1F"/>
+        </w:rPr>
+        <w:t xml:space="preserve"> vetvy (</w:t>
+      </w:r>
+      <w:proofErr w:type="spellStart"/>
+      <w:r>
+        <w:rPr>
+          <w:rFonts w:ascii="Google Sans" w:eastAsia="Google Sans" w:hAnsi="Google Sans" w:cs="Google Sans"/>
+          <w:color w:val="1F1F1F"/>
+        </w:rPr>
+        <w:t>main</w:t>
+      </w:r>
+      <w:proofErr w:type="spellEnd"/>
+      <w:r>
+        <w:rPr>
+          <w:rFonts w:ascii="Google Sans" w:eastAsia="Google Sans" w:hAnsi="Google Sans" w:cs="Google Sans"/>
+          <w:color w:val="1F1F1F"/>
+        </w:rPr>
+        <w:t xml:space="preserve">) nahrávať výlučne jeden poverený člen tímu. Ostatní členovia si môžu repozitár naklonovať pre účely testovania (podľa </w:t>
+      </w:r>
+      <w:proofErr w:type="spellStart"/>
+      <w:r>
+        <w:rPr>
+          <w:rFonts w:ascii="Google Sans" w:eastAsia="Google Sans" w:hAnsi="Google Sans" w:cs="Google Sans"/>
+          <w:color w:val="1F1F1F"/>
+        </w:rPr>
+        <w:t>KROKov</w:t>
+      </w:r>
+      <w:proofErr w:type="spellEnd"/>
+      <w:r>
+        <w:rPr>
+          <w:rFonts w:ascii="Google Sans" w:eastAsia="Google Sans" w:hAnsi="Google Sans" w:cs="Google Sans"/>
+          <w:color w:val="1F1F1F"/>
+        </w:rPr>
+        <w:t xml:space="preserve"> 1-5 vyššie), ale ak vytvárajú nové funkcie, mali by hotové objekty odovzdať koordinátorovi na zlúčenie.</w:t>
       </w:r>
     </w:p>
     <w:p>
@@ -4548,7 +7189,23 @@
           <w:rFonts w:ascii="Google Sans" w:eastAsia="Google Sans" w:hAnsi="Google Sans" w:cs="Google Sans"/>
           <w:color w:val="1F1F1F"/>
         </w:rPr>
-        <w:t xml:space="preserve"> Ak je nevyhnutné, aby na databáze priamo pracoval iný člen tímu, musí to vopred oznámiť v spoločnej skupine (napr. v Trelle alebo na Instagrame): </w:t>
+        <w:t xml:space="preserve"> Ak je nevyhnutné, aby na databáze priamo pracoval iný člen tímu, musí to vopred oznámiť v spoločnej skupine (napr. v </w:t>
+      </w:r>
+      <w:proofErr w:type="spellStart"/>
+      <w:r>
+        <w:rPr>
+          <w:rFonts w:ascii="Google Sans" w:eastAsia="Google Sans" w:hAnsi="Google Sans" w:cs="Google Sans"/>
+          <w:color w:val="1F1F1F"/>
+        </w:rPr>
+        <w:t>Trelle</w:t>
+      </w:r>
+      <w:proofErr w:type="spellEnd"/>
+      <w:r>
+        <w:rPr>
+          <w:rFonts w:ascii="Google Sans" w:eastAsia="Google Sans" w:hAnsi="Google Sans" w:cs="Google Sans"/>
+          <w:color w:val="1F1F1F"/>
+        </w:rPr>
+        <w:t xml:space="preserve"> alebo na Instagrame): </w:t>
       </w:r>
       <w:r>
         <w:rPr>
@@ -4564,7 +7221,23 @@
           <w:rFonts w:ascii="Google Sans" w:eastAsia="Google Sans" w:hAnsi="Google Sans" w:cs="Google Sans"/>
           <w:color w:val="1F1F1F"/>
         </w:rPr>
-        <w:t xml:space="preserve"> Po dokončení práce a úspešnom Push-e musí dať opäť vedieť, že je súbor voľný.</w:t>
+        <w:t xml:space="preserve"> Po dokončení práce a úspešnom </w:t>
+      </w:r>
+      <w:proofErr w:type="spellStart"/>
+      <w:r>
+        <w:rPr>
+          <w:rFonts w:ascii="Google Sans" w:eastAsia="Google Sans" w:hAnsi="Google Sans" w:cs="Google Sans"/>
+          <w:color w:val="1F1F1F"/>
+        </w:rPr>
+        <w:t>Push</w:t>
+      </w:r>
+      <w:proofErr w:type="spellEnd"/>
+      <w:r>
+        <w:rPr>
+          <w:rFonts w:ascii="Google Sans" w:eastAsia="Google Sans" w:hAnsi="Google Sans" w:cs="Google Sans"/>
+          <w:color w:val="1F1F1F"/>
+        </w:rPr>
+        <w:t>-e musí dať opäť vedieť, že je súbor voľný.</w:t>
       </w:r>
     </w:p>
     <w:p>
@@ -4596,17 +7269,55 @@
           <w:rFonts w:ascii="Google Sans" w:eastAsia="Google Sans" w:hAnsi="Google Sans" w:cs="Google Sans"/>
           <w:color w:val="1F1F1F"/>
         </w:rPr>
-        <w:t xml:space="preserve"> Pred akoukoľvek prácou si musí každý člen tímu v GitHub Desktop kliknúť na </w:t>
-      </w:r>
-      <w:r>
-        <w:rPr>
-          <w:rFonts w:ascii="Google Sans" w:eastAsia="Google Sans" w:hAnsi="Google Sans" w:cs="Google Sans"/>
-          <w:b/>
-          <w:bCs/>
-          <w:color w:val="1F1F1F"/>
-        </w:rPr>
-        <w:t>Pull origin</w:t>
-      </w:r>
+        <w:t xml:space="preserve"> Pred akoukoľvek prácou si musí každý člen tímu v </w:t>
+      </w:r>
+      <w:proofErr w:type="spellStart"/>
+      <w:r>
+        <w:rPr>
+          <w:rFonts w:ascii="Google Sans" w:eastAsia="Google Sans" w:hAnsi="Google Sans" w:cs="Google Sans"/>
+          <w:color w:val="1F1F1F"/>
+        </w:rPr>
+        <w:t>GitHub</w:t>
+      </w:r>
+      <w:proofErr w:type="spellEnd"/>
+      <w:r>
+        <w:rPr>
+          <w:rFonts w:ascii="Google Sans" w:eastAsia="Google Sans" w:hAnsi="Google Sans" w:cs="Google Sans"/>
+          <w:color w:val="1F1F1F"/>
+        </w:rPr>
+        <w:t xml:space="preserve"> Desktop kliknúť na </w:t>
+      </w:r>
+      <w:proofErr w:type="spellStart"/>
+      <w:r>
+        <w:rPr>
+          <w:rFonts w:ascii="Google Sans" w:eastAsia="Google Sans" w:hAnsi="Google Sans" w:cs="Google Sans"/>
+          <w:b/>
+          <w:bCs/>
+          <w:color w:val="1F1F1F"/>
+        </w:rPr>
+        <w:t>Pull</w:t>
+      </w:r>
+      <w:proofErr w:type="spellEnd"/>
+      <w:r>
+        <w:rPr>
+          <w:rFonts w:ascii="Google Sans" w:eastAsia="Google Sans" w:hAnsi="Google Sans" w:cs="Google Sans"/>
+          <w:b/>
+          <w:bCs/>
+          <w:color w:val="1F1F1F"/>
+        </w:rPr>
+        <w:t xml:space="preserve"> </w:t>
+      </w:r>
+      <w:proofErr w:type="spellStart"/>
+      <w:r>
+        <w:rPr>
+          <w:rFonts w:ascii="Google Sans" w:eastAsia="Google Sans" w:hAnsi="Google Sans" w:cs="Google Sans"/>
+          <w:b/>
+          <w:bCs/>
+          <w:color w:val="1F1F1F"/>
+        </w:rPr>
+        <w:t>origin</w:t>
+      </w:r>
+      <w:proofErr w:type="spellEnd"/>
       <w:r>
         <w:rPr>
           <w:rFonts w:ascii="Google Sans" w:eastAsia="Google Sans" w:hAnsi="Google Sans" w:cs="Google Sans"/>
@@ -4637,14 +7348,102 @@
           <w:bCs/>
           <w:color w:val="1F1F1F"/>
         </w:rPr>
-        <w:t>4. Pozor na skrytý zamykací súbor (.laccdb)</w:t>
-      </w:r>
-      <w:r>
-        <w:rPr>
-          <w:rFonts w:ascii="Google Sans" w:eastAsia="Google Sans" w:hAnsi="Google Sans" w:cs="Google Sans"/>
-          <w:color w:val="1F1F1F"/>
-        </w:rPr>
-        <w:t xml:space="preserve"> Pred kliknutím na "Commit" a "Push" v GitHube musí byť program MS Access </w:t>
+        <w:t xml:space="preserve">4. Pozor na skrytý </w:t>
+      </w:r>
+      <w:proofErr w:type="spellStart"/>
+      <w:r>
+        <w:rPr>
+          <w:rFonts w:ascii="Google Sans" w:eastAsia="Google Sans" w:hAnsi="Google Sans" w:cs="Google Sans"/>
+          <w:b/>
+          <w:bCs/>
+          <w:color w:val="1F1F1F"/>
+        </w:rPr>
+        <w:t>zamykací</w:t>
+      </w:r>
+      <w:proofErr w:type="spellEnd"/>
+      <w:r>
+        <w:rPr>
+          <w:rFonts w:ascii="Google Sans" w:eastAsia="Google Sans" w:hAnsi="Google Sans" w:cs="Google Sans"/>
+          <w:b/>
+          <w:bCs/>
+          <w:color w:val="1F1F1F"/>
+        </w:rPr>
+        <w:t xml:space="preserve"> súbor (.</w:t>
+      </w:r>
+      <w:proofErr w:type="spellStart"/>
+      <w:r>
+        <w:rPr>
+          <w:rFonts w:ascii="Google Sans" w:eastAsia="Google Sans" w:hAnsi="Google Sans" w:cs="Google Sans"/>
+          <w:b/>
+          <w:bCs/>
+          <w:color w:val="1F1F1F"/>
+        </w:rPr>
+        <w:t>laccdb</w:t>
+      </w:r>
+      <w:proofErr w:type="spellEnd"/>
+      <w:r>
+        <w:rPr>
+          <w:rFonts w:ascii="Google Sans" w:eastAsia="Google Sans" w:hAnsi="Google Sans" w:cs="Google Sans"/>
+          <w:b/>
+          <w:bCs/>
+          <w:color w:val="1F1F1F"/>
+        </w:rPr>
+        <w:t>)</w:t>
+      </w:r>
+      <w:r>
+        <w:rPr>
+          <w:rFonts w:ascii="Google Sans" w:eastAsia="Google Sans" w:hAnsi="Google Sans" w:cs="Google Sans"/>
+          <w:color w:val="1F1F1F"/>
+        </w:rPr>
+        <w:t xml:space="preserve"> Pred kliknutím na "</w:t>
+      </w:r>
+      <w:proofErr w:type="spellStart"/>
+      <w:r>
+        <w:rPr>
+          <w:rFonts w:ascii="Google Sans" w:eastAsia="Google Sans" w:hAnsi="Google Sans" w:cs="Google Sans"/>
+          <w:color w:val="1F1F1F"/>
+        </w:rPr>
+        <w:t>Commit</w:t>
+      </w:r>
+      <w:proofErr w:type="spellEnd"/>
+      <w:r>
+        <w:rPr>
+          <w:rFonts w:ascii="Google Sans" w:eastAsia="Google Sans" w:hAnsi="Google Sans" w:cs="Google Sans"/>
+          <w:color w:val="1F1F1F"/>
+        </w:rPr>
+        <w:t>" a "</w:t>
+      </w:r>
+      <w:proofErr w:type="spellStart"/>
+      <w:r>
+        <w:rPr>
+          <w:rFonts w:ascii="Google Sans" w:eastAsia="Google Sans" w:hAnsi="Google Sans" w:cs="Google Sans"/>
+          <w:color w:val="1F1F1F"/>
+        </w:rPr>
+        <w:t>Push</w:t>
+      </w:r>
+      <w:proofErr w:type="spellEnd"/>
+      <w:r>
+        <w:rPr>
+          <w:rFonts w:ascii="Google Sans" w:eastAsia="Google Sans" w:hAnsi="Google Sans" w:cs="Google Sans"/>
+          <w:color w:val="1F1F1F"/>
+        </w:rPr>
+        <w:t xml:space="preserve">" v </w:t>
+      </w:r>
+      <w:proofErr w:type="spellStart"/>
+      <w:r>
+        <w:rPr>
+          <w:rFonts w:ascii="Google Sans" w:eastAsia="Google Sans" w:hAnsi="Google Sans" w:cs="Google Sans"/>
+          <w:color w:val="1F1F1F"/>
+        </w:rPr>
+        <w:t>GitHube</w:t>
+      </w:r>
+      <w:proofErr w:type="spellEnd"/>
+      <w:r>
+        <w:rPr>
+          <w:rFonts w:ascii="Google Sans" w:eastAsia="Google Sans" w:hAnsi="Google Sans" w:cs="Google Sans"/>
+          <w:color w:val="1F1F1F"/>
+        </w:rPr>
+        <w:t xml:space="preserve"> musí byť program MS Access </w:t>
       </w:r>
       <w:r>
         <w:rPr>
@@ -4660,21 +7459,78 @@
           <w:rFonts w:ascii="Google Sans" w:eastAsia="Google Sans" w:hAnsi="Google Sans" w:cs="Google Sans"/>
           <w:color w:val="1F1F1F"/>
         </w:rPr>
-        <w:t xml:space="preserve"> (všetky okná musia byť vypnuté). Kým je Access otvorený, vytvára v priečinku skrytý zamykací súbor (</w:t>
+        <w:t xml:space="preserve"> (všetky okná musia byť vypnuté). Kým je Access otvorený, vytvára v priečinku skrytý </w:t>
+      </w:r>
+      <w:proofErr w:type="spellStart"/>
+      <w:r>
+        <w:rPr>
+          <w:rFonts w:ascii="Google Sans" w:eastAsia="Google Sans" w:hAnsi="Google Sans" w:cs="Google Sans"/>
+          <w:color w:val="1F1F1F"/>
+        </w:rPr>
+        <w:t>zamykací</w:t>
+      </w:r>
+      <w:proofErr w:type="spellEnd"/>
+      <w:r>
+        <w:rPr>
+          <w:rFonts w:ascii="Google Sans" w:eastAsia="Google Sans" w:hAnsi="Google Sans" w:cs="Google Sans"/>
+          <w:color w:val="1F1F1F"/>
+        </w:rPr>
+        <w:t xml:space="preserve"> súbor (</w:t>
       </w:r>
       <w:r>
         <w:rPr>
           <w:rFonts w:ascii="Google Sans" w:eastAsia="Google Sans" w:hAnsi="Google Sans" w:cs="Google Sans"/>
           <w:color w:val="444746"/>
         </w:rPr>
-        <w:t>.laccdb</w:t>
-      </w:r>
-      <w:r>
-        <w:rPr>
-          <w:rFonts w:ascii="Google Sans" w:eastAsia="Google Sans" w:hAnsi="Google Sans" w:cs="Google Sans"/>
-          <w:color w:val="1F1F1F"/>
-        </w:rPr>
-        <w:t>). Ak by ste sa pokúsili urobiť commit s otvoreným Accessom, tento zamykací súbor by zablokoval synchronizáciu alebo by pri stiahnutí na inom PC poškodil repozitár.</w:t>
+        <w:t>.</w:t>
+      </w:r>
+      <w:proofErr w:type="spellStart"/>
+      <w:r>
+        <w:rPr>
+          <w:rFonts w:ascii="Google Sans" w:eastAsia="Google Sans" w:hAnsi="Google Sans" w:cs="Google Sans"/>
+          <w:color w:val="444746"/>
+        </w:rPr>
+        <w:t>laccdb</w:t>
+      </w:r>
+      <w:proofErr w:type="spellEnd"/>
+      <w:r>
+        <w:rPr>
+          <w:rFonts w:ascii="Google Sans" w:eastAsia="Google Sans" w:hAnsi="Google Sans" w:cs="Google Sans"/>
+          <w:color w:val="1F1F1F"/>
+        </w:rPr>
+        <w:t xml:space="preserve">). Ak by ste sa pokúsili urobiť </w:t>
+      </w:r>
+      <w:proofErr w:type="spellStart"/>
+      <w:r>
+        <w:rPr>
+          <w:rFonts w:ascii="Google Sans" w:eastAsia="Google Sans" w:hAnsi="Google Sans" w:cs="Google Sans"/>
+          <w:color w:val="1F1F1F"/>
+        </w:rPr>
+        <w:t>commit</w:t>
+      </w:r>
+      <w:proofErr w:type="spellEnd"/>
+      <w:r>
+        <w:rPr>
+          <w:rFonts w:ascii="Google Sans" w:eastAsia="Google Sans" w:hAnsi="Google Sans" w:cs="Google Sans"/>
+          <w:color w:val="1F1F1F"/>
+        </w:rPr>
+        <w:t xml:space="preserve"> s otvoreným Accessom, tento </w:t>
+      </w:r>
+      <w:proofErr w:type="spellStart"/>
+      <w:r>
+        <w:rPr>
+          <w:rFonts w:ascii="Google Sans" w:eastAsia="Google Sans" w:hAnsi="Google Sans" w:cs="Google Sans"/>
+          <w:color w:val="1F1F1F"/>
+        </w:rPr>
+        <w:t>zamykací</w:t>
+      </w:r>
+      <w:proofErr w:type="spellEnd"/>
+      <w:r>
+        <w:rPr>
+          <w:rFonts w:ascii="Google Sans" w:eastAsia="Google Sans" w:hAnsi="Google Sans" w:cs="Google Sans"/>
+          <w:color w:val="1F1F1F"/>
+        </w:rPr>
+        <w:t xml:space="preserve"> súbor by zablokoval synchronizáciu alebo by pri stiahnutí na inom PC poškodil repozitár.</w:t>
       </w:r>
     </w:p>
     <w:sectPr>
@@ -8990,6 +11846,7 @@
   <w:style w:type="character" w:default="1" w:styleId="Predvolenpsmoodseku">
     <w:name w:val="Default Paragraph Font"/>
     <w:uiPriority w:val="1"/>
+    <w:semiHidden/>
     <w:unhideWhenUsed/>
   </w:style>
   <w:style w:type="table" w:default="1" w:styleId="Normlnatabuka">

</xml_diff>